<commit_message>
Performed EDA of combined dataset and selected representative stocks. Updated progress_report.docx
</commit_message>
<xml_diff>
--- a/docs/progress_report.docx
+++ b/docs/progress_report.docx
@@ -4,10 +4,14 @@
   <w:body>
     <w:p>
       <w:pPr>
+        <w:spacing w:line="276" w:lineRule="auto"/>
+        <w:jc w:val="center"/>
         <w:rPr>
           <w:rFonts w:ascii="Times New Roman" w:hAnsi="Times New Roman" w:cs="Times New Roman"/>
           <w:b/>
           <w:bCs/>
+          <w:sz w:val="56"/>
+          <w:szCs w:val="56"/>
         </w:rPr>
       </w:pPr>
       <w:r>
@@ -15,37 +19,305 @@
           <w:rFonts w:ascii="Times New Roman" w:hAnsi="Times New Roman" w:cs="Times New Roman"/>
           <w:b/>
           <w:bCs/>
+          <w:sz w:val="56"/>
+          <w:szCs w:val="56"/>
         </w:rPr>
         <w:t>Progress Log</w:t>
       </w:r>
     </w:p>
-    <w:p>
-      <w:pPr>
-        <w:pStyle w:val="ListParagraph"/>
-        <w:rPr>
-          <w:rFonts w:ascii="Times New Roman" w:hAnsi="Times New Roman" w:cs="Times New Roman"/>
-        </w:rPr>
-      </w:pPr>
-    </w:p>
-    <w:p>
-      <w:pPr>
-        <w:rPr>
-          <w:rFonts w:ascii="Times New Roman" w:hAnsi="Times New Roman" w:cs="Times New Roman"/>
+    <w:sdt>
+      <w:sdtPr>
+        <w:id w:val="-291838275"/>
+        <w:docPartObj>
+          <w:docPartGallery w:val="Table of Contents"/>
+          <w:docPartUnique/>
+        </w:docPartObj>
+      </w:sdtPr>
+      <w:sdtEndPr>
+        <w:rPr>
+          <w:rFonts w:asciiTheme="minorHAnsi" w:eastAsiaTheme="minorEastAsia" w:hAnsiTheme="minorHAnsi" w:cstheme="minorBidi"/>
           <w:b/>
           <w:bCs/>
-        </w:rPr>
-      </w:pPr>
-      <w:r>
+          <w:noProof/>
+          <w:color w:val="auto"/>
+          <w:kern w:val="2"/>
+          <w:sz w:val="24"/>
+          <w:szCs w:val="24"/>
+          <w:lang w:eastAsia="zh-CN"/>
+          <w14:ligatures w14:val="standardContextual"/>
+        </w:rPr>
+      </w:sdtEndPr>
+      <w:sdtContent>
+        <w:p>
+          <w:pPr>
+            <w:pStyle w:val="TOCHeading"/>
+            <w:rPr>
+              <w:rFonts w:ascii="Times New Roman" w:hAnsi="Times New Roman" w:cs="Times New Roman"/>
+              <w:b/>
+              <w:bCs/>
+              <w:color w:val="auto"/>
+            </w:rPr>
+          </w:pPr>
+        </w:p>
+        <w:p>
+          <w:pPr>
+            <w:pStyle w:val="TOC1"/>
+            <w:tabs>
+              <w:tab w:val="right" w:leader="dot" w:pos="9350"/>
+            </w:tabs>
+            <w:rPr>
+              <w:noProof/>
+            </w:rPr>
+          </w:pPr>
+          <w:r>
+            <w:fldChar w:fldCharType="begin"/>
+          </w:r>
+          <w:r>
+            <w:instrText xml:space="preserve"> TOC \o "1-3" \h \z \u </w:instrText>
+          </w:r>
+          <w:r>
+            <w:fldChar w:fldCharType="separate"/>
+          </w:r>
+          <w:hyperlink w:anchor="_Toc233895565" w:history="1">
+            <w:r>
+              <w:rPr>
+                <w:rStyle w:val="Hyperlink"/>
+                <w:rFonts w:ascii="Times New Roman" w:hAnsi="Times New Roman" w:cs="Times New Roman"/>
+                <w:b/>
+                <w:bCs/>
+                <w:noProof/>
+              </w:rPr>
+              <w:t>28/6/2026 – Data Collection</w:t>
+            </w:r>
+            <w:r>
+              <w:rPr>
+                <w:noProof/>
+                <w:webHidden/>
+              </w:rPr>
+              <w:tab/>
+            </w:r>
+            <w:r>
+              <w:rPr>
+                <w:noProof/>
+                <w:webHidden/>
+              </w:rPr>
+              <w:fldChar w:fldCharType="begin"/>
+            </w:r>
+            <w:r>
+              <w:rPr>
+                <w:noProof/>
+                <w:webHidden/>
+              </w:rPr>
+              <w:instrText xml:space="preserve"> PAGEREF _Toc233895565 \h </w:instrText>
+            </w:r>
+            <w:r>
+              <w:rPr>
+                <w:noProof/>
+                <w:webHidden/>
+              </w:rPr>
+            </w:r>
+            <w:r>
+              <w:rPr>
+                <w:noProof/>
+                <w:webHidden/>
+              </w:rPr>
+              <w:fldChar w:fldCharType="separate"/>
+            </w:r>
+            <w:r>
+              <w:rPr>
+                <w:noProof/>
+                <w:webHidden/>
+              </w:rPr>
+              <w:t>1</w:t>
+            </w:r>
+            <w:r>
+              <w:rPr>
+                <w:noProof/>
+                <w:webHidden/>
+              </w:rPr>
+              <w:fldChar w:fldCharType="end"/>
+            </w:r>
+          </w:hyperlink>
+        </w:p>
+        <w:p>
+          <w:pPr>
+            <w:pStyle w:val="TOC1"/>
+            <w:tabs>
+              <w:tab w:val="right" w:leader="dot" w:pos="9350"/>
+            </w:tabs>
+            <w:rPr>
+              <w:noProof/>
+            </w:rPr>
+          </w:pPr>
+          <w:hyperlink w:anchor="_Toc233895566" w:history="1">
+            <w:r>
+              <w:rPr>
+                <w:rStyle w:val="Hyperlink"/>
+                <w:rFonts w:ascii="Times New Roman" w:hAnsi="Times New Roman" w:cs="Times New Roman"/>
+                <w:b/>
+                <w:bCs/>
+                <w:noProof/>
+              </w:rPr>
+              <w:t>02/07/2026 – Exploratory Data Analysis (EDA)</w:t>
+            </w:r>
+            <w:r>
+              <w:rPr>
+                <w:noProof/>
+                <w:webHidden/>
+              </w:rPr>
+              <w:tab/>
+            </w:r>
+            <w:r>
+              <w:rPr>
+                <w:noProof/>
+                <w:webHidden/>
+              </w:rPr>
+              <w:fldChar w:fldCharType="begin"/>
+            </w:r>
+            <w:r>
+              <w:rPr>
+                <w:noProof/>
+                <w:webHidden/>
+              </w:rPr>
+              <w:instrText xml:space="preserve"> PAGEREF _Toc233895566 \h </w:instrText>
+            </w:r>
+            <w:r>
+              <w:rPr>
+                <w:noProof/>
+                <w:webHidden/>
+              </w:rPr>
+            </w:r>
+            <w:r>
+              <w:rPr>
+                <w:noProof/>
+                <w:webHidden/>
+              </w:rPr>
+              <w:fldChar w:fldCharType="separate"/>
+            </w:r>
+            <w:r>
+              <w:rPr>
+                <w:noProof/>
+                <w:webHidden/>
+              </w:rPr>
+              <w:t>2</w:t>
+            </w:r>
+            <w:r>
+              <w:rPr>
+                <w:noProof/>
+                <w:webHidden/>
+              </w:rPr>
+              <w:fldChar w:fldCharType="end"/>
+            </w:r>
+          </w:hyperlink>
+        </w:p>
+        <w:p>
+          <w:r>
+            <w:rPr>
+              <w:b/>
+              <w:bCs/>
+              <w:noProof/>
+            </w:rPr>
+            <w:fldChar w:fldCharType="end"/>
+          </w:r>
+        </w:p>
+      </w:sdtContent>
+    </w:sdt>
+    <w:p>
+      <w:pPr>
+        <w:spacing w:line="276" w:lineRule="auto"/>
         <w:rPr>
           <w:rFonts w:ascii="Times New Roman" w:hAnsi="Times New Roman" w:cs="Times New Roman"/>
           <w:b/>
           <w:bCs/>
         </w:rPr>
+      </w:pPr>
+    </w:p>
+    <w:p>
+      <w:pPr>
+        <w:spacing w:line="276" w:lineRule="auto"/>
+        <w:rPr>
+          <w:rFonts w:ascii="Times New Roman" w:hAnsi="Times New Roman" w:cs="Times New Roman"/>
+          <w:b/>
+          <w:bCs/>
+        </w:rPr>
+      </w:pPr>
+    </w:p>
+    <w:p>
+      <w:pPr>
+        <w:rPr>
+          <w:rFonts w:ascii="Times New Roman" w:hAnsi="Times New Roman" w:cs="Times New Roman"/>
+          <w:b/>
+          <w:bCs/>
+        </w:rPr>
+        <w:sectPr>
+          <w:footerReference w:type="default" r:id="rId8"/>
+          <w:pgSz w:w="12240" w:h="15840"/>
+          <w:pgMar w:top="1440" w:right="1440" w:bottom="1440" w:left="1440" w:header="720" w:footer="720" w:gutter="0"/>
+          <w:cols w:space="720"/>
+          <w:docGrid w:linePitch="360"/>
+        </w:sectPr>
+      </w:pPr>
+      <w:r>
+        <w:rPr>
+          <w:rFonts w:ascii="Times New Roman" w:hAnsi="Times New Roman" w:cs="Times New Roman"/>
+          <w:b/>
+          <w:bCs/>
+        </w:rPr>
+        <w:br w:type="page"/>
+      </w:r>
+      <w:bookmarkStart w:id="0" w:name="_Toc233895565"/>
+    </w:p>
+    <w:p>
+      <w:pPr>
+        <w:pStyle w:val="Heading1"/>
+        <w:rPr>
+          <w:rFonts w:ascii="Times New Roman" w:hAnsi="Times New Roman" w:cs="Times New Roman"/>
+          <w:b/>
+          <w:bCs/>
+          <w:color w:val="auto"/>
+          <w:sz w:val="24"/>
+          <w:szCs w:val="24"/>
+        </w:rPr>
+      </w:pPr>
+      <w:r>
+        <w:rPr>
+          <w:rFonts w:ascii="Times New Roman" w:hAnsi="Times New Roman" w:cs="Times New Roman"/>
+          <w:b/>
+          <w:bCs/>
+          <w:color w:val="auto"/>
+          <w:sz w:val="24"/>
+          <w:szCs w:val="24"/>
+        </w:rPr>
+        <w:lastRenderedPageBreak/>
         <w:t>28/6/2026</w:t>
       </w:r>
-    </w:p>
-    <w:p>
-      <w:pPr>
+      <w:r>
+        <w:rPr>
+          <w:rFonts w:ascii="Times New Roman" w:hAnsi="Times New Roman" w:cs="Times New Roman"/>
+          <w:b/>
+          <w:bCs/>
+          <w:color w:val="auto"/>
+          <w:sz w:val="24"/>
+          <w:szCs w:val="24"/>
+        </w:rPr>
+        <w:t xml:space="preserve"> </w:t>
+      </w:r>
+      <w:r>
+        <w:rPr>
+          <w:rFonts w:ascii="Times New Roman" w:hAnsi="Times New Roman" w:cs="Times New Roman"/>
+          <w:b/>
+          <w:bCs/>
+          <w:color w:val="auto"/>
+          <w:sz w:val="24"/>
+          <w:szCs w:val="24"/>
+        </w:rPr>
+        <w:t>– Data Collection</w:t>
+      </w:r>
+      <w:bookmarkEnd w:id="0"/>
+    </w:p>
+    <w:p>
+      <w:pPr>
+        <w:spacing w:line="276" w:lineRule="auto"/>
         <w:rPr>
           <w:rFonts w:ascii="Times New Roman" w:hAnsi="Times New Roman" w:cs="Times New Roman"/>
         </w:rPr>
@@ -64,6 +336,7 @@
           <w:ilvl w:val="0"/>
           <w:numId w:val="2"/>
         </w:numPr>
+        <w:spacing w:line="276" w:lineRule="auto"/>
         <w:rPr>
           <w:rFonts w:ascii="Times New Roman" w:hAnsi="Times New Roman" w:cs="Times New Roman"/>
         </w:rPr>
@@ -88,6 +361,7 @@
           <w:ilvl w:val="0"/>
           <w:numId w:val="2"/>
         </w:numPr>
+        <w:spacing w:line="276" w:lineRule="auto"/>
         <w:rPr>
           <w:rFonts w:ascii="Times New Roman" w:hAnsi="Times New Roman" w:cs="Times New Roman"/>
         </w:rPr>
@@ -112,6 +386,7 @@
           <w:ilvl w:val="0"/>
           <w:numId w:val="2"/>
         </w:numPr>
+        <w:spacing w:line="276" w:lineRule="auto"/>
         <w:rPr>
           <w:rFonts w:ascii="Times New Roman" w:hAnsi="Times New Roman" w:cs="Times New Roman"/>
         </w:rPr>
@@ -144,6 +419,7 @@
           <w:ilvl w:val="0"/>
           <w:numId w:val="2"/>
         </w:numPr>
+        <w:spacing w:line="276" w:lineRule="auto"/>
         <w:rPr>
           <w:rFonts w:ascii="Times New Roman" w:hAnsi="Times New Roman" w:cs="Times New Roman"/>
         </w:rPr>
@@ -168,6 +444,7 @@
           <w:ilvl w:val="0"/>
           <w:numId w:val="2"/>
         </w:numPr>
+        <w:spacing w:line="276" w:lineRule="auto"/>
         <w:rPr>
           <w:rFonts w:ascii="Times New Roman" w:hAnsi="Times New Roman" w:cs="Times New Roman"/>
         </w:rPr>
@@ -192,6 +469,7 @@
           <w:ilvl w:val="0"/>
           <w:numId w:val="2"/>
         </w:numPr>
+        <w:spacing w:line="276" w:lineRule="auto"/>
         <w:rPr>
           <w:rFonts w:ascii="Times New Roman" w:hAnsi="Times New Roman" w:cs="Times New Roman"/>
         </w:rPr>
@@ -216,6 +494,7 @@
           <w:ilvl w:val="0"/>
           <w:numId w:val="2"/>
         </w:numPr>
+        <w:spacing w:line="276" w:lineRule="auto"/>
         <w:rPr>
           <w:rFonts w:ascii="Times New Roman" w:hAnsi="Times New Roman" w:cs="Times New Roman"/>
         </w:rPr>
@@ -236,13 +515,15 @@
     <w:p>
       <w:pPr>
         <w:pStyle w:val="ListParagraph"/>
-        <w:rPr>
-          <w:rFonts w:ascii="Times New Roman" w:hAnsi="Times New Roman" w:cs="Times New Roman"/>
-        </w:rPr>
-      </w:pPr>
-    </w:p>
-    <w:p>
-      <w:pPr>
+        <w:spacing w:line="276" w:lineRule="auto"/>
+        <w:rPr>
+          <w:rFonts w:ascii="Times New Roman" w:hAnsi="Times New Roman" w:cs="Times New Roman"/>
+        </w:rPr>
+      </w:pPr>
+    </w:p>
+    <w:p>
+      <w:pPr>
+        <w:spacing w:line="276" w:lineRule="auto"/>
         <w:rPr>
           <w:rFonts w:ascii="Times New Roman" w:hAnsi="Times New Roman" w:cs="Times New Roman"/>
         </w:rPr>
@@ -267,6 +548,7 @@
           <w:ilvl w:val="0"/>
           <w:numId w:val="3"/>
         </w:numPr>
+        <w:spacing w:line="276" w:lineRule="auto"/>
         <w:rPr>
           <w:rFonts w:ascii="Times New Roman" w:hAnsi="Times New Roman" w:cs="Times New Roman"/>
         </w:rPr>
@@ -355,6 +637,7 @@
           <w:ilvl w:val="1"/>
           <w:numId w:val="3"/>
         </w:numPr>
+        <w:spacing w:line="276" w:lineRule="auto"/>
         <w:rPr>
           <w:rFonts w:ascii="Times New Roman" w:hAnsi="Times New Roman" w:cs="Times New Roman"/>
         </w:rPr>
@@ -395,13 +678,7 @@
         <w:rPr>
           <w:rFonts w:ascii="Times New Roman" w:hAnsi="Times New Roman" w:cs="Times New Roman"/>
         </w:rPr>
-        <w:t xml:space="preserve"> columns using:</w:t>
-      </w:r>
-      <w:r>
-        <w:rPr>
-          <w:rFonts w:ascii="Times New Roman" w:hAnsi="Times New Roman" w:cs="Times New Roman"/>
-        </w:rPr>
-        <w:t xml:space="preserve"> </w:t>
+        <w:t xml:space="preserve"> columns using: </w:t>
       </w:r>
       <w:r>
         <w:rPr>
@@ -443,16 +720,11 @@
         </w:rPr>
         <w:t>’</w:t>
       </w:r>
-      <w:r>
-        <w:rPr>
-          <w:rFonts w:ascii="Times New Roman" w:hAnsi="Times New Roman" w:cs="Times New Roman"/>
-        </w:rPr>
-        <w:t>.</w:t>
-      </w:r>
     </w:p>
     <w:p>
       <w:pPr>
         <w:pStyle w:val="ListParagraph"/>
+        <w:spacing w:line="276" w:lineRule="auto"/>
         <w:ind w:left="1440"/>
         <w:rPr>
           <w:rFonts w:ascii="Times New Roman" w:hAnsi="Times New Roman" w:cs="Times New Roman"/>
@@ -466,6 +738,7 @@
           <w:ilvl w:val="0"/>
           <w:numId w:val="3"/>
         </w:numPr>
+        <w:spacing w:line="276" w:lineRule="auto"/>
         <w:rPr>
           <w:rFonts w:ascii="Times New Roman" w:hAnsi="Times New Roman" w:cs="Times New Roman"/>
         </w:rPr>
@@ -486,19 +759,7 @@
         <w:rPr>
           <w:rFonts w:ascii="Times New Roman" w:hAnsi="Times New Roman" w:cs="Times New Roman"/>
         </w:rPr>
-        <w:t xml:space="preserve">roject </w:t>
-      </w:r>
-      <w:r>
-        <w:rPr>
-          <w:rFonts w:ascii="Times New Roman" w:hAnsi="Times New Roman" w:cs="Times New Roman"/>
-        </w:rPr>
-        <w:t>being</w:t>
-      </w:r>
-      <w:r>
-        <w:rPr>
-          <w:rFonts w:ascii="Times New Roman" w:hAnsi="Times New Roman" w:cs="Times New Roman"/>
-        </w:rPr>
-        <w:t xml:space="preserve"> executed from a different working directory.</w:t>
+        <w:t>roject being executed from a different working directory.</w:t>
       </w:r>
     </w:p>
     <w:p>
@@ -508,6 +769,7 @@
           <w:ilvl w:val="1"/>
           <w:numId w:val="3"/>
         </w:numPr>
+        <w:spacing w:line="276" w:lineRule="auto"/>
         <w:rPr>
           <w:rFonts w:ascii="Times New Roman" w:hAnsi="Times New Roman" w:cs="Times New Roman"/>
         </w:rPr>
@@ -560,6 +822,7 @@
     <w:p>
       <w:pPr>
         <w:pStyle w:val="ListParagraph"/>
+        <w:spacing w:line="276" w:lineRule="auto"/>
         <w:ind w:left="1440"/>
         <w:rPr>
           <w:rFonts w:ascii="Times New Roman" w:hAnsi="Times New Roman" w:cs="Times New Roman"/>
@@ -595,6 +858,7 @@
     <w:p>
       <w:pPr>
         <w:pStyle w:val="ListParagraph"/>
+        <w:spacing w:line="276" w:lineRule="auto"/>
         <w:ind w:left="1440"/>
         <w:rPr>
           <w:rFonts w:ascii="Times New Roman" w:hAnsi="Times New Roman" w:cs="Times New Roman"/>
@@ -603,6 +867,7 @@
     </w:p>
     <w:p>
       <w:pPr>
+        <w:spacing w:line="276" w:lineRule="auto"/>
         <w:rPr>
           <w:rFonts w:ascii="Times New Roman" w:hAnsi="Times New Roman" w:cs="Times New Roman"/>
         </w:rPr>
@@ -627,6 +892,7 @@
           <w:ilvl w:val="0"/>
           <w:numId w:val="5"/>
         </w:numPr>
+        <w:spacing w:line="276" w:lineRule="auto"/>
         <w:rPr>
           <w:rFonts w:ascii="Times New Roman" w:hAnsi="Times New Roman" w:cs="Times New Roman"/>
         </w:rPr>
@@ -636,6 +902,12 @@
           <w:rFonts w:ascii="Times New Roman" w:hAnsi="Times New Roman" w:cs="Times New Roman"/>
         </w:rPr>
         <w:t>Perform EDA</w:t>
+      </w:r>
+      <w:r>
+        <w:rPr>
+          <w:rFonts w:ascii="Times New Roman" w:hAnsi="Times New Roman" w:cs="Times New Roman"/>
+        </w:rPr>
+        <w:t>.</w:t>
       </w:r>
     </w:p>
     <w:p>
@@ -645,6 +917,7 @@
           <w:ilvl w:val="0"/>
           <w:numId w:val="5"/>
         </w:numPr>
+        <w:spacing w:line="276" w:lineRule="auto"/>
         <w:rPr>
           <w:rFonts w:ascii="Times New Roman" w:hAnsi="Times New Roman" w:cs="Times New Roman"/>
         </w:rPr>
@@ -655,15 +928,926 @@
         </w:rPr>
         <w:t>Feature engineering</w:t>
       </w:r>
+      <w:r>
+        <w:rPr>
+          <w:rFonts w:ascii="Times New Roman" w:hAnsi="Times New Roman" w:cs="Times New Roman"/>
+        </w:rPr>
+        <w:t>.</w:t>
+      </w:r>
+    </w:p>
+    <w:p>
+      <w:pPr>
+        <w:spacing w:line="276" w:lineRule="auto"/>
+        <w:rPr>
+          <w:rFonts w:ascii="Times New Roman" w:hAnsi="Times New Roman" w:cs="Times New Roman"/>
+        </w:rPr>
+      </w:pPr>
+      <w:r>
+        <w:rPr>
+          <w:rFonts w:ascii="Times New Roman" w:hAnsi="Times New Roman" w:cs="Times New Roman"/>
+        </w:rPr>
+        <w:br w:type="page"/>
+      </w:r>
+    </w:p>
+    <w:p>
+      <w:pPr>
+        <w:pStyle w:val="Heading1"/>
+        <w:rPr>
+          <w:rFonts w:ascii="Times New Roman" w:hAnsi="Times New Roman" w:cs="Times New Roman"/>
+          <w:b/>
+          <w:bCs/>
+          <w:color w:val="auto"/>
+          <w:sz w:val="24"/>
+          <w:szCs w:val="24"/>
+        </w:rPr>
+      </w:pPr>
+      <w:bookmarkStart w:id="1" w:name="_Toc233895566"/>
+      <w:r>
+        <w:rPr>
+          <w:rFonts w:ascii="Times New Roman" w:hAnsi="Times New Roman" w:cs="Times New Roman"/>
+          <w:b/>
+          <w:bCs/>
+          <w:color w:val="auto"/>
+          <w:sz w:val="24"/>
+          <w:szCs w:val="24"/>
+        </w:rPr>
+        <w:lastRenderedPageBreak/>
+        <w:t>02/07/2026</w:t>
+      </w:r>
+      <w:r>
+        <w:rPr>
+          <w:rFonts w:ascii="Times New Roman" w:hAnsi="Times New Roman" w:cs="Times New Roman"/>
+          <w:b/>
+          <w:bCs/>
+          <w:color w:val="auto"/>
+          <w:sz w:val="24"/>
+          <w:szCs w:val="24"/>
+        </w:rPr>
+        <w:t xml:space="preserve"> </w:t>
+      </w:r>
+      <w:r>
+        <w:rPr>
+          <w:rFonts w:ascii="Times New Roman" w:hAnsi="Times New Roman" w:cs="Times New Roman"/>
+          <w:b/>
+          <w:bCs/>
+          <w:color w:val="auto"/>
+          <w:sz w:val="24"/>
+          <w:szCs w:val="24"/>
+        </w:rPr>
+        <w:t xml:space="preserve">– </w:t>
+      </w:r>
+      <w:r>
+        <w:rPr>
+          <w:rFonts w:ascii="Times New Roman" w:hAnsi="Times New Roman" w:cs="Times New Roman"/>
+          <w:b/>
+          <w:bCs/>
+          <w:color w:val="auto"/>
+          <w:sz w:val="24"/>
+          <w:szCs w:val="24"/>
+        </w:rPr>
+        <w:t>Exploratory Data Analysis (EDA)</w:t>
+      </w:r>
+      <w:bookmarkEnd w:id="1"/>
+    </w:p>
+    <w:p/>
+    <w:p>
+      <w:pPr>
+        <w:spacing w:line="276" w:lineRule="auto"/>
+        <w:rPr>
+          <w:rFonts w:ascii="Times New Roman" w:hAnsi="Times New Roman" w:cs="Times New Roman"/>
+        </w:rPr>
+      </w:pPr>
+      <w:r>
+        <w:rPr>
+          <w:rFonts w:ascii="Times New Roman" w:hAnsi="Times New Roman" w:cs="Times New Roman"/>
+        </w:rPr>
+        <w:t>Progress:</w:t>
+      </w:r>
+    </w:p>
+    <w:p>
+      <w:pPr>
+        <w:pStyle w:val="ListParagraph"/>
+        <w:numPr>
+          <w:ilvl w:val="0"/>
+          <w:numId w:val="6"/>
+        </w:numPr>
+        <w:spacing w:line="276" w:lineRule="auto"/>
+        <w:rPr>
+          <w:rFonts w:ascii="Times New Roman" w:hAnsi="Times New Roman" w:cs="Times New Roman"/>
+        </w:rPr>
+      </w:pPr>
+      <w:r>
+        <w:rPr>
+          <w:rFonts w:ascii="Times New Roman" w:hAnsi="Times New Roman" w:cs="Times New Roman"/>
+        </w:rPr>
+        <w:t xml:space="preserve">Performed </w:t>
+      </w:r>
+      <w:r>
+        <w:rPr>
+          <w:rFonts w:ascii="Times New Roman" w:hAnsi="Times New Roman" w:cs="Times New Roman"/>
+        </w:rPr>
+        <w:t>e</w:t>
+      </w:r>
+      <w:r>
+        <w:rPr>
+          <w:rFonts w:ascii="Times New Roman" w:hAnsi="Times New Roman" w:cs="Times New Roman"/>
+        </w:rPr>
+        <w:t xml:space="preserve">xploratory </w:t>
+      </w:r>
+      <w:r>
+        <w:rPr>
+          <w:rFonts w:ascii="Times New Roman" w:hAnsi="Times New Roman" w:cs="Times New Roman"/>
+        </w:rPr>
+        <w:t>d</w:t>
+      </w:r>
+      <w:r>
+        <w:rPr>
+          <w:rFonts w:ascii="Times New Roman" w:hAnsi="Times New Roman" w:cs="Times New Roman"/>
+        </w:rPr>
+        <w:t xml:space="preserve">ata </w:t>
+      </w:r>
+      <w:r>
+        <w:rPr>
+          <w:rFonts w:ascii="Times New Roman" w:hAnsi="Times New Roman" w:cs="Times New Roman"/>
+        </w:rPr>
+        <w:t>a</w:t>
+      </w:r>
+      <w:r>
+        <w:rPr>
+          <w:rFonts w:ascii="Times New Roman" w:hAnsi="Times New Roman" w:cs="Times New Roman"/>
+        </w:rPr>
+        <w:t>nalysis (EDA) on the combined dataset</w:t>
+      </w:r>
+      <w:r>
+        <w:rPr>
+          <w:rFonts w:ascii="Times New Roman" w:hAnsi="Times New Roman" w:cs="Times New Roman"/>
+        </w:rPr>
+        <w:t xml:space="preserve"> and selected representative stocks </w:t>
+      </w:r>
+      <w:r>
+        <w:rPr>
+          <w:rFonts w:ascii="Times New Roman" w:hAnsi="Times New Roman" w:cs="Times New Roman"/>
+        </w:rPr>
+        <w:t>(Maybank, CIMB, DBS)</w:t>
+      </w:r>
+      <w:r>
+        <w:rPr>
+          <w:rFonts w:ascii="Times New Roman" w:hAnsi="Times New Roman" w:cs="Times New Roman"/>
+        </w:rPr>
+        <w:t>.</w:t>
+      </w:r>
+    </w:p>
+    <w:p>
+      <w:pPr>
+        <w:pStyle w:val="ListParagraph"/>
+        <w:numPr>
+          <w:ilvl w:val="0"/>
+          <w:numId w:val="6"/>
+        </w:numPr>
+        <w:spacing w:line="276" w:lineRule="auto"/>
+        <w:rPr>
+          <w:rFonts w:ascii="Times New Roman" w:hAnsi="Times New Roman" w:cs="Times New Roman"/>
+        </w:rPr>
+      </w:pPr>
+      <w:r>
+        <w:rPr>
+          <w:rFonts w:ascii="Times New Roman" w:hAnsi="Times New Roman" w:cs="Times New Roman"/>
+        </w:rPr>
+        <w:t>Checked for null and duplicates, v</w:t>
+      </w:r>
+      <w:r>
+        <w:rPr>
+          <w:rFonts w:ascii="Times New Roman" w:hAnsi="Times New Roman" w:cs="Times New Roman"/>
+        </w:rPr>
+        <w:t xml:space="preserve">erified dataset structure using </w:t>
+      </w:r>
+      <w:r>
+        <w:rPr>
+          <w:rFonts w:ascii="Times New Roman" w:hAnsi="Times New Roman" w:cs="Times New Roman"/>
+        </w:rPr>
+        <w:t>.</w:t>
+      </w:r>
+      <w:r>
+        <w:rPr>
+          <w:rFonts w:ascii="Times New Roman" w:hAnsi="Times New Roman" w:cs="Times New Roman"/>
+        </w:rPr>
+        <w:t xml:space="preserve">info() and </w:t>
+      </w:r>
+      <w:r>
+        <w:rPr>
+          <w:rFonts w:ascii="Times New Roman" w:hAnsi="Times New Roman" w:cs="Times New Roman"/>
+        </w:rPr>
+        <w:t>.</w:t>
+      </w:r>
+      <w:r>
+        <w:rPr>
+          <w:rFonts w:ascii="Times New Roman" w:hAnsi="Times New Roman" w:cs="Times New Roman"/>
+        </w:rPr>
+        <w:t>describe() functions.</w:t>
+      </w:r>
+    </w:p>
+    <w:p>
+      <w:pPr>
+        <w:pStyle w:val="ListParagraph"/>
+        <w:numPr>
+          <w:ilvl w:val="0"/>
+          <w:numId w:val="6"/>
+        </w:numPr>
+        <w:spacing w:line="276" w:lineRule="auto"/>
+        <w:rPr>
+          <w:rFonts w:ascii="Times New Roman" w:hAnsi="Times New Roman" w:cs="Times New Roman"/>
+        </w:rPr>
+      </w:pPr>
+      <w:r>
+        <w:rPr>
+          <w:rFonts w:ascii="Times New Roman" w:hAnsi="Times New Roman" w:cs="Times New Roman"/>
+        </w:rPr>
+        <w:t>Compare</w:t>
+      </w:r>
+      <w:r>
+        <w:rPr>
+          <w:rFonts w:ascii="Times New Roman" w:hAnsi="Times New Roman" w:cs="Times New Roman"/>
+        </w:rPr>
+        <w:t>d</w:t>
+      </w:r>
+      <w:r>
+        <w:rPr>
+          <w:rFonts w:ascii="Times New Roman" w:hAnsi="Times New Roman" w:cs="Times New Roman"/>
+        </w:rPr>
+        <w:t xml:space="preserve"> the statistics </w:t>
+      </w:r>
+      <w:r>
+        <w:rPr>
+          <w:rFonts w:ascii="Times New Roman" w:hAnsi="Times New Roman" w:cs="Times New Roman"/>
+        </w:rPr>
+        <w:t>across representative stocks (mean, standard deviation, min, max).</w:t>
+      </w:r>
+    </w:p>
+    <w:p>
+      <w:pPr>
+        <w:pStyle w:val="ListParagraph"/>
+        <w:numPr>
+          <w:ilvl w:val="0"/>
+          <w:numId w:val="6"/>
+        </w:numPr>
+        <w:spacing w:line="276" w:lineRule="auto"/>
+        <w:rPr>
+          <w:rFonts w:ascii="Times New Roman" w:hAnsi="Times New Roman" w:cs="Times New Roman"/>
+        </w:rPr>
+      </w:pPr>
+      <w:r>
+        <w:rPr>
+          <w:rFonts w:ascii="Times New Roman" w:hAnsi="Times New Roman" w:cs="Times New Roman"/>
+        </w:rPr>
+        <w:t xml:space="preserve">Visualized </w:t>
+      </w:r>
+      <w:r>
+        <w:rPr>
+          <w:rFonts w:ascii="Times New Roman" w:hAnsi="Times New Roman" w:cs="Times New Roman"/>
+        </w:rPr>
+        <w:t xml:space="preserve">the </w:t>
+      </w:r>
+      <w:r>
+        <w:rPr>
+          <w:rFonts w:ascii="Times New Roman" w:hAnsi="Times New Roman" w:cs="Times New Roman"/>
+        </w:rPr>
+        <w:t>stock price trends using line plots for raw closing prices.</w:t>
+      </w:r>
+      <w:r>
+        <w:rPr>
+          <w:rFonts w:ascii="Times New Roman" w:hAnsi="Times New Roman" w:cs="Times New Roman"/>
+        </w:rPr>
+        <w:t xml:space="preserve"> </w:t>
+      </w:r>
+      <w:r>
+        <w:rPr>
+          <w:rFonts w:ascii="Times New Roman" w:hAnsi="Times New Roman" w:cs="Times New Roman"/>
+        </w:rPr>
+        <w:t>The</w:t>
+      </w:r>
+      <w:r>
+        <w:rPr>
+          <w:rFonts w:ascii="Times New Roman" w:hAnsi="Times New Roman" w:cs="Times New Roman"/>
+        </w:rPr>
+        <w:t xml:space="preserve"> </w:t>
+      </w:r>
+      <w:r>
+        <w:rPr>
+          <w:rFonts w:ascii="Times New Roman" w:hAnsi="Times New Roman" w:cs="Times New Roman"/>
+        </w:rPr>
+        <w:t xml:space="preserve">comparison was not </w:t>
+      </w:r>
+      <w:r>
+        <w:rPr>
+          <w:rFonts w:ascii="Times New Roman" w:hAnsi="Times New Roman" w:cs="Times New Roman"/>
+        </w:rPr>
+        <w:t>too</w:t>
+      </w:r>
+      <w:r>
+        <w:rPr>
+          <w:rFonts w:ascii="Times New Roman" w:hAnsi="Times New Roman" w:cs="Times New Roman"/>
+        </w:rPr>
+        <w:t xml:space="preserve"> meaningful </w:t>
+      </w:r>
+      <w:r>
+        <w:rPr>
+          <w:rFonts w:ascii="Times New Roman" w:hAnsi="Times New Roman" w:cs="Times New Roman"/>
+        </w:rPr>
+        <w:t>because of the</w:t>
+      </w:r>
+      <w:r>
+        <w:rPr>
+          <w:rFonts w:ascii="Times New Roman" w:hAnsi="Times New Roman" w:cs="Times New Roman"/>
+        </w:rPr>
+        <w:t xml:space="preserve"> significant differences in price scales across </w:t>
+      </w:r>
+      <w:r>
+        <w:rPr>
+          <w:rFonts w:ascii="Times New Roman" w:hAnsi="Times New Roman" w:cs="Times New Roman"/>
+        </w:rPr>
+        <w:t xml:space="preserve">the </w:t>
+      </w:r>
+      <w:r>
+        <w:rPr>
+          <w:rFonts w:ascii="Times New Roman" w:hAnsi="Times New Roman" w:cs="Times New Roman"/>
+        </w:rPr>
+        <w:t>stocks.</w:t>
+      </w:r>
+    </w:p>
+    <w:p>
+      <w:pPr>
+        <w:pStyle w:val="ListParagraph"/>
+        <w:numPr>
+          <w:ilvl w:val="0"/>
+          <w:numId w:val="6"/>
+        </w:numPr>
+        <w:spacing w:line="276" w:lineRule="auto"/>
+        <w:rPr>
+          <w:rFonts w:ascii="Times New Roman" w:hAnsi="Times New Roman" w:cs="Times New Roman"/>
+        </w:rPr>
+      </w:pPr>
+      <w:r>
+        <w:rPr>
+          <w:rFonts w:ascii="Times New Roman" w:hAnsi="Times New Roman" w:cs="Times New Roman"/>
+        </w:rPr>
+        <w:t>Normalized the</w:t>
+      </w:r>
+      <w:r>
+        <w:rPr>
+          <w:rFonts w:ascii="Times New Roman" w:hAnsi="Times New Roman" w:cs="Times New Roman"/>
+        </w:rPr>
+        <w:t xml:space="preserve"> stock prices using first available closing price as base value</w:t>
+      </w:r>
+      <w:r>
+        <w:rPr>
+          <w:rFonts w:ascii="Times New Roman" w:hAnsi="Times New Roman" w:cs="Times New Roman"/>
+        </w:rPr>
+        <w:t xml:space="preserve"> (close price / first close price)</w:t>
+      </w:r>
+      <w:r>
+        <w:rPr>
+          <w:rFonts w:ascii="Times New Roman" w:hAnsi="Times New Roman" w:cs="Times New Roman"/>
+        </w:rPr>
+        <w:t>.</w:t>
+      </w:r>
+    </w:p>
+    <w:p>
+      <w:pPr>
+        <w:pStyle w:val="ListParagraph"/>
+        <w:numPr>
+          <w:ilvl w:val="0"/>
+          <w:numId w:val="6"/>
+        </w:numPr>
+        <w:spacing w:line="276" w:lineRule="auto"/>
+        <w:rPr>
+          <w:rFonts w:ascii="Times New Roman" w:hAnsi="Times New Roman" w:cs="Times New Roman"/>
+        </w:rPr>
+      </w:pPr>
+      <w:r>
+        <w:rPr>
+          <w:rFonts w:ascii="Times New Roman" w:hAnsi="Times New Roman" w:cs="Times New Roman"/>
+        </w:rPr>
+        <w:t>Created normalized price comparison plots to standardize cross-stock performance analysis.</w:t>
+      </w:r>
+    </w:p>
+    <w:p>
+      <w:pPr>
+        <w:spacing w:line="276" w:lineRule="auto"/>
+        <w:ind w:left="360"/>
+        <w:rPr>
+          <w:rFonts w:ascii="Times New Roman" w:hAnsi="Times New Roman" w:cs="Times New Roman"/>
+        </w:rPr>
+      </w:pPr>
+    </w:p>
+    <w:p>
+      <w:pPr>
+        <w:spacing w:line="276" w:lineRule="auto"/>
+        <w:rPr>
+          <w:rFonts w:ascii="Times New Roman" w:hAnsi="Times New Roman" w:cs="Times New Roman"/>
+        </w:rPr>
+      </w:pPr>
+      <w:r>
+        <w:rPr>
+          <w:rFonts w:ascii="Times New Roman" w:hAnsi="Times New Roman" w:cs="Times New Roman"/>
+        </w:rPr>
+        <w:t>Problems Encountered:</w:t>
+      </w:r>
+    </w:p>
+    <w:p>
+      <w:pPr>
+        <w:pStyle w:val="ListParagraph"/>
+        <w:numPr>
+          <w:ilvl w:val="0"/>
+          <w:numId w:val="7"/>
+        </w:numPr>
+        <w:spacing w:line="276" w:lineRule="auto"/>
+        <w:rPr>
+          <w:rFonts w:ascii="Times New Roman" w:hAnsi="Times New Roman" w:cs="Times New Roman"/>
+        </w:rPr>
+      </w:pPr>
+      <w:r>
+        <w:rPr>
+          <w:rFonts w:ascii="Times New Roman" w:hAnsi="Times New Roman" w:cs="Times New Roman"/>
+        </w:rPr>
+        <w:t xml:space="preserve">Date axis in </w:t>
+      </w:r>
+      <w:r>
+        <w:rPr>
+          <w:rFonts w:ascii="Times New Roman" w:hAnsi="Times New Roman" w:cs="Times New Roman"/>
+        </w:rPr>
+        <w:t xml:space="preserve">the </w:t>
+      </w:r>
+      <w:r>
+        <w:rPr>
+          <w:rFonts w:ascii="Times New Roman" w:hAnsi="Times New Roman" w:cs="Times New Roman"/>
+        </w:rPr>
+        <w:t xml:space="preserve">plots appeared </w:t>
+      </w:r>
+      <w:r>
+        <w:rPr>
+          <w:rFonts w:ascii="Times New Roman" w:hAnsi="Times New Roman" w:cs="Times New Roman"/>
+        </w:rPr>
+        <w:t xml:space="preserve">to be very </w:t>
+      </w:r>
+      <w:r>
+        <w:rPr>
+          <w:rFonts w:ascii="Times New Roman" w:hAnsi="Times New Roman" w:cs="Times New Roman"/>
+        </w:rPr>
+        <w:t>cluttered and unreadable</w:t>
+      </w:r>
+      <w:r>
+        <w:rPr>
+          <w:rFonts w:ascii="Times New Roman" w:hAnsi="Times New Roman" w:cs="Times New Roman"/>
+        </w:rPr>
+        <w:t xml:space="preserve">. </w:t>
+      </w:r>
+      <w:r>
+        <w:rPr>
+          <w:rFonts w:ascii="Times New Roman" w:hAnsi="Times New Roman" w:cs="Times New Roman"/>
+        </w:rPr>
+        <w:t xml:space="preserve">This was caused by </w:t>
+      </w:r>
+      <w:r>
+        <w:rPr>
+          <w:rFonts w:ascii="Times New Roman" w:hAnsi="Times New Roman" w:cs="Times New Roman"/>
+        </w:rPr>
+        <w:t>too many dates having to be included as</w:t>
+      </w:r>
+      <w:r>
+        <w:rPr>
+          <w:rFonts w:ascii="Times New Roman" w:hAnsi="Times New Roman" w:cs="Times New Roman"/>
+        </w:rPr>
+        <w:t xml:space="preserve"> tick label.</w:t>
+      </w:r>
+      <w:r>
+        <w:rPr>
+          <w:rFonts w:ascii="Times New Roman" w:hAnsi="Times New Roman" w:cs="Times New Roman"/>
+        </w:rPr>
+        <w:t xml:space="preserve"> The problem is solved </w:t>
+      </w:r>
+      <w:r>
+        <w:rPr>
+          <w:rFonts w:ascii="Times New Roman" w:hAnsi="Times New Roman" w:cs="Times New Roman"/>
+        </w:rPr>
+        <w:t xml:space="preserve">by using </w:t>
+      </w:r>
+      <w:r>
+        <w:rPr>
+          <w:rFonts w:ascii="Times New Roman" w:hAnsi="Times New Roman" w:cs="Times New Roman"/>
+        </w:rPr>
+        <w:t>‘</w:t>
+      </w:r>
+      <w:proofErr w:type="spellStart"/>
+      <w:r>
+        <w:rPr>
+          <w:rFonts w:ascii="Times New Roman" w:hAnsi="Times New Roman" w:cs="Times New Roman"/>
+        </w:rPr>
+        <w:t>mdates.MonthLocator</w:t>
+      </w:r>
+      <w:proofErr w:type="spellEnd"/>
+      <w:r>
+        <w:rPr>
+          <w:rFonts w:ascii="Times New Roman" w:hAnsi="Times New Roman" w:cs="Times New Roman"/>
+        </w:rPr>
+        <w:t>(interval = 6)</w:t>
+      </w:r>
+      <w:r>
+        <w:rPr>
+          <w:rFonts w:ascii="Times New Roman" w:hAnsi="Times New Roman" w:cs="Times New Roman"/>
+        </w:rPr>
+        <w:t>’, only label once per 6 months.</w:t>
+      </w:r>
+    </w:p>
+    <w:p>
+      <w:pPr>
+        <w:spacing w:line="276" w:lineRule="auto"/>
+        <w:rPr>
+          <w:rFonts w:ascii="Times New Roman" w:hAnsi="Times New Roman" w:cs="Times New Roman"/>
+        </w:rPr>
+      </w:pPr>
+    </w:p>
+    <w:p>
+      <w:pPr>
+        <w:spacing w:line="276" w:lineRule="auto"/>
+        <w:rPr>
+          <w:rFonts w:ascii="Times New Roman" w:hAnsi="Times New Roman" w:cs="Times New Roman"/>
+        </w:rPr>
+      </w:pPr>
+      <w:r>
+        <w:rPr>
+          <w:rFonts w:ascii="Times New Roman" w:hAnsi="Times New Roman" w:cs="Times New Roman"/>
+        </w:rPr>
+        <w:t>Key Learning:</w:t>
+      </w:r>
+    </w:p>
+    <w:p>
+      <w:pPr>
+        <w:pStyle w:val="ListParagraph"/>
+        <w:numPr>
+          <w:ilvl w:val="0"/>
+          <w:numId w:val="8"/>
+        </w:numPr>
+        <w:spacing w:line="276" w:lineRule="auto"/>
+        <w:rPr>
+          <w:rFonts w:ascii="Times New Roman" w:hAnsi="Times New Roman" w:cs="Times New Roman"/>
+        </w:rPr>
+      </w:pPr>
+      <w:r>
+        <w:rPr>
+          <w:rFonts w:ascii="Times New Roman" w:hAnsi="Times New Roman" w:cs="Times New Roman"/>
+        </w:rPr>
+        <w:t xml:space="preserve">Stock prices across different markets cannot be directly compared </w:t>
+      </w:r>
+      <w:r>
+        <w:rPr>
+          <w:rFonts w:ascii="Times New Roman" w:hAnsi="Times New Roman" w:cs="Times New Roman"/>
+        </w:rPr>
+        <w:t>because they have</w:t>
+      </w:r>
+      <w:r>
+        <w:rPr>
+          <w:rFonts w:ascii="Times New Roman" w:hAnsi="Times New Roman" w:cs="Times New Roman"/>
+        </w:rPr>
+        <w:t xml:space="preserve"> different scales and currencies</w:t>
+      </w:r>
+      <w:r>
+        <w:rPr>
+          <w:rFonts w:ascii="Times New Roman" w:hAnsi="Times New Roman" w:cs="Times New Roman"/>
+        </w:rPr>
+        <w:t xml:space="preserve"> (</w:t>
+      </w:r>
+      <w:proofErr w:type="spellStart"/>
+      <w:r>
+        <w:rPr>
+          <w:rFonts w:ascii="Times New Roman" w:hAnsi="Times New Roman" w:cs="Times New Roman"/>
+        </w:rPr>
+        <w:t>yfinance</w:t>
+      </w:r>
+      <w:proofErr w:type="spellEnd"/>
+      <w:r>
+        <w:rPr>
+          <w:rFonts w:ascii="Times New Roman" w:hAnsi="Times New Roman" w:cs="Times New Roman"/>
+        </w:rPr>
+        <w:t xml:space="preserve"> returns prices in the market local currencies)</w:t>
+      </w:r>
+      <w:r>
+        <w:rPr>
+          <w:rFonts w:ascii="Times New Roman" w:hAnsi="Times New Roman" w:cs="Times New Roman"/>
+        </w:rPr>
+        <w:t>.</w:t>
+      </w:r>
+    </w:p>
+    <w:p>
+      <w:pPr>
+        <w:pStyle w:val="ListParagraph"/>
+        <w:numPr>
+          <w:ilvl w:val="0"/>
+          <w:numId w:val="8"/>
+        </w:numPr>
+        <w:spacing w:line="276" w:lineRule="auto"/>
+        <w:rPr>
+          <w:rFonts w:ascii="Times New Roman" w:hAnsi="Times New Roman" w:cs="Times New Roman"/>
+        </w:rPr>
+      </w:pPr>
+      <w:r>
+        <w:rPr>
+          <w:rFonts w:ascii="Times New Roman" w:hAnsi="Times New Roman" w:cs="Times New Roman"/>
+        </w:rPr>
+        <w:t xml:space="preserve">Normalization is </w:t>
+      </w:r>
+      <w:r>
+        <w:rPr>
+          <w:rFonts w:ascii="Times New Roman" w:hAnsi="Times New Roman" w:cs="Times New Roman"/>
+        </w:rPr>
+        <w:t>important</w:t>
+      </w:r>
+      <w:r>
+        <w:rPr>
+          <w:rFonts w:ascii="Times New Roman" w:hAnsi="Times New Roman" w:cs="Times New Roman"/>
+        </w:rPr>
+        <w:t xml:space="preserve"> to compare performance trends across multiple assets.</w:t>
+      </w:r>
+    </w:p>
+    <w:p>
+      <w:pPr>
+        <w:pStyle w:val="ListParagraph"/>
+        <w:numPr>
+          <w:ilvl w:val="0"/>
+          <w:numId w:val="8"/>
+        </w:numPr>
+        <w:spacing w:line="276" w:lineRule="auto"/>
+        <w:rPr>
+          <w:rFonts w:ascii="Times New Roman" w:hAnsi="Times New Roman" w:cs="Times New Roman"/>
+        </w:rPr>
+      </w:pPr>
+      <w:r>
+        <w:rPr>
+          <w:rFonts w:ascii="Times New Roman" w:hAnsi="Times New Roman" w:cs="Times New Roman"/>
+        </w:rPr>
+        <w:t xml:space="preserve">Instead of analyzing absolute price levels, </w:t>
+      </w:r>
+      <w:r>
+        <w:rPr>
+          <w:rFonts w:ascii="Times New Roman" w:hAnsi="Times New Roman" w:cs="Times New Roman"/>
+        </w:rPr>
+        <w:t xml:space="preserve">we will </w:t>
+      </w:r>
+      <w:r>
+        <w:rPr>
+          <w:rFonts w:ascii="Times New Roman" w:hAnsi="Times New Roman" w:cs="Times New Roman"/>
+        </w:rPr>
+        <w:t xml:space="preserve">now </w:t>
+      </w:r>
+      <w:r>
+        <w:rPr>
+          <w:rFonts w:ascii="Times New Roman" w:hAnsi="Times New Roman" w:cs="Times New Roman"/>
+        </w:rPr>
+        <w:t>be focusing on</w:t>
+      </w:r>
+      <w:r>
+        <w:rPr>
+          <w:rFonts w:ascii="Times New Roman" w:hAnsi="Times New Roman" w:cs="Times New Roman"/>
+        </w:rPr>
+        <w:t xml:space="preserve"> return-based performance for better comparability across stocks.</w:t>
+      </w:r>
+    </w:p>
+    <w:p>
+      <w:pPr>
+        <w:spacing w:line="276" w:lineRule="auto"/>
+        <w:rPr>
+          <w:rFonts w:ascii="Times New Roman" w:hAnsi="Times New Roman" w:cs="Times New Roman"/>
+        </w:rPr>
+      </w:pPr>
+    </w:p>
+    <w:p>
+      <w:pPr>
+        <w:spacing w:line="276" w:lineRule="auto"/>
+        <w:rPr>
+          <w:rFonts w:ascii="Times New Roman" w:hAnsi="Times New Roman" w:cs="Times New Roman"/>
+        </w:rPr>
+      </w:pPr>
+      <w:r>
+        <w:rPr>
+          <w:rFonts w:ascii="Times New Roman" w:hAnsi="Times New Roman" w:cs="Times New Roman"/>
+        </w:rPr>
+        <w:t>Next Tasks:</w:t>
+      </w:r>
+    </w:p>
+    <w:p>
+      <w:pPr>
+        <w:pStyle w:val="ListParagraph"/>
+        <w:numPr>
+          <w:ilvl w:val="0"/>
+          <w:numId w:val="9"/>
+        </w:numPr>
+        <w:spacing w:line="276" w:lineRule="auto"/>
+        <w:rPr>
+          <w:rFonts w:ascii="Times New Roman" w:hAnsi="Times New Roman" w:cs="Times New Roman"/>
+        </w:rPr>
+      </w:pPr>
+      <w:r>
+        <w:rPr>
+          <w:rFonts w:ascii="Times New Roman" w:hAnsi="Times New Roman" w:cs="Times New Roman"/>
+        </w:rPr>
+        <w:t xml:space="preserve">Perform </w:t>
+      </w:r>
+      <w:r>
+        <w:rPr>
+          <w:rFonts w:ascii="Times New Roman" w:hAnsi="Times New Roman" w:cs="Times New Roman"/>
+        </w:rPr>
+        <w:t>f</w:t>
+      </w:r>
+      <w:r>
+        <w:rPr>
+          <w:rFonts w:ascii="Times New Roman" w:hAnsi="Times New Roman" w:cs="Times New Roman"/>
+        </w:rPr>
+        <w:t xml:space="preserve">eature </w:t>
+      </w:r>
+      <w:r>
+        <w:rPr>
+          <w:rFonts w:ascii="Times New Roman" w:hAnsi="Times New Roman" w:cs="Times New Roman"/>
+        </w:rPr>
+        <w:t>e</w:t>
+      </w:r>
+      <w:r>
+        <w:rPr>
+          <w:rFonts w:ascii="Times New Roman" w:hAnsi="Times New Roman" w:cs="Times New Roman"/>
+        </w:rPr>
+        <w:t>ngineering (</w:t>
+      </w:r>
+      <w:r>
+        <w:rPr>
+          <w:rFonts w:ascii="Times New Roman" w:hAnsi="Times New Roman" w:cs="Times New Roman"/>
+        </w:rPr>
+        <w:t>technical indicators</w:t>
+      </w:r>
+      <w:r>
+        <w:rPr>
+          <w:rFonts w:ascii="Times New Roman" w:hAnsi="Times New Roman" w:cs="Times New Roman"/>
+        </w:rPr>
+        <w:t>)</w:t>
+      </w:r>
+      <w:r>
+        <w:rPr>
+          <w:rFonts w:ascii="Times New Roman" w:hAnsi="Times New Roman" w:cs="Times New Roman"/>
+        </w:rPr>
+        <w:t>.</w:t>
+      </w:r>
+    </w:p>
+    <w:p>
+      <w:pPr>
+        <w:pStyle w:val="ListParagraph"/>
+        <w:numPr>
+          <w:ilvl w:val="0"/>
+          <w:numId w:val="9"/>
+        </w:numPr>
+        <w:spacing w:line="276" w:lineRule="auto"/>
+        <w:rPr>
+          <w:rFonts w:ascii="Times New Roman" w:hAnsi="Times New Roman" w:cs="Times New Roman"/>
+        </w:rPr>
+      </w:pPr>
+      <w:r>
+        <w:rPr>
+          <w:rFonts w:ascii="Times New Roman" w:hAnsi="Times New Roman" w:cs="Times New Roman"/>
+        </w:rPr>
+        <w:t>Prepare dataset for machine learning model training</w:t>
+      </w:r>
+      <w:r>
+        <w:rPr>
+          <w:rFonts w:ascii="Times New Roman" w:hAnsi="Times New Roman" w:cs="Times New Roman"/>
+        </w:rPr>
+        <w:t>.</w:t>
+      </w:r>
     </w:p>
     <w:sectPr>
+      <w:footerReference w:type="default" r:id="rId9"/>
       <w:pgSz w:w="12240" w:h="15840"/>
       <w:pgMar w:top="1440" w:right="1440" w:bottom="1440" w:left="1440" w:header="720" w:footer="720" w:gutter="0"/>
+      <w:pgNumType w:start="1"/>
       <w:cols w:space="720"/>
       <w:docGrid w:linePitch="360"/>
     </w:sectPr>
   </w:body>
 </w:document>
+</file>
+
+<file path=word/endnotes.xml><?xml version="1.0" encoding="utf-8"?>
+<w:endnotes xmlns:wpc="http://schemas.microsoft.com/office/word/2010/wordprocessingCanvas" xmlns:cx="http://schemas.microsoft.com/office/drawing/2014/chartex" xmlns:cx1="http://schemas.microsoft.com/office/drawing/2015/9/8/chartex" xmlns:cx2="http://schemas.microsoft.com/office/drawing/2015/10/21/chartex" xmlns:cx3="http://schemas.microsoft.com/office/drawing/2016/5/9/chartex" xmlns:cx4="http://schemas.microsoft.com/office/drawing/2016/5/10/chartex" xmlns:cx5="http://schemas.microsoft.com/office/drawing/2016/5/11/chartex" xmlns:cx6="http://schemas.microsoft.com/office/drawing/2016/5/12/chartex" xmlns:cx7="http://schemas.microsoft.com/office/drawing/2016/5/13/chartex" xmlns:cx8="http://schemas.microsoft.com/office/drawing/2016/5/14/chartex" xmlns:mc="http://schemas.openxmlformats.org/markup-compatibility/2006" xmlns:aink="http://schemas.microsoft.com/office/drawing/2016/ink" xmlns:am3d="http://schemas.microsoft.com/office/drawing/2017/model3d" xmlns:o="urn:schemas-microsoft-com:office:office" xmlns:oel="http://schemas.microsoft.com/office/2019/extlst" xmlns:r="http://schemas.openxmlformats.org/officeDocument/2006/relationships" xmlns:m="http://schemas.openxmlformats.org/officeDocument/2006/math" xmlns:v="urn:schemas-microsoft-com:vml" xmlns:wp14="http://schemas.microsoft.com/office/word/2010/wordprocessingDrawing" xmlns:wp="http://schemas.openxmlformats.org/drawingml/2006/wordprocessingDrawing" xmlns:w10="urn:schemas-microsoft-com:office:word" xmlns:w="http://schemas.openxmlformats.org/wordprocessingml/2006/main" xmlns:w14="http://schemas.microsoft.com/office/word/2010/wordml" xmlns:w15="http://schemas.microsoft.com/office/word/2012/wordml" xmlns:w16cex="http://schemas.microsoft.com/office/word/2018/wordml/cex" xmlns:w16cid="http://schemas.microsoft.com/office/word/2016/wordml/cid" xmlns:w16="http://schemas.microsoft.com/office/word/2018/wordml" xmlns:w16du="http://schemas.microsoft.com/office/word/2023/wordml/word16du" xmlns:w16sdtdh="http://schemas.microsoft.com/office/word/2020/wordml/sdtdatahash" xmlns:w16sdtfl="http://schemas.microsoft.com/office/word/2024/wordml/sdtformatlock" xmlns:w16se="http://schemas.microsoft.com/office/word/2015/wordml/symex" xmlns:wpg="http://schemas.microsoft.com/office/word/2010/wordprocessingGroup" xmlns:wpi="http://schemas.microsoft.com/office/word/2010/wordprocessingInk" xmlns:wne="http://schemas.microsoft.com/office/word/2006/wordml" xmlns:wps="http://schemas.microsoft.com/office/word/2010/wordprocessingShape" mc:Ignorable="w14 w15 w16se w16cid w16 w16cex w16sdtdh w16sdtfl w16du wp14">
+  <w:endnote w:type="separator" w:id="-1">
+    <w:p>
+      <w:pPr>
+        <w:spacing w:after="0" w:line="240" w:lineRule="auto"/>
+      </w:pPr>
+      <w:r>
+        <w:separator/>
+      </w:r>
+    </w:p>
+  </w:endnote>
+  <w:endnote w:type="continuationSeparator" w:id="0">
+    <w:p>
+      <w:pPr>
+        <w:spacing w:after="0" w:line="240" w:lineRule="auto"/>
+      </w:pPr>
+      <w:r>
+        <w:continuationSeparator/>
+      </w:r>
+    </w:p>
+  </w:endnote>
+</w:endnotes>
+</file>
+
+<file path=word/footer1.xml><?xml version="1.0" encoding="utf-8"?>
+<w:ftr xmlns:wpc="http://schemas.microsoft.com/office/word/2010/wordprocessingCanvas" xmlns:cx="http://schemas.microsoft.com/office/drawing/2014/chartex" xmlns:cx1="http://schemas.microsoft.com/office/drawing/2015/9/8/chartex" xmlns:cx2="http://schemas.microsoft.com/office/drawing/2015/10/21/chartex" xmlns:cx3="http://schemas.microsoft.com/office/drawing/2016/5/9/chartex" xmlns:cx4="http://schemas.microsoft.com/office/drawing/2016/5/10/chartex" xmlns:cx5="http://schemas.microsoft.com/office/drawing/2016/5/11/chartex" xmlns:cx6="http://schemas.microsoft.com/office/drawing/2016/5/12/chartex" xmlns:cx7="http://schemas.microsoft.com/office/drawing/2016/5/13/chartex" xmlns:cx8="http://schemas.microsoft.com/office/drawing/2016/5/14/chartex" xmlns:mc="http://schemas.openxmlformats.org/markup-compatibility/2006" xmlns:aink="http://schemas.microsoft.com/office/drawing/2016/ink" xmlns:am3d="http://schemas.microsoft.com/office/drawing/2017/model3d" xmlns:o="urn:schemas-microsoft-com:office:office" xmlns:oel="http://schemas.microsoft.com/office/2019/extlst" xmlns:r="http://schemas.openxmlformats.org/officeDocument/2006/relationships" xmlns:m="http://schemas.openxmlformats.org/officeDocument/2006/math" xmlns:v="urn:schemas-microsoft-com:vml" xmlns:wp14="http://schemas.microsoft.com/office/word/2010/wordprocessingDrawing" xmlns:wp="http://schemas.openxmlformats.org/drawingml/2006/wordprocessingDrawing" xmlns:w10="urn:schemas-microsoft-com:office:word" xmlns:w="http://schemas.openxmlformats.org/wordprocessingml/2006/main" xmlns:w14="http://schemas.microsoft.com/office/word/2010/wordml" xmlns:w15="http://schemas.microsoft.com/office/word/2012/wordml" xmlns:w16cex="http://schemas.microsoft.com/office/word/2018/wordml/cex" xmlns:w16cid="http://schemas.microsoft.com/office/word/2016/wordml/cid" xmlns:w16="http://schemas.microsoft.com/office/word/2018/wordml" xmlns:w16du="http://schemas.microsoft.com/office/word/2023/wordml/word16du" xmlns:w16sdtdh="http://schemas.microsoft.com/office/word/2020/wordml/sdtdatahash" xmlns:w16sdtfl="http://schemas.microsoft.com/office/word/2024/wordml/sdtformatlock" xmlns:w16se="http://schemas.microsoft.com/office/word/2015/wordml/symex" xmlns:wpg="http://schemas.microsoft.com/office/word/2010/wordprocessingGroup" xmlns:wpi="http://schemas.microsoft.com/office/word/2010/wordprocessingInk" xmlns:wne="http://schemas.microsoft.com/office/word/2006/wordml" xmlns:wps="http://schemas.microsoft.com/office/word/2010/wordprocessingShape" mc:Ignorable="w14 w15 w16se w16cid w16 w16cex w16sdtdh w16sdtfl w16du wp14">
+  <w:p>
+    <w:pPr>
+      <w:pStyle w:val="Footer"/>
+      <w:jc w:val="right"/>
+    </w:pPr>
+  </w:p>
+  <w:p>
+    <w:pPr>
+      <w:pStyle w:val="Footer"/>
+    </w:pPr>
+  </w:p>
+</w:ftr>
+</file>
+
+<file path=word/footer2.xml><?xml version="1.0" encoding="utf-8"?>
+<w:ftr xmlns:wpc="http://schemas.microsoft.com/office/word/2010/wordprocessingCanvas" xmlns:cx="http://schemas.microsoft.com/office/drawing/2014/chartex" xmlns:cx1="http://schemas.microsoft.com/office/drawing/2015/9/8/chartex" xmlns:cx2="http://schemas.microsoft.com/office/drawing/2015/10/21/chartex" xmlns:cx3="http://schemas.microsoft.com/office/drawing/2016/5/9/chartex" xmlns:cx4="http://schemas.microsoft.com/office/drawing/2016/5/10/chartex" xmlns:cx5="http://schemas.microsoft.com/office/drawing/2016/5/11/chartex" xmlns:cx6="http://schemas.microsoft.com/office/drawing/2016/5/12/chartex" xmlns:cx7="http://schemas.microsoft.com/office/drawing/2016/5/13/chartex" xmlns:cx8="http://schemas.microsoft.com/office/drawing/2016/5/14/chartex" xmlns:mc="http://schemas.openxmlformats.org/markup-compatibility/2006" xmlns:aink="http://schemas.microsoft.com/office/drawing/2016/ink" xmlns:am3d="http://schemas.microsoft.com/office/drawing/2017/model3d" xmlns:o="urn:schemas-microsoft-com:office:office" xmlns:oel="http://schemas.microsoft.com/office/2019/extlst" xmlns:r="http://schemas.openxmlformats.org/officeDocument/2006/relationships" xmlns:m="http://schemas.openxmlformats.org/officeDocument/2006/math" xmlns:v="urn:schemas-microsoft-com:vml" xmlns:wp14="http://schemas.microsoft.com/office/word/2010/wordprocessingDrawing" xmlns:wp="http://schemas.openxmlformats.org/drawingml/2006/wordprocessingDrawing" xmlns:w10="urn:schemas-microsoft-com:office:word" xmlns:w="http://schemas.openxmlformats.org/wordprocessingml/2006/main" xmlns:w14="http://schemas.microsoft.com/office/word/2010/wordml" xmlns:w15="http://schemas.microsoft.com/office/word/2012/wordml" xmlns:w16cex="http://schemas.microsoft.com/office/word/2018/wordml/cex" xmlns:w16cid="http://schemas.microsoft.com/office/word/2016/wordml/cid" xmlns:w16="http://schemas.microsoft.com/office/word/2018/wordml" xmlns:w16du="http://schemas.microsoft.com/office/word/2023/wordml/word16du" xmlns:w16sdtdh="http://schemas.microsoft.com/office/word/2020/wordml/sdtdatahash" xmlns:w16sdtfl="http://schemas.microsoft.com/office/word/2024/wordml/sdtformatlock" xmlns:w16se="http://schemas.microsoft.com/office/word/2015/wordml/symex" xmlns:wpg="http://schemas.microsoft.com/office/word/2010/wordprocessingGroup" xmlns:wpi="http://schemas.microsoft.com/office/word/2010/wordprocessingInk" xmlns:wne="http://schemas.microsoft.com/office/word/2006/wordml" xmlns:wps="http://schemas.microsoft.com/office/word/2010/wordprocessingShape" mc:Ignorable="w14 w15 w16se w16cid w16 w16cex w16sdtdh w16sdtfl w16du wp14">
+  <w:sdt>
+    <w:sdtPr>
+      <w:id w:val="157892294"/>
+      <w:docPartObj>
+        <w:docPartGallery w:val="Page Numbers (Bottom of Page)"/>
+        <w:docPartUnique/>
+      </w:docPartObj>
+    </w:sdtPr>
+    <w:sdtEndPr>
+      <w:rPr>
+        <w:noProof/>
+      </w:rPr>
+    </w:sdtEndPr>
+    <w:sdtContent>
+      <w:p>
+        <w:pPr>
+          <w:pStyle w:val="Footer"/>
+          <w:jc w:val="right"/>
+        </w:pPr>
+        <w:r>
+          <w:fldChar w:fldCharType="begin"/>
+        </w:r>
+        <w:r>
+          <w:instrText xml:space="preserve"> PAGE   \* MERGEFORMAT </w:instrText>
+        </w:r>
+        <w:r>
+          <w:fldChar w:fldCharType="separate"/>
+        </w:r>
+        <w:r>
+          <w:rPr>
+            <w:noProof/>
+          </w:rPr>
+          <w:t>2</w:t>
+        </w:r>
+        <w:r>
+          <w:rPr>
+            <w:noProof/>
+          </w:rPr>
+          <w:fldChar w:fldCharType="end"/>
+        </w:r>
+      </w:p>
+    </w:sdtContent>
+  </w:sdt>
+  <w:p>
+    <w:pPr>
+      <w:pStyle w:val="Footer"/>
+    </w:pPr>
+  </w:p>
+</w:ftr>
+</file>
+
+<file path=word/footnotes.xml><?xml version="1.0" encoding="utf-8"?>
+<w:footnotes xmlns:wpc="http://schemas.microsoft.com/office/word/2010/wordprocessingCanvas" xmlns:cx="http://schemas.microsoft.com/office/drawing/2014/chartex" xmlns:cx1="http://schemas.microsoft.com/office/drawing/2015/9/8/chartex" xmlns:cx2="http://schemas.microsoft.com/office/drawing/2015/10/21/chartex" xmlns:cx3="http://schemas.microsoft.com/office/drawing/2016/5/9/chartex" xmlns:cx4="http://schemas.microsoft.com/office/drawing/2016/5/10/chartex" xmlns:cx5="http://schemas.microsoft.com/office/drawing/2016/5/11/chartex" xmlns:cx6="http://schemas.microsoft.com/office/drawing/2016/5/12/chartex" xmlns:cx7="http://schemas.microsoft.com/office/drawing/2016/5/13/chartex" xmlns:cx8="http://schemas.microsoft.com/office/drawing/2016/5/14/chartex" xmlns:mc="http://schemas.openxmlformats.org/markup-compatibility/2006" xmlns:aink="http://schemas.microsoft.com/office/drawing/2016/ink" xmlns:am3d="http://schemas.microsoft.com/office/drawing/2017/model3d" xmlns:o="urn:schemas-microsoft-com:office:office" xmlns:oel="http://schemas.microsoft.com/office/2019/extlst" xmlns:r="http://schemas.openxmlformats.org/officeDocument/2006/relationships" xmlns:m="http://schemas.openxmlformats.org/officeDocument/2006/math" xmlns:v="urn:schemas-microsoft-com:vml" xmlns:wp14="http://schemas.microsoft.com/office/word/2010/wordprocessingDrawing" xmlns:wp="http://schemas.openxmlformats.org/drawingml/2006/wordprocessingDrawing" xmlns:w10="urn:schemas-microsoft-com:office:word" xmlns:w="http://schemas.openxmlformats.org/wordprocessingml/2006/main" xmlns:w14="http://schemas.microsoft.com/office/word/2010/wordml" xmlns:w15="http://schemas.microsoft.com/office/word/2012/wordml" xmlns:w16cex="http://schemas.microsoft.com/office/word/2018/wordml/cex" xmlns:w16cid="http://schemas.microsoft.com/office/word/2016/wordml/cid" xmlns:w16="http://schemas.microsoft.com/office/word/2018/wordml" xmlns:w16du="http://schemas.microsoft.com/office/word/2023/wordml/word16du" xmlns:w16sdtdh="http://schemas.microsoft.com/office/word/2020/wordml/sdtdatahash" xmlns:w16sdtfl="http://schemas.microsoft.com/office/word/2024/wordml/sdtformatlock" xmlns:w16se="http://schemas.microsoft.com/office/word/2015/wordml/symex" xmlns:wpg="http://schemas.microsoft.com/office/word/2010/wordprocessingGroup" xmlns:wpi="http://schemas.microsoft.com/office/word/2010/wordprocessingInk" xmlns:wne="http://schemas.microsoft.com/office/word/2006/wordml" xmlns:wps="http://schemas.microsoft.com/office/word/2010/wordprocessingShape" mc:Ignorable="w14 w15 w16se w16cid w16 w16cex w16sdtdh w16sdtfl w16du wp14">
+  <w:footnote w:type="separator" w:id="-1">
+    <w:p>
+      <w:pPr>
+        <w:spacing w:after="0" w:line="240" w:lineRule="auto"/>
+      </w:pPr>
+      <w:r>
+        <w:separator/>
+      </w:r>
+    </w:p>
+  </w:footnote>
+  <w:footnote w:type="continuationSeparator" w:id="0">
+    <w:p>
+      <w:pPr>
+        <w:spacing w:after="0" w:line="240" w:lineRule="auto"/>
+      </w:pPr>
+      <w:r>
+        <w:continuationSeparator/>
+      </w:r>
+    </w:p>
+  </w:footnote>
+</w:footnotes>
 </file>
 
 <file path=word/numbering.xml><?xml version="1.0" encoding="utf-8"?>
@@ -758,6 +1942,92 @@
     </w:lvl>
   </w:abstractNum>
   <w:abstractNum w:abstractNumId="1" w15:restartNumberingAfterBreak="0">
+    <w:nsid w:val="2CC66FF8"/>
+    <w:multiLevelType w:val="hybridMultilevel"/>
+    <w:tmpl w:val="A03A568C"/>
+    <w:lvl w:ilvl="0" w:tplc="0409000F">
+      <w:start w:val="1"/>
+      <w:numFmt w:val="decimal"/>
+      <w:lvlText w:val="%1."/>
+      <w:lvlJc w:val="left"/>
+      <w:pPr>
+        <w:ind w:left="720" w:hanging="360"/>
+      </w:pPr>
+    </w:lvl>
+    <w:lvl w:ilvl="1" w:tplc="04090019" w:tentative="1">
+      <w:start w:val="1"/>
+      <w:numFmt w:val="lowerLetter"/>
+      <w:lvlText w:val="%2."/>
+      <w:lvlJc w:val="left"/>
+      <w:pPr>
+        <w:ind w:left="1440" w:hanging="360"/>
+      </w:pPr>
+    </w:lvl>
+    <w:lvl w:ilvl="2" w:tplc="0409001B" w:tentative="1">
+      <w:start w:val="1"/>
+      <w:numFmt w:val="lowerRoman"/>
+      <w:lvlText w:val="%3."/>
+      <w:lvlJc w:val="right"/>
+      <w:pPr>
+        <w:ind w:left="2160" w:hanging="180"/>
+      </w:pPr>
+    </w:lvl>
+    <w:lvl w:ilvl="3" w:tplc="0409000F" w:tentative="1">
+      <w:start w:val="1"/>
+      <w:numFmt w:val="decimal"/>
+      <w:lvlText w:val="%4."/>
+      <w:lvlJc w:val="left"/>
+      <w:pPr>
+        <w:ind w:left="2880" w:hanging="360"/>
+      </w:pPr>
+    </w:lvl>
+    <w:lvl w:ilvl="4" w:tplc="04090019" w:tentative="1">
+      <w:start w:val="1"/>
+      <w:numFmt w:val="lowerLetter"/>
+      <w:lvlText w:val="%5."/>
+      <w:lvlJc w:val="left"/>
+      <w:pPr>
+        <w:ind w:left="3600" w:hanging="360"/>
+      </w:pPr>
+    </w:lvl>
+    <w:lvl w:ilvl="5" w:tplc="0409001B" w:tentative="1">
+      <w:start w:val="1"/>
+      <w:numFmt w:val="lowerRoman"/>
+      <w:lvlText w:val="%6."/>
+      <w:lvlJc w:val="right"/>
+      <w:pPr>
+        <w:ind w:left="4320" w:hanging="180"/>
+      </w:pPr>
+    </w:lvl>
+    <w:lvl w:ilvl="6" w:tplc="0409000F" w:tentative="1">
+      <w:start w:val="1"/>
+      <w:numFmt w:val="decimal"/>
+      <w:lvlText w:val="%7."/>
+      <w:lvlJc w:val="left"/>
+      <w:pPr>
+        <w:ind w:left="5040" w:hanging="360"/>
+      </w:pPr>
+    </w:lvl>
+    <w:lvl w:ilvl="7" w:tplc="04090019" w:tentative="1">
+      <w:start w:val="1"/>
+      <w:numFmt w:val="lowerLetter"/>
+      <w:lvlText w:val="%8."/>
+      <w:lvlJc w:val="left"/>
+      <w:pPr>
+        <w:ind w:left="5760" w:hanging="360"/>
+      </w:pPr>
+    </w:lvl>
+    <w:lvl w:ilvl="8" w:tplc="0409001B" w:tentative="1">
+      <w:start w:val="1"/>
+      <w:numFmt w:val="lowerRoman"/>
+      <w:lvlText w:val="%9."/>
+      <w:lvlJc w:val="right"/>
+      <w:pPr>
+        <w:ind w:left="6480" w:hanging="180"/>
+      </w:pPr>
+    </w:lvl>
+  </w:abstractNum>
+  <w:abstractNum w:abstractNumId="2" w15:restartNumberingAfterBreak="0">
     <w:nsid w:val="2DFD78D1"/>
     <w:multiLevelType w:val="hybridMultilevel"/>
     <w:tmpl w:val="97A2A16E"/>
@@ -870,7 +2140,7 @@
       </w:rPr>
     </w:lvl>
   </w:abstractNum>
-  <w:abstractNum w:abstractNumId="2" w15:restartNumberingAfterBreak="0">
+  <w:abstractNum w:abstractNumId="3" w15:restartNumberingAfterBreak="0">
     <w:nsid w:val="3D593B69"/>
     <w:multiLevelType w:val="multilevel"/>
     <w:tmpl w:val="FAD0CA48"/>
@@ -1019,7 +2289,7 @@
       </w:rPr>
     </w:lvl>
   </w:abstractNum>
-  <w:abstractNum w:abstractNumId="3" w15:restartNumberingAfterBreak="0">
+  <w:abstractNum w:abstractNumId="4" w15:restartNumberingAfterBreak="0">
     <w:nsid w:val="3F932A79"/>
     <w:multiLevelType w:val="hybridMultilevel"/>
     <w:tmpl w:val="7FD0B296"/>
@@ -1108,7 +2378,265 @@
       </w:pPr>
     </w:lvl>
   </w:abstractNum>
-  <w:abstractNum w:abstractNumId="4" w15:restartNumberingAfterBreak="0">
+  <w:abstractNum w:abstractNumId="5" w15:restartNumberingAfterBreak="0">
+    <w:nsid w:val="41FB04F2"/>
+    <w:multiLevelType w:val="hybridMultilevel"/>
+    <w:tmpl w:val="C032D17C"/>
+    <w:lvl w:ilvl="0" w:tplc="0409000F">
+      <w:start w:val="1"/>
+      <w:numFmt w:val="decimal"/>
+      <w:lvlText w:val="%1."/>
+      <w:lvlJc w:val="left"/>
+      <w:pPr>
+        <w:ind w:left="720" w:hanging="360"/>
+      </w:pPr>
+    </w:lvl>
+    <w:lvl w:ilvl="1" w:tplc="04090019" w:tentative="1">
+      <w:start w:val="1"/>
+      <w:numFmt w:val="lowerLetter"/>
+      <w:lvlText w:val="%2."/>
+      <w:lvlJc w:val="left"/>
+      <w:pPr>
+        <w:ind w:left="1440" w:hanging="360"/>
+      </w:pPr>
+    </w:lvl>
+    <w:lvl w:ilvl="2" w:tplc="0409001B" w:tentative="1">
+      <w:start w:val="1"/>
+      <w:numFmt w:val="lowerRoman"/>
+      <w:lvlText w:val="%3."/>
+      <w:lvlJc w:val="right"/>
+      <w:pPr>
+        <w:ind w:left="2160" w:hanging="180"/>
+      </w:pPr>
+    </w:lvl>
+    <w:lvl w:ilvl="3" w:tplc="0409000F" w:tentative="1">
+      <w:start w:val="1"/>
+      <w:numFmt w:val="decimal"/>
+      <w:lvlText w:val="%4."/>
+      <w:lvlJc w:val="left"/>
+      <w:pPr>
+        <w:ind w:left="2880" w:hanging="360"/>
+      </w:pPr>
+    </w:lvl>
+    <w:lvl w:ilvl="4" w:tplc="04090019" w:tentative="1">
+      <w:start w:val="1"/>
+      <w:numFmt w:val="lowerLetter"/>
+      <w:lvlText w:val="%5."/>
+      <w:lvlJc w:val="left"/>
+      <w:pPr>
+        <w:ind w:left="3600" w:hanging="360"/>
+      </w:pPr>
+    </w:lvl>
+    <w:lvl w:ilvl="5" w:tplc="0409001B" w:tentative="1">
+      <w:start w:val="1"/>
+      <w:numFmt w:val="lowerRoman"/>
+      <w:lvlText w:val="%6."/>
+      <w:lvlJc w:val="right"/>
+      <w:pPr>
+        <w:ind w:left="4320" w:hanging="180"/>
+      </w:pPr>
+    </w:lvl>
+    <w:lvl w:ilvl="6" w:tplc="0409000F" w:tentative="1">
+      <w:start w:val="1"/>
+      <w:numFmt w:val="decimal"/>
+      <w:lvlText w:val="%7."/>
+      <w:lvlJc w:val="left"/>
+      <w:pPr>
+        <w:ind w:left="5040" w:hanging="360"/>
+      </w:pPr>
+    </w:lvl>
+    <w:lvl w:ilvl="7" w:tplc="04090019" w:tentative="1">
+      <w:start w:val="1"/>
+      <w:numFmt w:val="lowerLetter"/>
+      <w:lvlText w:val="%8."/>
+      <w:lvlJc w:val="left"/>
+      <w:pPr>
+        <w:ind w:left="5760" w:hanging="360"/>
+      </w:pPr>
+    </w:lvl>
+    <w:lvl w:ilvl="8" w:tplc="0409001B" w:tentative="1">
+      <w:start w:val="1"/>
+      <w:numFmt w:val="lowerRoman"/>
+      <w:lvlText w:val="%9."/>
+      <w:lvlJc w:val="right"/>
+      <w:pPr>
+        <w:ind w:left="6480" w:hanging="180"/>
+      </w:pPr>
+    </w:lvl>
+  </w:abstractNum>
+  <w:abstractNum w:abstractNumId="6" w15:restartNumberingAfterBreak="0">
+    <w:nsid w:val="4E334EBF"/>
+    <w:multiLevelType w:val="hybridMultilevel"/>
+    <w:tmpl w:val="A03A568C"/>
+    <w:lvl w:ilvl="0" w:tplc="FFFFFFFF">
+      <w:start w:val="1"/>
+      <w:numFmt w:val="decimal"/>
+      <w:lvlText w:val="%1."/>
+      <w:lvlJc w:val="left"/>
+      <w:pPr>
+        <w:ind w:left="720" w:hanging="360"/>
+      </w:pPr>
+    </w:lvl>
+    <w:lvl w:ilvl="1" w:tplc="FFFFFFFF" w:tentative="1">
+      <w:start w:val="1"/>
+      <w:numFmt w:val="lowerLetter"/>
+      <w:lvlText w:val="%2."/>
+      <w:lvlJc w:val="left"/>
+      <w:pPr>
+        <w:ind w:left="1440" w:hanging="360"/>
+      </w:pPr>
+    </w:lvl>
+    <w:lvl w:ilvl="2" w:tplc="FFFFFFFF" w:tentative="1">
+      <w:start w:val="1"/>
+      <w:numFmt w:val="lowerRoman"/>
+      <w:lvlText w:val="%3."/>
+      <w:lvlJc w:val="right"/>
+      <w:pPr>
+        <w:ind w:left="2160" w:hanging="180"/>
+      </w:pPr>
+    </w:lvl>
+    <w:lvl w:ilvl="3" w:tplc="FFFFFFFF" w:tentative="1">
+      <w:start w:val="1"/>
+      <w:numFmt w:val="decimal"/>
+      <w:lvlText w:val="%4."/>
+      <w:lvlJc w:val="left"/>
+      <w:pPr>
+        <w:ind w:left="2880" w:hanging="360"/>
+      </w:pPr>
+    </w:lvl>
+    <w:lvl w:ilvl="4" w:tplc="FFFFFFFF" w:tentative="1">
+      <w:start w:val="1"/>
+      <w:numFmt w:val="lowerLetter"/>
+      <w:lvlText w:val="%5."/>
+      <w:lvlJc w:val="left"/>
+      <w:pPr>
+        <w:ind w:left="3600" w:hanging="360"/>
+      </w:pPr>
+    </w:lvl>
+    <w:lvl w:ilvl="5" w:tplc="FFFFFFFF" w:tentative="1">
+      <w:start w:val="1"/>
+      <w:numFmt w:val="lowerRoman"/>
+      <w:lvlText w:val="%6."/>
+      <w:lvlJc w:val="right"/>
+      <w:pPr>
+        <w:ind w:left="4320" w:hanging="180"/>
+      </w:pPr>
+    </w:lvl>
+    <w:lvl w:ilvl="6" w:tplc="FFFFFFFF" w:tentative="1">
+      <w:start w:val="1"/>
+      <w:numFmt w:val="decimal"/>
+      <w:lvlText w:val="%7."/>
+      <w:lvlJc w:val="left"/>
+      <w:pPr>
+        <w:ind w:left="5040" w:hanging="360"/>
+      </w:pPr>
+    </w:lvl>
+    <w:lvl w:ilvl="7" w:tplc="FFFFFFFF" w:tentative="1">
+      <w:start w:val="1"/>
+      <w:numFmt w:val="lowerLetter"/>
+      <w:lvlText w:val="%8."/>
+      <w:lvlJc w:val="left"/>
+      <w:pPr>
+        <w:ind w:left="5760" w:hanging="360"/>
+      </w:pPr>
+    </w:lvl>
+    <w:lvl w:ilvl="8" w:tplc="FFFFFFFF" w:tentative="1">
+      <w:start w:val="1"/>
+      <w:numFmt w:val="lowerRoman"/>
+      <w:lvlText w:val="%9."/>
+      <w:lvlJc w:val="right"/>
+      <w:pPr>
+        <w:ind w:left="6480" w:hanging="180"/>
+      </w:pPr>
+    </w:lvl>
+  </w:abstractNum>
+  <w:abstractNum w:abstractNumId="7" w15:restartNumberingAfterBreak="0">
+    <w:nsid w:val="66260607"/>
+    <w:multiLevelType w:val="hybridMultilevel"/>
+    <w:tmpl w:val="A03A568C"/>
+    <w:lvl w:ilvl="0" w:tplc="FFFFFFFF">
+      <w:start w:val="1"/>
+      <w:numFmt w:val="decimal"/>
+      <w:lvlText w:val="%1."/>
+      <w:lvlJc w:val="left"/>
+      <w:pPr>
+        <w:ind w:left="720" w:hanging="360"/>
+      </w:pPr>
+    </w:lvl>
+    <w:lvl w:ilvl="1" w:tplc="FFFFFFFF" w:tentative="1">
+      <w:start w:val="1"/>
+      <w:numFmt w:val="lowerLetter"/>
+      <w:lvlText w:val="%2."/>
+      <w:lvlJc w:val="left"/>
+      <w:pPr>
+        <w:ind w:left="1440" w:hanging="360"/>
+      </w:pPr>
+    </w:lvl>
+    <w:lvl w:ilvl="2" w:tplc="FFFFFFFF" w:tentative="1">
+      <w:start w:val="1"/>
+      <w:numFmt w:val="lowerRoman"/>
+      <w:lvlText w:val="%3."/>
+      <w:lvlJc w:val="right"/>
+      <w:pPr>
+        <w:ind w:left="2160" w:hanging="180"/>
+      </w:pPr>
+    </w:lvl>
+    <w:lvl w:ilvl="3" w:tplc="FFFFFFFF" w:tentative="1">
+      <w:start w:val="1"/>
+      <w:numFmt w:val="decimal"/>
+      <w:lvlText w:val="%4."/>
+      <w:lvlJc w:val="left"/>
+      <w:pPr>
+        <w:ind w:left="2880" w:hanging="360"/>
+      </w:pPr>
+    </w:lvl>
+    <w:lvl w:ilvl="4" w:tplc="FFFFFFFF" w:tentative="1">
+      <w:start w:val="1"/>
+      <w:numFmt w:val="lowerLetter"/>
+      <w:lvlText w:val="%5."/>
+      <w:lvlJc w:val="left"/>
+      <w:pPr>
+        <w:ind w:left="3600" w:hanging="360"/>
+      </w:pPr>
+    </w:lvl>
+    <w:lvl w:ilvl="5" w:tplc="FFFFFFFF" w:tentative="1">
+      <w:start w:val="1"/>
+      <w:numFmt w:val="lowerRoman"/>
+      <w:lvlText w:val="%6."/>
+      <w:lvlJc w:val="right"/>
+      <w:pPr>
+        <w:ind w:left="4320" w:hanging="180"/>
+      </w:pPr>
+    </w:lvl>
+    <w:lvl w:ilvl="6" w:tplc="FFFFFFFF" w:tentative="1">
+      <w:start w:val="1"/>
+      <w:numFmt w:val="decimal"/>
+      <w:lvlText w:val="%7."/>
+      <w:lvlJc w:val="left"/>
+      <w:pPr>
+        <w:ind w:left="5040" w:hanging="360"/>
+      </w:pPr>
+    </w:lvl>
+    <w:lvl w:ilvl="7" w:tplc="FFFFFFFF" w:tentative="1">
+      <w:start w:val="1"/>
+      <w:numFmt w:val="lowerLetter"/>
+      <w:lvlText w:val="%8."/>
+      <w:lvlJc w:val="left"/>
+      <w:pPr>
+        <w:ind w:left="5760" w:hanging="360"/>
+      </w:pPr>
+    </w:lvl>
+    <w:lvl w:ilvl="8" w:tplc="FFFFFFFF" w:tentative="1">
+      <w:start w:val="1"/>
+      <w:numFmt w:val="lowerRoman"/>
+      <w:lvlText w:val="%9."/>
+      <w:lvlJc w:val="right"/>
+      <w:pPr>
+        <w:ind w:left="6480" w:hanging="180"/>
+      </w:pPr>
+    </w:lvl>
+  </w:abstractNum>
+  <w:abstractNum w:abstractNumId="8" w15:restartNumberingAfterBreak="0">
     <w:nsid w:val="71C56A82"/>
     <w:multiLevelType w:val="hybridMultilevel"/>
     <w:tmpl w:val="9C04B582"/>
@@ -1195,19 +2723,31 @@
     </w:lvl>
   </w:abstractNum>
   <w:num w:numId="1" w16cid:durableId="1249924779">
-    <w:abstractNumId w:val="1"/>
+    <w:abstractNumId w:val="2"/>
   </w:num>
   <w:num w:numId="2" w16cid:durableId="347680460">
-    <w:abstractNumId w:val="4"/>
+    <w:abstractNumId w:val="8"/>
   </w:num>
   <w:num w:numId="3" w16cid:durableId="507598300">
     <w:abstractNumId w:val="0"/>
   </w:num>
   <w:num w:numId="4" w16cid:durableId="1633049624">
-    <w:abstractNumId w:val="2"/>
+    <w:abstractNumId w:val="3"/>
   </w:num>
   <w:num w:numId="5" w16cid:durableId="1845702038">
-    <w:abstractNumId w:val="3"/>
+    <w:abstractNumId w:val="4"/>
+  </w:num>
+  <w:num w:numId="6" w16cid:durableId="905607304">
+    <w:abstractNumId w:val="5"/>
+  </w:num>
+  <w:num w:numId="7" w16cid:durableId="1386949422">
+    <w:abstractNumId w:val="1"/>
+  </w:num>
+  <w:num w:numId="8" w16cid:durableId="1246379243">
+    <w:abstractNumId w:val="6"/>
+  </w:num>
+  <w:num w:numId="9" w16cid:durableId="1881238912">
+    <w:abstractNumId w:val="7"/>
   </w:num>
 </w:numbering>
 </file>
@@ -2128,6 +3668,93 @@
       <w:spacing w:val="5"/>
     </w:rPr>
   </w:style>
+  <w:style w:type="paragraph" w:styleId="TOCHeading">
+    <w:name w:val="TOC Heading"/>
+    <w:basedOn w:val="Heading1"/>
+    <w:next w:val="Normal"/>
+    <w:uiPriority w:val="39"/>
+    <w:unhideWhenUsed/>
+    <w:qFormat/>
+    <w:rsid w:val="00625A84"/>
+    <w:pPr>
+      <w:spacing w:before="240" w:after="0" w:line="259" w:lineRule="auto"/>
+      <w:outlineLvl w:val="9"/>
+    </w:pPr>
+    <w:rPr>
+      <w:kern w:val="0"/>
+      <w:sz w:val="32"/>
+      <w:szCs w:val="32"/>
+      <w:lang w:eastAsia="en-US"/>
+      <w14:ligatures w14:val="none"/>
+    </w:rPr>
+  </w:style>
+  <w:style w:type="paragraph" w:styleId="TOC1">
+    <w:name w:val="toc 1"/>
+    <w:basedOn w:val="Normal"/>
+    <w:next w:val="Normal"/>
+    <w:autoRedefine/>
+    <w:uiPriority w:val="39"/>
+    <w:unhideWhenUsed/>
+    <w:rsid w:val="00625A84"/>
+    <w:pPr>
+      <w:spacing w:after="100"/>
+    </w:pPr>
+  </w:style>
+  <w:style w:type="character" w:styleId="Hyperlink">
+    <w:name w:val="Hyperlink"/>
+    <w:basedOn w:val="DefaultParagraphFont"/>
+    <w:uiPriority w:val="99"/>
+    <w:unhideWhenUsed/>
+    <w:rsid w:val="00625A84"/>
+    <w:rPr>
+      <w:color w:val="467886" w:themeColor="hyperlink"/>
+      <w:u w:val="single"/>
+    </w:rPr>
+  </w:style>
+  <w:style w:type="paragraph" w:styleId="Header">
+    <w:name w:val="header"/>
+    <w:basedOn w:val="Normal"/>
+    <w:link w:val="HeaderChar"/>
+    <w:uiPriority w:val="99"/>
+    <w:unhideWhenUsed/>
+    <w:rsid w:val="00240335"/>
+    <w:pPr>
+      <w:tabs>
+        <w:tab w:val="center" w:pos="4680"/>
+        <w:tab w:val="right" w:pos="9360"/>
+      </w:tabs>
+      <w:spacing w:after="0" w:line="240" w:lineRule="auto"/>
+    </w:pPr>
+  </w:style>
+  <w:style w:type="character" w:customStyle="1" w:styleId="HeaderChar">
+    <w:name w:val="Header Char"/>
+    <w:basedOn w:val="DefaultParagraphFont"/>
+    <w:link w:val="Header"/>
+    <w:uiPriority w:val="99"/>
+    <w:rsid w:val="00240335"/>
+  </w:style>
+  <w:style w:type="paragraph" w:styleId="Footer">
+    <w:name w:val="footer"/>
+    <w:basedOn w:val="Normal"/>
+    <w:link w:val="FooterChar"/>
+    <w:uiPriority w:val="99"/>
+    <w:unhideWhenUsed/>
+    <w:rsid w:val="00240335"/>
+    <w:pPr>
+      <w:tabs>
+        <w:tab w:val="center" w:pos="4680"/>
+        <w:tab w:val="right" w:pos="9360"/>
+      </w:tabs>
+      <w:spacing w:after="0" w:line="240" w:lineRule="auto"/>
+    </w:pPr>
+  </w:style>
+  <w:style w:type="character" w:customStyle="1" w:styleId="FooterChar">
+    <w:name w:val="Footer Char"/>
+    <w:basedOn w:val="DefaultParagraphFont"/>
+    <w:link w:val="Footer"/>
+    <w:uiPriority w:val="99"/>
+    <w:rsid w:val="00240335"/>
+  </w:style>
 </w:styles>
 </file>
 
@@ -2444,4 +4071,16 @@
     </a:ext>
   </a:extLst>
 </a:theme>
+</file>
+
+<file path=customXml/item1.xml><?xml version="1.0" encoding="utf-8"?>
+<b:Sources xmlns:b="http://schemas.openxmlformats.org/officeDocument/2006/bibliography" xmlns="http://schemas.openxmlformats.org/officeDocument/2006/bibliography" SelectedStyle="\APASixthEditionOfficeOnline.xsl" StyleName="APA" Version="6"/>
+</file>
+
+<file path=customXml/itemProps1.xml><?xml version="1.0" encoding="utf-8"?>
+<ds:datastoreItem xmlns:ds="http://schemas.openxmlformats.org/officeDocument/2006/customXml" ds:itemID="{251E846C-D0CE-479B-A646-D7C8B7551416}">
+  <ds:schemaRefs>
+    <ds:schemaRef ds:uri="http://schemas.openxmlformats.org/officeDocument/2006/bibliography"/>
+  </ds:schemaRefs>
+</ds:datastoreItem>
 </file>
</xml_diff>

<commit_message>
Continue feature testing (feature_engineering.ipynb). Add feature engineering pipeline (feature_engineering.py) and generate processed dataset (processed_data.csv). Updated progress log (progress_report.docx).
</commit_message>
<xml_diff>
--- a/docs/progress_report.docx
+++ b/docs/progress_report.docx
@@ -10,8 +10,6 @@
           <w:rFonts w:ascii="Times New Roman" w:hAnsi="Times New Roman" w:cs="Times New Roman"/>
           <w:b/>
           <w:bCs/>
-          <w:sz w:val="56"/>
-          <w:szCs w:val="56"/>
         </w:rPr>
       </w:pPr>
       <w:r>
@@ -19,14 +17,21 @@
           <w:rFonts w:ascii="Times New Roman" w:hAnsi="Times New Roman" w:cs="Times New Roman"/>
           <w:b/>
           <w:bCs/>
-          <w:sz w:val="56"/>
-          <w:szCs w:val="56"/>
         </w:rPr>
         <w:t>Progress Log</w:t>
       </w:r>
     </w:p>
     <w:sdt>
       <w:sdtPr>
+        <w:rPr>
+          <w:rFonts w:ascii="Times New Roman" w:eastAsiaTheme="minorEastAsia" w:hAnsi="Times New Roman" w:cs="Times New Roman"/>
+          <w:color w:val="auto"/>
+          <w:kern w:val="2"/>
+          <w:sz w:val="24"/>
+          <w:szCs w:val="24"/>
+          <w:lang w:eastAsia="zh-CN"/>
+          <w14:ligatures w14:val="standardContextual"/>
+        </w:rPr>
         <w:id w:val="-291838275"/>
         <w:docPartObj>
           <w:docPartGallery w:val="Table of Contents"/>
@@ -35,16 +40,9 @@
       </w:sdtPr>
       <w:sdtEndPr>
         <w:rPr>
-          <w:rFonts w:asciiTheme="minorHAnsi" w:eastAsiaTheme="minorEastAsia" w:hAnsiTheme="minorHAnsi" w:cstheme="minorBidi"/>
           <w:b/>
           <w:bCs/>
           <w:noProof/>
-          <w:color w:val="auto"/>
-          <w:kern w:val="2"/>
-          <w:sz w:val="24"/>
-          <w:szCs w:val="24"/>
-          <w:lang w:eastAsia="zh-CN"/>
-          <w14:ligatures w14:val="standardContextual"/>
         </w:rPr>
       </w:sdtEndPr>
       <w:sdtContent>
@@ -56,6 +54,8 @@
               <w:b/>
               <w:bCs/>
               <w:color w:val="auto"/>
+              <w:sz w:val="24"/>
+              <w:szCs w:val="24"/>
             </w:rPr>
           </w:pPr>
         </w:p>
@@ -70,15 +70,24 @@
             </w:rPr>
           </w:pPr>
           <w:r>
+            <w:rPr>
+              <w:rFonts w:ascii="Times New Roman" w:hAnsi="Times New Roman" w:cs="Times New Roman"/>
+            </w:rPr>
             <w:fldChar w:fldCharType="begin"/>
           </w:r>
           <w:r>
+            <w:rPr>
+              <w:rFonts w:ascii="Times New Roman" w:hAnsi="Times New Roman" w:cs="Times New Roman"/>
+            </w:rPr>
             <w:instrText xml:space="preserve"> TOC \o "1-3" \h \z \u </w:instrText>
           </w:r>
           <w:r>
+            <w:rPr>
+              <w:rFonts w:ascii="Times New Roman" w:hAnsi="Times New Roman" w:cs="Times New Roman"/>
+            </w:rPr>
             <w:fldChar w:fldCharType="separate"/>
           </w:r>
-          <w:hyperlink w:anchor="_Toc233895565" w:history="1">
+          <w:hyperlink w:anchor="_Toc233982812" w:history="1">
             <w:r>
               <w:rPr>
                 <w:rStyle w:val="Hyperlink"/>
@@ -108,7 +117,7 @@
                 <w:noProof/>
                 <w:webHidden/>
               </w:rPr>
-              <w:instrText xml:space="preserve"> PAGEREF _Toc233895565 \h </w:instrText>
+              <w:instrText xml:space="preserve"> PAGEREF _Toc233982812 \h </w:instrText>
             </w:r>
             <w:r>
               <w:rPr>
@@ -149,7 +158,7 @@
               <w:noProof/>
             </w:rPr>
           </w:pPr>
-          <w:hyperlink w:anchor="_Toc233895566" w:history="1">
+          <w:hyperlink w:anchor="_Toc233982813" w:history="1">
             <w:r>
               <w:rPr>
                 <w:rStyle w:val="Hyperlink"/>
@@ -179,7 +188,7 @@
                 <w:noProof/>
                 <w:webHidden/>
               </w:rPr>
-              <w:instrText xml:space="preserve"> PAGEREF _Toc233895566 \h </w:instrText>
+              <w:instrText xml:space="preserve"> PAGEREF _Toc233982813 \h </w:instrText>
             </w:r>
             <w:r>
               <w:rPr>
@@ -211,8 +220,156 @@
           </w:hyperlink>
         </w:p>
         <w:p>
+          <w:pPr>
+            <w:pStyle w:val="TOC1"/>
+            <w:tabs>
+              <w:tab w:val="right" w:leader="dot" w:pos="9350"/>
+            </w:tabs>
+            <w:rPr>
+              <w:noProof/>
+            </w:rPr>
+          </w:pPr>
+          <w:hyperlink w:anchor="_Toc233982814" w:history="1">
+            <w:r>
+              <w:rPr>
+                <w:rStyle w:val="Hyperlink"/>
+                <w:rFonts w:ascii="Times New Roman" w:hAnsi="Times New Roman" w:cs="Times New Roman"/>
+                <w:b/>
+                <w:bCs/>
+                <w:noProof/>
+              </w:rPr>
+              <w:t>02/07/2026 – Feature Engineering (Basics)</w:t>
+            </w:r>
+            <w:r>
+              <w:rPr>
+                <w:noProof/>
+                <w:webHidden/>
+              </w:rPr>
+              <w:tab/>
+            </w:r>
+            <w:r>
+              <w:rPr>
+                <w:noProof/>
+                <w:webHidden/>
+              </w:rPr>
+              <w:fldChar w:fldCharType="begin"/>
+            </w:r>
+            <w:r>
+              <w:rPr>
+                <w:noProof/>
+                <w:webHidden/>
+              </w:rPr>
+              <w:instrText xml:space="preserve"> PAGEREF _Toc233982814 \h </w:instrText>
+            </w:r>
+            <w:r>
+              <w:rPr>
+                <w:noProof/>
+                <w:webHidden/>
+              </w:rPr>
+            </w:r>
+            <w:r>
+              <w:rPr>
+                <w:noProof/>
+                <w:webHidden/>
+              </w:rPr>
+              <w:fldChar w:fldCharType="separate"/>
+            </w:r>
+            <w:r>
+              <w:rPr>
+                <w:noProof/>
+                <w:webHidden/>
+              </w:rPr>
+              <w:t>3</w:t>
+            </w:r>
+            <w:r>
+              <w:rPr>
+                <w:noProof/>
+                <w:webHidden/>
+              </w:rPr>
+              <w:fldChar w:fldCharType="end"/>
+            </w:r>
+          </w:hyperlink>
+        </w:p>
+        <w:p>
+          <w:pPr>
+            <w:pStyle w:val="TOC1"/>
+            <w:tabs>
+              <w:tab w:val="right" w:leader="dot" w:pos="9350"/>
+            </w:tabs>
+            <w:rPr>
+              <w:noProof/>
+            </w:rPr>
+          </w:pPr>
+          <w:hyperlink w:anchor="_Toc233982815" w:history="1">
+            <w:r>
+              <w:rPr>
+                <w:rStyle w:val="Hyperlink"/>
+                <w:rFonts w:ascii="Times New Roman" w:hAnsi="Times New Roman" w:cs="Times New Roman"/>
+                <w:b/>
+                <w:bCs/>
+                <w:noProof/>
+              </w:rPr>
+              <w:t>03/07/2026 – Feature Engineering (Technical Indicators)</w:t>
+            </w:r>
+            <w:r>
+              <w:rPr>
+                <w:noProof/>
+                <w:webHidden/>
+              </w:rPr>
+              <w:tab/>
+            </w:r>
+            <w:r>
+              <w:rPr>
+                <w:noProof/>
+                <w:webHidden/>
+              </w:rPr>
+              <w:fldChar w:fldCharType="begin"/>
+            </w:r>
+            <w:r>
+              <w:rPr>
+                <w:noProof/>
+                <w:webHidden/>
+              </w:rPr>
+              <w:instrText xml:space="preserve"> PAGEREF _Toc233982815 \h </w:instrText>
+            </w:r>
+            <w:r>
+              <w:rPr>
+                <w:noProof/>
+                <w:webHidden/>
+              </w:rPr>
+            </w:r>
+            <w:r>
+              <w:rPr>
+                <w:noProof/>
+                <w:webHidden/>
+              </w:rPr>
+              <w:fldChar w:fldCharType="separate"/>
+            </w:r>
+            <w:r>
+              <w:rPr>
+                <w:noProof/>
+                <w:webHidden/>
+              </w:rPr>
+              <w:t>4</w:t>
+            </w:r>
+            <w:r>
+              <w:rPr>
+                <w:noProof/>
+                <w:webHidden/>
+              </w:rPr>
+              <w:fldChar w:fldCharType="end"/>
+            </w:r>
+          </w:hyperlink>
+        </w:p>
+        <w:p>
+          <w:pPr>
+            <w:rPr>
+              <w:rFonts w:ascii="Times New Roman" w:hAnsi="Times New Roman" w:cs="Times New Roman"/>
+            </w:rPr>
+          </w:pPr>
           <w:r>
             <w:rPr>
+              <w:rFonts w:ascii="Times New Roman" w:hAnsi="Times New Roman" w:cs="Times New Roman"/>
               <w:b/>
               <w:bCs/>
               <w:noProof/>
@@ -265,7 +422,6 @@
         </w:rPr>
         <w:br w:type="page"/>
       </w:r>
-      <w:bookmarkStart w:id="0" w:name="_Toc233895565"/>
     </w:p>
     <w:p>
       <w:pPr>
@@ -279,6 +435,7 @@
           <w:szCs w:val="24"/>
         </w:rPr>
       </w:pPr>
+      <w:bookmarkStart w:id="0" w:name="_Toc233982812"/>
       <w:r>
         <w:rPr>
           <w:rFonts w:ascii="Times New Roman" w:hAnsi="Times New Roman" w:cs="Times New Roman"/>
@@ -345,13 +502,7 @@
         <w:rPr>
           <w:rFonts w:ascii="Times New Roman" w:hAnsi="Times New Roman" w:cs="Times New Roman"/>
         </w:rPr>
-        <w:t>Created project folder structure</w:t>
-      </w:r>
-      <w:r>
-        <w:rPr>
-          <w:rFonts w:ascii="Times New Roman" w:hAnsi="Times New Roman" w:cs="Times New Roman"/>
-        </w:rPr>
-        <w:t>.</w:t>
+        <w:t>Created project folder structure.</w:t>
       </w:r>
     </w:p>
     <w:p>
@@ -370,13 +521,7 @@
         <w:rPr>
           <w:rFonts w:ascii="Times New Roman" w:hAnsi="Times New Roman" w:cs="Times New Roman"/>
         </w:rPr>
-        <w:t>Created config.py to centralize project settings</w:t>
-      </w:r>
-      <w:r>
-        <w:rPr>
-          <w:rFonts w:ascii="Times New Roman" w:hAnsi="Times New Roman" w:cs="Times New Roman"/>
-        </w:rPr>
-        <w:t>.</w:t>
+        <w:t>Created config.py to centralize project settings.</w:t>
       </w:r>
     </w:p>
     <w:p>
@@ -428,13 +573,7 @@
         <w:rPr>
           <w:rFonts w:ascii="Times New Roman" w:hAnsi="Times New Roman" w:cs="Times New Roman"/>
         </w:rPr>
-        <w:t>Downloaded historical data for 12 banking stocks</w:t>
-      </w:r>
-      <w:r>
-        <w:rPr>
-          <w:rFonts w:ascii="Times New Roman" w:hAnsi="Times New Roman" w:cs="Times New Roman"/>
-        </w:rPr>
-        <w:t>.</w:t>
+        <w:t>Downloaded historical data for 12 banking stocks.</w:t>
       </w:r>
     </w:p>
     <w:p>
@@ -453,13 +592,7 @@
         <w:rPr>
           <w:rFonts w:ascii="Times New Roman" w:hAnsi="Times New Roman" w:cs="Times New Roman"/>
         </w:rPr>
-        <w:t>Saved individual CSV files and combined dataset</w:t>
-      </w:r>
-      <w:r>
-        <w:rPr>
-          <w:rFonts w:ascii="Times New Roman" w:hAnsi="Times New Roman" w:cs="Times New Roman"/>
-        </w:rPr>
-        <w:t>.</w:t>
+        <w:t>Saved individual CSV files and combined dataset.</w:t>
       </w:r>
     </w:p>
     <w:p>
@@ -478,13 +611,7 @@
         <w:rPr>
           <w:rFonts w:ascii="Times New Roman" w:hAnsi="Times New Roman" w:cs="Times New Roman"/>
         </w:rPr>
-        <w:t>Added logging</w:t>
-      </w:r>
-      <w:r>
-        <w:rPr>
-          <w:rFonts w:ascii="Times New Roman" w:hAnsi="Times New Roman" w:cs="Times New Roman"/>
-        </w:rPr>
-        <w:t>.</w:t>
+        <w:t>Added logging.</w:t>
       </w:r>
     </w:p>
     <w:p>
@@ -503,13 +630,7 @@
         <w:rPr>
           <w:rFonts w:ascii="Times New Roman" w:hAnsi="Times New Roman" w:cs="Times New Roman"/>
         </w:rPr>
-        <w:t>Added verification function</w:t>
-      </w:r>
-      <w:r>
-        <w:rPr>
-          <w:rFonts w:ascii="Times New Roman" w:hAnsi="Times New Roman" w:cs="Times New Roman"/>
-        </w:rPr>
-        <w:t>.</w:t>
+        <w:t>Added verification function.</w:t>
       </w:r>
     </w:p>
     <w:p>
@@ -557,13 +678,7 @@
         <w:rPr>
           <w:rFonts w:ascii="Times New Roman" w:hAnsi="Times New Roman" w:cs="Times New Roman"/>
         </w:rPr>
-        <w:t>CSV files contained an extra first row with ticker symbols</w:t>
-      </w:r>
-      <w:r>
-        <w:rPr>
-          <w:rFonts w:ascii="Times New Roman" w:hAnsi="Times New Roman" w:cs="Times New Roman"/>
-        </w:rPr>
-        <w:t xml:space="preserve"> which </w:t>
+        <w:t xml:space="preserve">CSV files contained an extra first row with ticker symbols which </w:t>
       </w:r>
       <w:r>
         <w:rPr>
@@ -575,25 +690,7 @@
         <w:rPr>
           <w:rFonts w:ascii="Times New Roman" w:hAnsi="Times New Roman" w:cs="Times New Roman"/>
         </w:rPr>
-        <w:t xml:space="preserve"> by</w:t>
-      </w:r>
-      <w:r>
-        <w:rPr>
-          <w:rFonts w:ascii="Times New Roman" w:hAnsi="Times New Roman" w:cs="Times New Roman"/>
-        </w:rPr>
-        <w:t xml:space="preserve"> </w:t>
-      </w:r>
-      <w:r>
-        <w:rPr>
-          <w:rFonts w:ascii="Times New Roman" w:hAnsi="Times New Roman" w:cs="Times New Roman"/>
-        </w:rPr>
-        <w:t>n</w:t>
-      </w:r>
-      <w:r>
-        <w:rPr>
-          <w:rFonts w:ascii="Times New Roman" w:hAnsi="Times New Roman" w:cs="Times New Roman"/>
-        </w:rPr>
-        <w:t xml:space="preserve">ewer versions of </w:t>
+        <w:t xml:space="preserve"> by newer versions of </w:t>
       </w:r>
       <w:proofErr w:type="spellStart"/>
       <w:r>
@@ -621,13 +718,7 @@
         <w:rPr>
           <w:rFonts w:ascii="Times New Roman" w:hAnsi="Times New Roman" w:cs="Times New Roman"/>
         </w:rPr>
-        <w:t xml:space="preserve"> columns.</w:t>
-      </w:r>
-      <w:r>
-        <w:rPr>
-          <w:rFonts w:ascii="Times New Roman" w:hAnsi="Times New Roman" w:cs="Times New Roman"/>
-        </w:rPr>
-        <w:t xml:space="preserve"> </w:t>
+        <w:t xml:space="preserve"> columns. </w:t>
       </w:r>
     </w:p>
     <w:p>
@@ -646,25 +737,7 @@
         <w:rPr>
           <w:rFonts w:ascii="Times New Roman" w:hAnsi="Times New Roman" w:cs="Times New Roman"/>
         </w:rPr>
-        <w:t>This problem has been solved by f</w:t>
-      </w:r>
-      <w:r>
-        <w:rPr>
-          <w:rFonts w:ascii="Times New Roman" w:hAnsi="Times New Roman" w:cs="Times New Roman"/>
-        </w:rPr>
-        <w:t>latten</w:t>
-      </w:r>
-      <w:r>
-        <w:rPr>
-          <w:rFonts w:ascii="Times New Roman" w:hAnsi="Times New Roman" w:cs="Times New Roman"/>
-        </w:rPr>
-        <w:t>ing the</w:t>
-      </w:r>
-      <w:r>
-        <w:rPr>
-          <w:rFonts w:ascii="Times New Roman" w:hAnsi="Times New Roman" w:cs="Times New Roman"/>
-        </w:rPr>
-        <w:t xml:space="preserve"> </w:t>
+        <w:t xml:space="preserve">This problem has been solved by flattening the </w:t>
       </w:r>
       <w:proofErr w:type="spellStart"/>
       <w:r>
@@ -678,13 +751,7 @@
         <w:rPr>
           <w:rFonts w:ascii="Times New Roman" w:hAnsi="Times New Roman" w:cs="Times New Roman"/>
         </w:rPr>
-        <w:t xml:space="preserve"> columns using: </w:t>
-      </w:r>
-      <w:r>
-        <w:rPr>
-          <w:rFonts w:ascii="Times New Roman" w:hAnsi="Times New Roman" w:cs="Times New Roman"/>
-        </w:rPr>
-        <w:t>‘</w:t>
+        <w:t xml:space="preserve"> columns using: ‘</w:t>
       </w:r>
       <w:proofErr w:type="spellStart"/>
       <w:r>
@@ -712,13 +779,7 @@
         <w:rPr>
           <w:rFonts w:ascii="Times New Roman" w:hAnsi="Times New Roman" w:cs="Times New Roman"/>
         </w:rPr>
-        <w:t>(0)</w:t>
-      </w:r>
-      <w:r>
-        <w:rPr>
-          <w:rFonts w:ascii="Times New Roman" w:hAnsi="Times New Roman" w:cs="Times New Roman"/>
-        </w:rPr>
-        <w:t>’</w:t>
+        <w:t>(0)’</w:t>
       </w:r>
     </w:p>
     <w:p>
@@ -747,19 +808,21 @@
         <w:rPr>
           <w:rFonts w:ascii="Times New Roman" w:hAnsi="Times New Roman" w:cs="Times New Roman"/>
         </w:rPr>
-        <w:t>CSV files were not updating after rerunning.</w:t>
-      </w:r>
-      <w:r>
-        <w:rPr>
-          <w:rFonts w:ascii="Times New Roman" w:hAnsi="Times New Roman" w:cs="Times New Roman"/>
-        </w:rPr>
-        <w:t xml:space="preserve"> This is caused by the p</w:t>
-      </w:r>
-      <w:r>
-        <w:rPr>
-          <w:rFonts w:ascii="Times New Roman" w:hAnsi="Times New Roman" w:cs="Times New Roman"/>
-        </w:rPr>
-        <w:t>roject being executed from a different working directory.</w:t>
+        <w:t xml:space="preserve">CSV files were not </w:t>
+      </w:r>
+      <w:proofErr w:type="gramStart"/>
+      <w:r>
+        <w:rPr>
+          <w:rFonts w:ascii="Times New Roman" w:hAnsi="Times New Roman" w:cs="Times New Roman"/>
+        </w:rPr>
+        <w:t>updating</w:t>
+      </w:r>
+      <w:proofErr w:type="gramEnd"/>
+      <w:r>
+        <w:rPr>
+          <w:rFonts w:ascii="Times New Roman" w:hAnsi="Times New Roman" w:cs="Times New Roman"/>
+        </w:rPr>
+        <w:t xml:space="preserve"> after rerunning. This is caused by the project being executed from a different working directory.</w:t>
       </w:r>
     </w:p>
     <w:p>
@@ -778,25 +841,7 @@
         <w:rPr>
           <w:rFonts w:ascii="Times New Roman" w:hAnsi="Times New Roman" w:cs="Times New Roman"/>
         </w:rPr>
-        <w:t>This is solved by u</w:t>
-      </w:r>
-      <w:r>
-        <w:rPr>
-          <w:rFonts w:ascii="Times New Roman" w:hAnsi="Times New Roman" w:cs="Times New Roman"/>
-        </w:rPr>
-        <w:t>pdat</w:t>
-      </w:r>
-      <w:r>
-        <w:rPr>
-          <w:rFonts w:ascii="Times New Roman" w:hAnsi="Times New Roman" w:cs="Times New Roman"/>
-        </w:rPr>
-        <w:t>ing</w:t>
-      </w:r>
-      <w:r>
-        <w:rPr>
-          <w:rFonts w:ascii="Times New Roman" w:hAnsi="Times New Roman" w:cs="Times New Roman"/>
-        </w:rPr>
-        <w:t xml:space="preserve"> config.py to use </w:t>
+        <w:t xml:space="preserve">This is solved by updating config.py to use </w:t>
       </w:r>
       <w:proofErr w:type="spellStart"/>
       <w:r>
@@ -810,13 +855,7 @@
         <w:rPr>
           <w:rFonts w:ascii="Times New Roman" w:hAnsi="Times New Roman" w:cs="Times New Roman"/>
         </w:rPr>
-        <w:t>:</w:t>
-      </w:r>
-      <w:r>
-        <w:rPr>
-          <w:rFonts w:ascii="Times New Roman" w:hAnsi="Times New Roman" w:cs="Times New Roman"/>
-        </w:rPr>
-        <w:t xml:space="preserve"> </w:t>
+        <w:t xml:space="preserve">: </w:t>
       </w:r>
     </w:p>
     <w:p>
@@ -832,13 +871,7 @@
         <w:rPr>
           <w:rFonts w:ascii="Times New Roman" w:hAnsi="Times New Roman" w:cs="Times New Roman"/>
         </w:rPr>
-        <w:t>‘</w:t>
-      </w:r>
-      <w:r>
-        <w:rPr>
-          <w:rFonts w:ascii="Times New Roman" w:hAnsi="Times New Roman" w:cs="Times New Roman"/>
-        </w:rPr>
-        <w:t>BASE_DIR = Path(__file__).resolve().</w:t>
+        <w:t>‘BASE_DIR = Path(__file__).resolve().</w:t>
       </w:r>
       <w:proofErr w:type="spellStart"/>
       <w:r>
@@ -876,13 +909,7 @@
         <w:rPr>
           <w:rFonts w:ascii="Times New Roman" w:hAnsi="Times New Roman" w:cs="Times New Roman"/>
         </w:rPr>
-        <w:t>Next Tasks</w:t>
-      </w:r>
-      <w:r>
-        <w:rPr>
-          <w:rFonts w:ascii="Times New Roman" w:hAnsi="Times New Roman" w:cs="Times New Roman"/>
-        </w:rPr>
-        <w:t>:</w:t>
+        <w:t>Next Tasks:</w:t>
       </w:r>
     </w:p>
     <w:p>
@@ -961,7 +988,7 @@
           <w:szCs w:val="24"/>
         </w:rPr>
       </w:pPr>
-      <w:bookmarkStart w:id="1" w:name="_Toc233895566"/>
+      <w:bookmarkStart w:id="1" w:name="_Toc233982813"/>
       <w:r>
         <w:rPr>
           <w:rFonts w:ascii="Times New Roman" w:hAnsi="Times New Roman" w:cs="Times New Roman"/>
@@ -983,33 +1010,17 @@
           <w:sz w:val="24"/>
           <w:szCs w:val="24"/>
         </w:rPr>
-        <w:t xml:space="preserve"> </w:t>
-      </w:r>
-      <w:r>
-        <w:rPr>
-          <w:rFonts w:ascii="Times New Roman" w:hAnsi="Times New Roman" w:cs="Times New Roman"/>
-          <w:b/>
-          <w:bCs/>
-          <w:color w:val="auto"/>
-          <w:sz w:val="24"/>
-          <w:szCs w:val="24"/>
-        </w:rPr>
-        <w:t xml:space="preserve">– </w:t>
-      </w:r>
-      <w:r>
-        <w:rPr>
-          <w:rFonts w:ascii="Times New Roman" w:hAnsi="Times New Roman" w:cs="Times New Roman"/>
-          <w:b/>
-          <w:bCs/>
-          <w:color w:val="auto"/>
-          <w:sz w:val="24"/>
-          <w:szCs w:val="24"/>
-        </w:rPr>
-        <w:t>Exploratory Data Analysis (EDA)</w:t>
+        <w:t xml:space="preserve"> – Exploratory Data Analysis (EDA)</w:t>
       </w:r>
       <w:bookmarkEnd w:id="1"/>
     </w:p>
-    <w:p/>
+    <w:p>
+      <w:pPr>
+        <w:rPr>
+          <w:rFonts w:ascii="Times New Roman" w:hAnsi="Times New Roman" w:cs="Times New Roman"/>
+        </w:rPr>
+      </w:pPr>
+    </w:p>
     <w:p>
       <w:pPr>
         <w:spacing w:line="276" w:lineRule="auto"/>
@@ -1082,13 +1093,7 @@
         <w:rPr>
           <w:rFonts w:ascii="Times New Roman" w:hAnsi="Times New Roman" w:cs="Times New Roman"/>
         </w:rPr>
-        <w:t xml:space="preserve"> and selected representative stocks </w:t>
-      </w:r>
-      <w:r>
-        <w:rPr>
-          <w:rFonts w:ascii="Times New Roman" w:hAnsi="Times New Roman" w:cs="Times New Roman"/>
-        </w:rPr>
-        <w:t>(Maybank, CIMB, DBS)</w:t>
+        <w:t xml:space="preserve"> and selected representative stocks (Maybank, CIMB, DBS)</w:t>
       </w:r>
       <w:r>
         <w:rPr>
@@ -1113,37 +1118,7 @@
         <w:rPr>
           <w:rFonts w:ascii="Times New Roman" w:hAnsi="Times New Roman" w:cs="Times New Roman"/>
         </w:rPr>
-        <w:t>Checked for null and duplicates, v</w:t>
-      </w:r>
-      <w:r>
-        <w:rPr>
-          <w:rFonts w:ascii="Times New Roman" w:hAnsi="Times New Roman" w:cs="Times New Roman"/>
-        </w:rPr>
-        <w:t xml:space="preserve">erified dataset structure using </w:t>
-      </w:r>
-      <w:r>
-        <w:rPr>
-          <w:rFonts w:ascii="Times New Roman" w:hAnsi="Times New Roman" w:cs="Times New Roman"/>
-        </w:rPr>
-        <w:t>.</w:t>
-      </w:r>
-      <w:r>
-        <w:rPr>
-          <w:rFonts w:ascii="Times New Roman" w:hAnsi="Times New Roman" w:cs="Times New Roman"/>
-        </w:rPr>
-        <w:t xml:space="preserve">info() and </w:t>
-      </w:r>
-      <w:r>
-        <w:rPr>
-          <w:rFonts w:ascii="Times New Roman" w:hAnsi="Times New Roman" w:cs="Times New Roman"/>
-        </w:rPr>
-        <w:t>.</w:t>
-      </w:r>
-      <w:r>
-        <w:rPr>
-          <w:rFonts w:ascii="Times New Roman" w:hAnsi="Times New Roman" w:cs="Times New Roman"/>
-        </w:rPr>
-        <w:t>describe() functions.</w:t>
+        <w:t>Checked for null and duplicates, verified dataset structure using .info() and .describe() functions.</w:t>
       </w:r>
     </w:p>
     <w:p>
@@ -1174,13 +1149,7 @@
         <w:rPr>
           <w:rFonts w:ascii="Times New Roman" w:hAnsi="Times New Roman" w:cs="Times New Roman"/>
         </w:rPr>
-        <w:t xml:space="preserve"> the statistics </w:t>
-      </w:r>
-      <w:r>
-        <w:rPr>
-          <w:rFonts w:ascii="Times New Roman" w:hAnsi="Times New Roman" w:cs="Times New Roman"/>
-        </w:rPr>
-        <w:t>across representative stocks (mean, standard deviation, min, max).</w:t>
+        <w:t xml:space="preserve"> the statistics across representative stocks (mean, standard deviation, min, max).</w:t>
       </w:r>
     </w:p>
     <w:p>
@@ -1229,13 +1198,7 @@
         <w:rPr>
           <w:rFonts w:ascii="Times New Roman" w:hAnsi="Times New Roman" w:cs="Times New Roman"/>
         </w:rPr>
-        <w:t xml:space="preserve"> </w:t>
-      </w:r>
-      <w:r>
-        <w:rPr>
-          <w:rFonts w:ascii="Times New Roman" w:hAnsi="Times New Roman" w:cs="Times New Roman"/>
-        </w:rPr>
-        <w:t xml:space="preserve">comparison was not </w:t>
+        <w:t xml:space="preserve"> comparison was not </w:t>
       </w:r>
       <w:r>
         <w:rPr>
@@ -1247,31 +1210,7 @@
         <w:rPr>
           <w:rFonts w:ascii="Times New Roman" w:hAnsi="Times New Roman" w:cs="Times New Roman"/>
         </w:rPr>
-        <w:t xml:space="preserve"> meaningful </w:t>
-      </w:r>
-      <w:r>
-        <w:rPr>
-          <w:rFonts w:ascii="Times New Roman" w:hAnsi="Times New Roman" w:cs="Times New Roman"/>
-        </w:rPr>
-        <w:t>because of the</w:t>
-      </w:r>
-      <w:r>
-        <w:rPr>
-          <w:rFonts w:ascii="Times New Roman" w:hAnsi="Times New Roman" w:cs="Times New Roman"/>
-        </w:rPr>
-        <w:t xml:space="preserve"> significant differences in price scales across </w:t>
-      </w:r>
-      <w:r>
-        <w:rPr>
-          <w:rFonts w:ascii="Times New Roman" w:hAnsi="Times New Roman" w:cs="Times New Roman"/>
-        </w:rPr>
-        <w:t xml:space="preserve">the </w:t>
-      </w:r>
-      <w:r>
-        <w:rPr>
-          <w:rFonts w:ascii="Times New Roman" w:hAnsi="Times New Roman" w:cs="Times New Roman"/>
-        </w:rPr>
-        <w:t>stocks.</w:t>
+        <w:t xml:space="preserve"> meaningful because of the significant differences in price scales across the stocks.</w:t>
       </w:r>
     </w:p>
     <w:p>
@@ -1296,19 +1235,7 @@
         <w:rPr>
           <w:rFonts w:ascii="Times New Roman" w:hAnsi="Times New Roman" w:cs="Times New Roman"/>
         </w:rPr>
-        <w:t xml:space="preserve"> stock prices using first available closing price as base value</w:t>
-      </w:r>
-      <w:r>
-        <w:rPr>
-          <w:rFonts w:ascii="Times New Roman" w:hAnsi="Times New Roman" w:cs="Times New Roman"/>
-        </w:rPr>
-        <w:t xml:space="preserve"> (close price / first close price)</w:t>
-      </w:r>
-      <w:r>
-        <w:rPr>
-          <w:rFonts w:ascii="Times New Roman" w:hAnsi="Times New Roman" w:cs="Times New Roman"/>
-        </w:rPr>
-        <w:t>.</w:t>
+        <w:t xml:space="preserve"> stock prices using first available closing price as base value (close price / first close price).</w:t>
       </w:r>
     </w:p>
     <w:p>
@@ -1449,13 +1376,7 @@
         <w:rPr>
           <w:rFonts w:ascii="Times New Roman" w:hAnsi="Times New Roman" w:cs="Times New Roman"/>
         </w:rPr>
-        <w:t>(interval = 6)</w:t>
-      </w:r>
-      <w:r>
-        <w:rPr>
-          <w:rFonts w:ascii="Times New Roman" w:hAnsi="Times New Roman" w:cs="Times New Roman"/>
-        </w:rPr>
-        <w:t>’, only label once per 6 months.</w:t>
+        <w:t>(interval = 6)’, only label once per 6 months.</w:t>
       </w:r>
     </w:p>
     <w:p>
@@ -1717,6 +1638,1299 @@
           <w:rFonts w:ascii="Times New Roman" w:hAnsi="Times New Roman" w:cs="Times New Roman"/>
         </w:rPr>
         <w:t>.</w:t>
+      </w:r>
+    </w:p>
+    <w:p>
+      <w:pPr>
+        <w:rPr>
+          <w:rFonts w:ascii="Times New Roman" w:hAnsi="Times New Roman" w:cs="Times New Roman"/>
+        </w:rPr>
+      </w:pPr>
+      <w:r>
+        <w:rPr>
+          <w:rFonts w:ascii="Times New Roman" w:hAnsi="Times New Roman" w:cs="Times New Roman"/>
+        </w:rPr>
+        <w:br w:type="page"/>
+      </w:r>
+    </w:p>
+    <w:p>
+      <w:pPr>
+        <w:pStyle w:val="Heading1"/>
+        <w:rPr>
+          <w:rFonts w:ascii="Times New Roman" w:hAnsi="Times New Roman" w:cs="Times New Roman"/>
+          <w:b/>
+          <w:bCs/>
+          <w:color w:val="auto"/>
+          <w:sz w:val="24"/>
+          <w:szCs w:val="24"/>
+        </w:rPr>
+      </w:pPr>
+      <w:bookmarkStart w:id="2" w:name="_Toc233982814"/>
+      <w:r>
+        <w:rPr>
+          <w:rFonts w:ascii="Times New Roman" w:hAnsi="Times New Roman" w:cs="Times New Roman"/>
+          <w:b/>
+          <w:bCs/>
+          <w:color w:val="auto"/>
+          <w:sz w:val="24"/>
+          <w:szCs w:val="24"/>
+        </w:rPr>
+        <w:lastRenderedPageBreak/>
+        <w:t xml:space="preserve">02/07/2026 – </w:t>
+      </w:r>
+      <w:r>
+        <w:rPr>
+          <w:rFonts w:ascii="Times New Roman" w:hAnsi="Times New Roman" w:cs="Times New Roman"/>
+          <w:b/>
+          <w:bCs/>
+          <w:color w:val="auto"/>
+          <w:sz w:val="24"/>
+          <w:szCs w:val="24"/>
+        </w:rPr>
+        <w:t>Feature Engineering (Basics)</w:t>
+      </w:r>
+      <w:bookmarkEnd w:id="2"/>
+    </w:p>
+    <w:p>
+      <w:pPr>
+        <w:rPr>
+          <w:rFonts w:ascii="Times New Roman" w:hAnsi="Times New Roman" w:cs="Times New Roman"/>
+        </w:rPr>
+      </w:pPr>
+    </w:p>
+    <w:p>
+      <w:pPr>
+        <w:rPr>
+          <w:rFonts w:ascii="Times New Roman" w:hAnsi="Times New Roman" w:cs="Times New Roman"/>
+          <w:b/>
+          <w:bCs/>
+        </w:rPr>
+      </w:pPr>
+      <w:r>
+        <w:rPr>
+          <w:rFonts w:ascii="Times New Roman" w:hAnsi="Times New Roman" w:cs="Times New Roman"/>
+          <w:b/>
+          <w:bCs/>
+        </w:rPr>
+        <w:t>Progress:</w:t>
+      </w:r>
+    </w:p>
+    <w:p>
+      <w:pPr>
+        <w:pStyle w:val="ListParagraph"/>
+        <w:numPr>
+          <w:ilvl w:val="0"/>
+          <w:numId w:val="14"/>
+        </w:numPr>
+        <w:rPr>
+          <w:rFonts w:ascii="Times New Roman" w:hAnsi="Times New Roman" w:cs="Times New Roman"/>
+        </w:rPr>
+      </w:pPr>
+      <w:r>
+        <w:rPr>
+          <w:rFonts w:ascii="Times New Roman" w:hAnsi="Times New Roman" w:cs="Times New Roman"/>
+        </w:rPr>
+        <w:t>Performed feature engineering on the combined stock dataset.</w:t>
+      </w:r>
+    </w:p>
+    <w:p>
+      <w:pPr>
+        <w:pStyle w:val="ListParagraph"/>
+        <w:numPr>
+          <w:ilvl w:val="0"/>
+          <w:numId w:val="14"/>
+        </w:numPr>
+        <w:rPr>
+          <w:rFonts w:ascii="Times New Roman" w:hAnsi="Times New Roman" w:cs="Times New Roman"/>
+        </w:rPr>
+      </w:pPr>
+      <w:r>
+        <w:rPr>
+          <w:rFonts w:ascii="Times New Roman" w:hAnsi="Times New Roman" w:cs="Times New Roman"/>
+        </w:rPr>
+        <w:t>Created basic features including:</w:t>
+      </w:r>
+    </w:p>
+    <w:p>
+      <w:pPr>
+        <w:pStyle w:val="ListParagraph"/>
+        <w:numPr>
+          <w:ilvl w:val="1"/>
+          <w:numId w:val="14"/>
+        </w:numPr>
+        <w:rPr>
+          <w:rFonts w:ascii="Times New Roman" w:hAnsi="Times New Roman" w:cs="Times New Roman"/>
+        </w:rPr>
+      </w:pPr>
+      <w:r>
+        <w:rPr>
+          <w:rFonts w:ascii="Times New Roman" w:hAnsi="Times New Roman" w:cs="Times New Roman"/>
+        </w:rPr>
+        <w:t>Returns (daily percentage change)</w:t>
+      </w:r>
+    </w:p>
+    <w:p>
+      <w:pPr>
+        <w:pStyle w:val="ListParagraph"/>
+        <w:numPr>
+          <w:ilvl w:val="1"/>
+          <w:numId w:val="14"/>
+        </w:numPr>
+        <w:rPr>
+          <w:rFonts w:ascii="Times New Roman" w:hAnsi="Times New Roman" w:cs="Times New Roman"/>
+        </w:rPr>
+      </w:pPr>
+      <w:r>
+        <w:rPr>
+          <w:rFonts w:ascii="Times New Roman" w:hAnsi="Times New Roman" w:cs="Times New Roman"/>
+        </w:rPr>
+        <w:t>Simple Moving Averages (SMA 20, SMA 50)</w:t>
+      </w:r>
+    </w:p>
+    <w:p>
+      <w:pPr>
+        <w:pStyle w:val="ListParagraph"/>
+        <w:numPr>
+          <w:ilvl w:val="1"/>
+          <w:numId w:val="14"/>
+        </w:numPr>
+        <w:rPr>
+          <w:rFonts w:ascii="Times New Roman" w:hAnsi="Times New Roman" w:cs="Times New Roman"/>
+        </w:rPr>
+      </w:pPr>
+      <w:r>
+        <w:rPr>
+          <w:rFonts w:ascii="Times New Roman" w:hAnsi="Times New Roman" w:cs="Times New Roman"/>
+        </w:rPr>
+        <w:t>Exponential Moving Averages (EMA 20, EMA 50)</w:t>
+      </w:r>
+    </w:p>
+    <w:p>
+      <w:pPr>
+        <w:pStyle w:val="ListParagraph"/>
+        <w:numPr>
+          <w:ilvl w:val="1"/>
+          <w:numId w:val="14"/>
+        </w:numPr>
+        <w:rPr>
+          <w:rFonts w:ascii="Times New Roman" w:hAnsi="Times New Roman" w:cs="Times New Roman"/>
+        </w:rPr>
+      </w:pPr>
+      <w:r>
+        <w:rPr>
+          <w:rFonts w:ascii="Times New Roman" w:hAnsi="Times New Roman" w:cs="Times New Roman"/>
+        </w:rPr>
+        <w:t>Volume-based moving average (</w:t>
+      </w:r>
+      <w:proofErr w:type="spellStart"/>
+      <w:r>
+        <w:rPr>
+          <w:rFonts w:ascii="Times New Roman" w:hAnsi="Times New Roman" w:cs="Times New Roman"/>
+        </w:rPr>
+        <w:t>volume_sma</w:t>
+      </w:r>
+      <w:proofErr w:type="spellEnd"/>
+      <w:r>
+        <w:rPr>
+          <w:rFonts w:ascii="Times New Roman" w:hAnsi="Times New Roman" w:cs="Times New Roman"/>
+        </w:rPr>
+        <w:t>)</w:t>
+      </w:r>
+    </w:p>
+    <w:p>
+      <w:pPr>
+        <w:pStyle w:val="ListParagraph"/>
+        <w:numPr>
+          <w:ilvl w:val="0"/>
+          <w:numId w:val="14"/>
+        </w:numPr>
+        <w:rPr>
+          <w:rFonts w:ascii="Times New Roman" w:hAnsi="Times New Roman" w:cs="Times New Roman"/>
+        </w:rPr>
+      </w:pPr>
+      <w:r>
+        <w:rPr>
+          <w:rFonts w:ascii="Times New Roman" w:hAnsi="Times New Roman" w:cs="Times New Roman"/>
+        </w:rPr>
+        <w:t>Validating data</w:t>
+      </w:r>
+      <w:r>
+        <w:rPr>
+          <w:rFonts w:ascii="Times New Roman" w:hAnsi="Times New Roman" w:cs="Times New Roman"/>
+        </w:rPr>
+        <w:t xml:space="preserve"> to ensure </w:t>
+      </w:r>
+      <w:r>
+        <w:rPr>
+          <w:rFonts w:ascii="Times New Roman" w:hAnsi="Times New Roman" w:cs="Times New Roman"/>
+        </w:rPr>
+        <w:t xml:space="preserve">all the </w:t>
+      </w:r>
+      <w:r>
+        <w:rPr>
+          <w:rFonts w:ascii="Times New Roman" w:hAnsi="Times New Roman" w:cs="Times New Roman"/>
+        </w:rPr>
+        <w:t>feature calculations were correct.</w:t>
+      </w:r>
+    </w:p>
+    <w:p>
+      <w:pPr>
+        <w:pStyle w:val="ListParagraph"/>
+        <w:numPr>
+          <w:ilvl w:val="0"/>
+          <w:numId w:val="14"/>
+        </w:numPr>
+        <w:rPr>
+          <w:rFonts w:ascii="Times New Roman" w:hAnsi="Times New Roman" w:cs="Times New Roman"/>
+        </w:rPr>
+      </w:pPr>
+      <w:r>
+        <w:rPr>
+          <w:rFonts w:ascii="Times New Roman" w:hAnsi="Times New Roman" w:cs="Times New Roman"/>
+        </w:rPr>
+        <w:t xml:space="preserve">Visualized </w:t>
+      </w:r>
+      <w:r>
+        <w:rPr>
+          <w:rFonts w:ascii="Times New Roman" w:hAnsi="Times New Roman" w:cs="Times New Roman"/>
+        </w:rPr>
+        <w:t xml:space="preserve">the </w:t>
+      </w:r>
+      <w:r>
+        <w:rPr>
+          <w:rFonts w:ascii="Times New Roman" w:hAnsi="Times New Roman" w:cs="Times New Roman"/>
+        </w:rPr>
+        <w:t>selected stock trends to verify</w:t>
+      </w:r>
+      <w:r>
+        <w:rPr>
+          <w:rFonts w:ascii="Times New Roman" w:hAnsi="Times New Roman" w:cs="Times New Roman"/>
+        </w:rPr>
+        <w:t xml:space="preserve"> the</w:t>
+      </w:r>
+      <w:r>
+        <w:rPr>
+          <w:rFonts w:ascii="Times New Roman" w:hAnsi="Times New Roman" w:cs="Times New Roman"/>
+        </w:rPr>
+        <w:t xml:space="preserve"> logic of engineered features.</w:t>
+      </w:r>
+    </w:p>
+    <w:p>
+      <w:pPr>
+        <w:rPr>
+          <w:rFonts w:ascii="Times New Roman" w:hAnsi="Times New Roman" w:cs="Times New Roman"/>
+        </w:rPr>
+      </w:pPr>
+    </w:p>
+    <w:p>
+      <w:pPr>
+        <w:rPr>
+          <w:rFonts w:ascii="Times New Roman" w:hAnsi="Times New Roman" w:cs="Times New Roman"/>
+          <w:b/>
+          <w:bCs/>
+        </w:rPr>
+      </w:pPr>
+      <w:r>
+        <w:rPr>
+          <w:rFonts w:ascii="Times New Roman" w:hAnsi="Times New Roman" w:cs="Times New Roman"/>
+          <w:b/>
+          <w:bCs/>
+        </w:rPr>
+        <w:t>Problems Encountered:</w:t>
+      </w:r>
+    </w:p>
+    <w:p>
+      <w:pPr>
+        <w:pStyle w:val="ListParagraph"/>
+        <w:numPr>
+          <w:ilvl w:val="0"/>
+          <w:numId w:val="15"/>
+        </w:numPr>
+        <w:rPr>
+          <w:rFonts w:ascii="Times New Roman" w:hAnsi="Times New Roman" w:cs="Times New Roman"/>
+        </w:rPr>
+      </w:pPr>
+      <w:r>
+        <w:rPr>
+          <w:rFonts w:ascii="Times New Roman" w:hAnsi="Times New Roman" w:cs="Times New Roman"/>
+        </w:rPr>
+        <w:t>Noticing that the r</w:t>
+      </w:r>
+      <w:r>
+        <w:rPr>
+          <w:rFonts w:ascii="Times New Roman" w:hAnsi="Times New Roman" w:cs="Times New Roman"/>
+        </w:rPr>
+        <w:t xml:space="preserve">aw price plots across different stocks were not directly comparable due to different scales and </w:t>
+      </w:r>
+      <w:r>
+        <w:rPr>
+          <w:rFonts w:ascii="Times New Roman" w:hAnsi="Times New Roman" w:cs="Times New Roman"/>
+        </w:rPr>
+        <w:t>currencies. This</w:t>
+      </w:r>
+      <w:r>
+        <w:rPr>
+          <w:rFonts w:ascii="Times New Roman" w:hAnsi="Times New Roman" w:cs="Times New Roman"/>
+        </w:rPr>
+        <w:t xml:space="preserve"> highlighted the need for normalization or return-based comparison.</w:t>
+      </w:r>
+    </w:p>
+    <w:p>
+      <w:pPr>
+        <w:pStyle w:val="ListParagraph"/>
+        <w:numPr>
+          <w:ilvl w:val="0"/>
+          <w:numId w:val="15"/>
+        </w:numPr>
+        <w:rPr>
+          <w:rFonts w:ascii="Times New Roman" w:hAnsi="Times New Roman" w:cs="Times New Roman"/>
+        </w:rPr>
+      </w:pPr>
+      <w:r>
+        <w:rPr>
+          <w:rFonts w:ascii="Times New Roman" w:hAnsi="Times New Roman" w:cs="Times New Roman"/>
+        </w:rPr>
+        <w:t xml:space="preserve">Rolling window calculations introduced initial </w:t>
+      </w:r>
+      <w:proofErr w:type="spellStart"/>
+      <w:r>
+        <w:rPr>
+          <w:rFonts w:ascii="Times New Roman" w:hAnsi="Times New Roman" w:cs="Times New Roman"/>
+        </w:rPr>
+        <w:t>NaN</w:t>
+      </w:r>
+      <w:proofErr w:type="spellEnd"/>
+      <w:r>
+        <w:rPr>
+          <w:rFonts w:ascii="Times New Roman" w:hAnsi="Times New Roman" w:cs="Times New Roman"/>
+        </w:rPr>
+        <w:t xml:space="preserve"> </w:t>
+      </w:r>
+      <w:r>
+        <w:rPr>
+          <w:rFonts w:ascii="Times New Roman" w:hAnsi="Times New Roman" w:cs="Times New Roman"/>
+        </w:rPr>
+        <w:t>values but</w:t>
+      </w:r>
+      <w:r>
+        <w:rPr>
+          <w:rFonts w:ascii="Times New Roman" w:hAnsi="Times New Roman" w:cs="Times New Roman"/>
+        </w:rPr>
+        <w:t xml:space="preserve"> soon learned that it is an expected behavior</w:t>
+      </w:r>
+      <w:r>
+        <w:rPr>
+          <w:rFonts w:ascii="Times New Roman" w:hAnsi="Times New Roman" w:cs="Times New Roman"/>
+        </w:rPr>
+        <w:t>.</w:t>
+      </w:r>
+    </w:p>
+    <w:p>
+      <w:pPr>
+        <w:rPr>
+          <w:rFonts w:ascii="Times New Roman" w:hAnsi="Times New Roman" w:cs="Times New Roman"/>
+        </w:rPr>
+      </w:pPr>
+    </w:p>
+    <w:p>
+      <w:pPr>
+        <w:rPr>
+          <w:rFonts w:ascii="Times New Roman" w:hAnsi="Times New Roman" w:cs="Times New Roman"/>
+          <w:b/>
+          <w:bCs/>
+        </w:rPr>
+      </w:pPr>
+      <w:r>
+        <w:rPr>
+          <w:rFonts w:ascii="Times New Roman" w:hAnsi="Times New Roman" w:cs="Times New Roman"/>
+          <w:b/>
+          <w:bCs/>
+        </w:rPr>
+        <w:t>Key Learning:</w:t>
+      </w:r>
+    </w:p>
+    <w:p>
+      <w:pPr>
+        <w:pStyle w:val="ListParagraph"/>
+        <w:numPr>
+          <w:ilvl w:val="0"/>
+          <w:numId w:val="16"/>
+        </w:numPr>
+        <w:rPr>
+          <w:rFonts w:ascii="Times New Roman" w:hAnsi="Times New Roman" w:cs="Times New Roman"/>
+        </w:rPr>
+      </w:pPr>
+      <w:r>
+        <w:rPr>
+          <w:rFonts w:ascii="Times New Roman" w:hAnsi="Times New Roman" w:cs="Times New Roman"/>
+        </w:rPr>
+        <w:t>Basic technical features (SMA, EMA, returns) are essential for capturing short-term and long-term trends.</w:t>
+      </w:r>
+    </w:p>
+    <w:p>
+      <w:pPr>
+        <w:pStyle w:val="ListParagraph"/>
+        <w:numPr>
+          <w:ilvl w:val="0"/>
+          <w:numId w:val="16"/>
+        </w:numPr>
+        <w:rPr>
+          <w:rFonts w:ascii="Times New Roman" w:hAnsi="Times New Roman" w:cs="Times New Roman"/>
+        </w:rPr>
+      </w:pPr>
+      <w:r>
+        <w:rPr>
+          <w:rFonts w:ascii="Times New Roman" w:hAnsi="Times New Roman" w:cs="Times New Roman"/>
+        </w:rPr>
+        <w:t>Stock price levels are not directly comparable across different markets.</w:t>
+      </w:r>
+    </w:p>
+    <w:p>
+      <w:pPr>
+        <w:pStyle w:val="ListParagraph"/>
+        <w:numPr>
+          <w:ilvl w:val="0"/>
+          <w:numId w:val="16"/>
+        </w:numPr>
+        <w:rPr>
+          <w:rFonts w:ascii="Times New Roman" w:hAnsi="Times New Roman" w:cs="Times New Roman"/>
+        </w:rPr>
+      </w:pPr>
+      <w:r>
+        <w:rPr>
+          <w:rFonts w:ascii="Times New Roman" w:hAnsi="Times New Roman" w:cs="Times New Roman"/>
+        </w:rPr>
+        <w:t>Feature validation is important before adding complex indicators.</w:t>
+      </w:r>
+    </w:p>
+    <w:p>
+      <w:pPr>
+        <w:rPr>
+          <w:rFonts w:ascii="Times New Roman" w:hAnsi="Times New Roman" w:cs="Times New Roman"/>
+        </w:rPr>
+      </w:pPr>
+    </w:p>
+    <w:p>
+      <w:pPr>
+        <w:rPr>
+          <w:rFonts w:ascii="Times New Roman" w:hAnsi="Times New Roman" w:cs="Times New Roman"/>
+          <w:b/>
+          <w:bCs/>
+        </w:rPr>
+      </w:pPr>
+      <w:r>
+        <w:rPr>
+          <w:rFonts w:ascii="Times New Roman" w:hAnsi="Times New Roman" w:cs="Times New Roman"/>
+          <w:b/>
+          <w:bCs/>
+        </w:rPr>
+        <w:t>Next Tasks:</w:t>
+      </w:r>
+    </w:p>
+    <w:p>
+      <w:pPr>
+        <w:pStyle w:val="ListParagraph"/>
+        <w:numPr>
+          <w:ilvl w:val="0"/>
+          <w:numId w:val="17"/>
+        </w:numPr>
+        <w:rPr>
+          <w:rFonts w:ascii="Times New Roman" w:hAnsi="Times New Roman" w:cs="Times New Roman"/>
+        </w:rPr>
+      </w:pPr>
+      <w:r>
+        <w:rPr>
+          <w:rFonts w:ascii="Times New Roman" w:hAnsi="Times New Roman" w:cs="Times New Roman"/>
+        </w:rPr>
+        <w:t>Continuing</w:t>
+      </w:r>
+      <w:r>
+        <w:rPr>
+          <w:rFonts w:ascii="Times New Roman" w:hAnsi="Times New Roman" w:cs="Times New Roman"/>
+        </w:rPr>
+        <w:t xml:space="preserve"> feature engineering with technical indicators (RSI, MACD, Bollinger Bands).</w:t>
+      </w:r>
+    </w:p>
+    <w:p>
+      <w:pPr>
+        <w:rPr>
+          <w:rFonts w:ascii="Times New Roman" w:hAnsi="Times New Roman" w:cs="Times New Roman"/>
+        </w:rPr>
+      </w:pPr>
+      <w:r>
+        <w:rPr>
+          <w:rFonts w:ascii="Times New Roman" w:hAnsi="Times New Roman" w:cs="Times New Roman"/>
+        </w:rPr>
+        <w:br w:type="page"/>
+      </w:r>
+    </w:p>
+    <w:p>
+      <w:pPr>
+        <w:pStyle w:val="Heading1"/>
+        <w:rPr>
+          <w:rFonts w:ascii="Times New Roman" w:hAnsi="Times New Roman" w:cs="Times New Roman"/>
+          <w:b/>
+          <w:bCs/>
+          <w:color w:val="auto"/>
+          <w:sz w:val="24"/>
+          <w:szCs w:val="24"/>
+        </w:rPr>
+      </w:pPr>
+      <w:bookmarkStart w:id="3" w:name="_Toc233982815"/>
+      <w:r>
+        <w:rPr>
+          <w:rFonts w:ascii="Times New Roman" w:hAnsi="Times New Roman" w:cs="Times New Roman"/>
+          <w:b/>
+          <w:bCs/>
+          <w:color w:val="auto"/>
+          <w:sz w:val="24"/>
+          <w:szCs w:val="24"/>
+        </w:rPr>
+        <w:lastRenderedPageBreak/>
+        <w:t>0</w:t>
+      </w:r>
+      <w:r>
+        <w:rPr>
+          <w:rFonts w:ascii="Times New Roman" w:hAnsi="Times New Roman" w:cs="Times New Roman"/>
+          <w:b/>
+          <w:bCs/>
+          <w:color w:val="auto"/>
+          <w:sz w:val="24"/>
+          <w:szCs w:val="24"/>
+        </w:rPr>
+        <w:t>3</w:t>
+      </w:r>
+      <w:r>
+        <w:rPr>
+          <w:rFonts w:ascii="Times New Roman" w:hAnsi="Times New Roman" w:cs="Times New Roman"/>
+          <w:b/>
+          <w:bCs/>
+          <w:color w:val="auto"/>
+          <w:sz w:val="24"/>
+          <w:szCs w:val="24"/>
+        </w:rPr>
+        <w:t>/07/2026 – Feature Engineering</w:t>
+      </w:r>
+      <w:r>
+        <w:rPr>
+          <w:rFonts w:ascii="Times New Roman" w:hAnsi="Times New Roman" w:cs="Times New Roman"/>
+          <w:b/>
+          <w:bCs/>
+          <w:color w:val="auto"/>
+          <w:sz w:val="24"/>
+          <w:szCs w:val="24"/>
+        </w:rPr>
+        <w:t xml:space="preserve"> (Technical Indicators)</w:t>
+      </w:r>
+      <w:bookmarkEnd w:id="3"/>
+    </w:p>
+    <w:p>
+      <w:pPr>
+        <w:rPr>
+          <w:rFonts w:ascii="Times New Roman" w:hAnsi="Times New Roman" w:cs="Times New Roman"/>
+        </w:rPr>
+      </w:pPr>
+    </w:p>
+    <w:p>
+      <w:pPr>
+        <w:rPr>
+          <w:rFonts w:ascii="Times New Roman" w:hAnsi="Times New Roman" w:cs="Times New Roman"/>
+          <w:b/>
+          <w:bCs/>
+        </w:rPr>
+      </w:pPr>
+      <w:r>
+        <w:rPr>
+          <w:rFonts w:ascii="Times New Roman" w:hAnsi="Times New Roman" w:cs="Times New Roman"/>
+          <w:b/>
+          <w:bCs/>
+        </w:rPr>
+        <w:t>Progress:</w:t>
+      </w:r>
+    </w:p>
+    <w:p>
+      <w:pPr>
+        <w:pStyle w:val="ListParagraph"/>
+        <w:numPr>
+          <w:ilvl w:val="0"/>
+          <w:numId w:val="10"/>
+        </w:numPr>
+        <w:rPr>
+          <w:rFonts w:ascii="Times New Roman" w:hAnsi="Times New Roman" w:cs="Times New Roman"/>
+        </w:rPr>
+      </w:pPr>
+      <w:r>
+        <w:rPr>
+          <w:rFonts w:ascii="Times New Roman" w:hAnsi="Times New Roman" w:cs="Times New Roman"/>
+        </w:rPr>
+        <w:t>Continued feature engineering completed previously.</w:t>
+      </w:r>
+    </w:p>
+    <w:p>
+      <w:pPr>
+        <w:pStyle w:val="ListParagraph"/>
+        <w:numPr>
+          <w:ilvl w:val="0"/>
+          <w:numId w:val="10"/>
+        </w:numPr>
+        <w:rPr>
+          <w:rFonts w:ascii="Times New Roman" w:hAnsi="Times New Roman" w:cs="Times New Roman"/>
+        </w:rPr>
+      </w:pPr>
+      <w:r>
+        <w:rPr>
+          <w:rFonts w:ascii="Times New Roman" w:hAnsi="Times New Roman" w:cs="Times New Roman"/>
+        </w:rPr>
+        <w:t>Implemented technical indicators including:</w:t>
+      </w:r>
+    </w:p>
+    <w:p>
+      <w:pPr>
+        <w:pStyle w:val="ListParagraph"/>
+        <w:numPr>
+          <w:ilvl w:val="1"/>
+          <w:numId w:val="10"/>
+        </w:numPr>
+        <w:rPr>
+          <w:rFonts w:ascii="Times New Roman" w:hAnsi="Times New Roman" w:cs="Times New Roman"/>
+        </w:rPr>
+      </w:pPr>
+      <w:r>
+        <w:rPr>
+          <w:rFonts w:ascii="Times New Roman" w:hAnsi="Times New Roman" w:cs="Times New Roman"/>
+        </w:rPr>
+        <w:t>RSI (Relative Strength Index)</w:t>
+      </w:r>
+    </w:p>
+    <w:p>
+      <w:pPr>
+        <w:pStyle w:val="ListParagraph"/>
+        <w:numPr>
+          <w:ilvl w:val="1"/>
+          <w:numId w:val="10"/>
+        </w:numPr>
+        <w:rPr>
+          <w:rFonts w:ascii="Times New Roman" w:hAnsi="Times New Roman" w:cs="Times New Roman"/>
+        </w:rPr>
+      </w:pPr>
+      <w:r>
+        <w:rPr>
+          <w:rFonts w:ascii="Times New Roman" w:hAnsi="Times New Roman" w:cs="Times New Roman"/>
+        </w:rPr>
+        <w:t>MACD (Moving Average Convergence Divergence)</w:t>
+      </w:r>
+    </w:p>
+    <w:p>
+      <w:pPr>
+        <w:pStyle w:val="ListParagraph"/>
+        <w:numPr>
+          <w:ilvl w:val="1"/>
+          <w:numId w:val="10"/>
+        </w:numPr>
+        <w:rPr>
+          <w:rFonts w:ascii="Times New Roman" w:hAnsi="Times New Roman" w:cs="Times New Roman"/>
+        </w:rPr>
+      </w:pPr>
+      <w:r>
+        <w:rPr>
+          <w:rFonts w:ascii="Times New Roman" w:hAnsi="Times New Roman" w:cs="Times New Roman"/>
+        </w:rPr>
+        <w:t>MACD Signal Line</w:t>
+      </w:r>
+    </w:p>
+    <w:p>
+      <w:pPr>
+        <w:pStyle w:val="ListParagraph"/>
+        <w:numPr>
+          <w:ilvl w:val="1"/>
+          <w:numId w:val="10"/>
+        </w:numPr>
+        <w:rPr>
+          <w:rFonts w:ascii="Times New Roman" w:hAnsi="Times New Roman" w:cs="Times New Roman"/>
+        </w:rPr>
+      </w:pPr>
+      <w:r>
+        <w:rPr>
+          <w:rFonts w:ascii="Times New Roman" w:hAnsi="Times New Roman" w:cs="Times New Roman"/>
+        </w:rPr>
+        <w:t>MACD Histogram (MACD Difference)</w:t>
+      </w:r>
+    </w:p>
+    <w:p>
+      <w:pPr>
+        <w:pStyle w:val="ListParagraph"/>
+        <w:numPr>
+          <w:ilvl w:val="1"/>
+          <w:numId w:val="10"/>
+        </w:numPr>
+        <w:rPr>
+          <w:rFonts w:ascii="Times New Roman" w:hAnsi="Times New Roman" w:cs="Times New Roman"/>
+        </w:rPr>
+      </w:pPr>
+      <w:r>
+        <w:rPr>
+          <w:rFonts w:ascii="Times New Roman" w:hAnsi="Times New Roman" w:cs="Times New Roman"/>
+        </w:rPr>
+        <w:t>Bollinger Bands (Upper, Middle, Lower)</w:t>
+      </w:r>
+    </w:p>
+    <w:p>
+      <w:pPr>
+        <w:pStyle w:val="ListParagraph"/>
+        <w:numPr>
+          <w:ilvl w:val="0"/>
+          <w:numId w:val="10"/>
+        </w:numPr>
+        <w:rPr>
+          <w:rFonts w:ascii="Times New Roman" w:hAnsi="Times New Roman" w:cs="Times New Roman"/>
+        </w:rPr>
+      </w:pPr>
+      <w:r>
+        <w:rPr>
+          <w:rFonts w:ascii="Times New Roman" w:hAnsi="Times New Roman" w:cs="Times New Roman"/>
+        </w:rPr>
+        <w:t xml:space="preserve">Verified feature calculations using </w:t>
+      </w:r>
+      <w:r>
+        <w:rPr>
+          <w:rFonts w:ascii="Times New Roman" w:hAnsi="Times New Roman" w:cs="Times New Roman"/>
+        </w:rPr>
+        <w:t>Maybank stock data</w:t>
+      </w:r>
+      <w:r>
+        <w:rPr>
+          <w:rFonts w:ascii="Times New Roman" w:hAnsi="Times New Roman" w:cs="Times New Roman"/>
+        </w:rPr>
+        <w:t>.</w:t>
+      </w:r>
+    </w:p>
+    <w:p>
+      <w:pPr>
+        <w:pStyle w:val="ListParagraph"/>
+        <w:numPr>
+          <w:ilvl w:val="0"/>
+          <w:numId w:val="10"/>
+        </w:numPr>
+        <w:rPr>
+          <w:rFonts w:ascii="Times New Roman" w:hAnsi="Times New Roman" w:cs="Times New Roman"/>
+        </w:rPr>
+      </w:pPr>
+      <w:r>
+        <w:rPr>
+          <w:rFonts w:ascii="Times New Roman" w:hAnsi="Times New Roman" w:cs="Times New Roman"/>
+        </w:rPr>
+        <w:t xml:space="preserve">Confirmed that all indicators were correctly </w:t>
+      </w:r>
+      <w:r>
+        <w:rPr>
+          <w:rFonts w:ascii="Times New Roman" w:hAnsi="Times New Roman" w:cs="Times New Roman"/>
+        </w:rPr>
+        <w:t>calculated</w:t>
+      </w:r>
+      <w:r>
+        <w:rPr>
+          <w:rFonts w:ascii="Times New Roman" w:hAnsi="Times New Roman" w:cs="Times New Roman"/>
+        </w:rPr>
+        <w:t xml:space="preserve"> </w:t>
+      </w:r>
+      <w:r>
+        <w:rPr>
+          <w:rFonts w:ascii="Times New Roman" w:hAnsi="Times New Roman" w:cs="Times New Roman"/>
+        </w:rPr>
+        <w:t xml:space="preserve">in </w:t>
+      </w:r>
+      <w:proofErr w:type="spellStart"/>
+      <w:r>
+        <w:rPr>
+          <w:rFonts w:ascii="Times New Roman" w:hAnsi="Times New Roman" w:cs="Times New Roman"/>
+        </w:rPr>
+        <w:t>feature_engineering.ipynb</w:t>
+      </w:r>
+      <w:proofErr w:type="spellEnd"/>
+      <w:r>
+        <w:rPr>
+          <w:rFonts w:ascii="Times New Roman" w:hAnsi="Times New Roman" w:cs="Times New Roman"/>
+        </w:rPr>
+        <w:t>.</w:t>
+      </w:r>
+    </w:p>
+    <w:p>
+      <w:pPr>
+        <w:pStyle w:val="ListParagraph"/>
+        <w:numPr>
+          <w:ilvl w:val="0"/>
+          <w:numId w:val="10"/>
+        </w:numPr>
+        <w:rPr>
+          <w:rFonts w:ascii="Times New Roman" w:hAnsi="Times New Roman" w:cs="Times New Roman"/>
+        </w:rPr>
+      </w:pPr>
+      <w:r>
+        <w:rPr>
+          <w:rFonts w:ascii="Times New Roman" w:hAnsi="Times New Roman" w:cs="Times New Roman"/>
+        </w:rPr>
+        <w:t>Finalized feature engineering pipeline including both basic features and technical indicators</w:t>
+      </w:r>
+      <w:r>
+        <w:rPr>
+          <w:rFonts w:ascii="Times New Roman" w:hAnsi="Times New Roman" w:cs="Times New Roman"/>
+        </w:rPr>
+        <w:t xml:space="preserve"> in feature_engineering.py.</w:t>
+      </w:r>
+    </w:p>
+    <w:p>
+      <w:pPr>
+        <w:pStyle w:val="ListParagraph"/>
+        <w:numPr>
+          <w:ilvl w:val="0"/>
+          <w:numId w:val="10"/>
+        </w:numPr>
+        <w:rPr>
+          <w:rFonts w:ascii="Times New Roman" w:hAnsi="Times New Roman" w:cs="Times New Roman"/>
+        </w:rPr>
+      </w:pPr>
+      <w:r>
+        <w:rPr>
+          <w:rFonts w:ascii="Times New Roman" w:hAnsi="Times New Roman" w:cs="Times New Roman"/>
+        </w:rPr>
+        <w:t>Created processed</w:t>
+      </w:r>
+      <w:r>
+        <w:rPr>
+          <w:rFonts w:ascii="Times New Roman" w:hAnsi="Times New Roman" w:cs="Times New Roman"/>
+        </w:rPr>
+        <w:t>_data.csv</w:t>
+      </w:r>
+      <w:r>
+        <w:rPr>
+          <w:rFonts w:ascii="Times New Roman" w:hAnsi="Times New Roman" w:cs="Times New Roman"/>
+        </w:rPr>
+        <w:t xml:space="preserve"> with all engineered features ready for machine learning usage.</w:t>
+      </w:r>
+    </w:p>
+    <w:p>
+      <w:pPr>
+        <w:rPr>
+          <w:rFonts w:ascii="Times New Roman" w:hAnsi="Times New Roman" w:cs="Times New Roman"/>
+        </w:rPr>
+      </w:pPr>
+    </w:p>
+    <w:p>
+      <w:pPr>
+        <w:rPr>
+          <w:rFonts w:ascii="Times New Roman" w:hAnsi="Times New Roman" w:cs="Times New Roman"/>
+          <w:b/>
+          <w:bCs/>
+        </w:rPr>
+      </w:pPr>
+      <w:r>
+        <w:rPr>
+          <w:rFonts w:ascii="Times New Roman" w:hAnsi="Times New Roman" w:cs="Times New Roman"/>
+          <w:b/>
+          <w:bCs/>
+        </w:rPr>
+        <w:t>Problems Encountered:</w:t>
+      </w:r>
+    </w:p>
+    <w:p>
+      <w:pPr>
+        <w:pStyle w:val="ListParagraph"/>
+        <w:numPr>
+          <w:ilvl w:val="0"/>
+          <w:numId w:val="11"/>
+        </w:numPr>
+        <w:rPr>
+          <w:rFonts w:ascii="Times New Roman" w:hAnsi="Times New Roman" w:cs="Times New Roman"/>
+        </w:rPr>
+      </w:pPr>
+      <w:r>
+        <w:rPr>
+          <w:rFonts w:ascii="Times New Roman" w:hAnsi="Times New Roman" w:cs="Times New Roman"/>
+        </w:rPr>
+        <w:t>Initia</w:t>
+      </w:r>
+      <w:r>
+        <w:rPr>
+          <w:rFonts w:ascii="Times New Roman" w:hAnsi="Times New Roman" w:cs="Times New Roman"/>
+        </w:rPr>
+        <w:t>l</w:t>
+      </w:r>
+      <w:r>
+        <w:rPr>
+          <w:rFonts w:ascii="Times New Roman" w:hAnsi="Times New Roman" w:cs="Times New Roman"/>
+        </w:rPr>
+        <w:t>l</w:t>
+      </w:r>
+      <w:r>
+        <w:rPr>
+          <w:rFonts w:ascii="Times New Roman" w:hAnsi="Times New Roman" w:cs="Times New Roman"/>
+        </w:rPr>
+        <w:t>y,</w:t>
+      </w:r>
+      <w:r>
+        <w:rPr>
+          <w:rFonts w:ascii="Times New Roman" w:hAnsi="Times New Roman" w:cs="Times New Roman"/>
+        </w:rPr>
+        <w:t xml:space="preserve"> MACD and Bollinger Band column names were inconsistent across outputs due to </w:t>
+      </w:r>
+      <w:r>
+        <w:rPr>
+          <w:rFonts w:ascii="Times New Roman" w:hAnsi="Times New Roman" w:cs="Times New Roman"/>
+        </w:rPr>
+        <w:t xml:space="preserve">the </w:t>
+      </w:r>
+      <w:proofErr w:type="spellStart"/>
+      <w:r>
+        <w:rPr>
+          <w:rFonts w:ascii="Times New Roman" w:hAnsi="Times New Roman" w:cs="Times New Roman"/>
+        </w:rPr>
+        <w:t>pandas_ta</w:t>
+      </w:r>
+      <w:proofErr w:type="spellEnd"/>
+      <w:r>
+        <w:rPr>
+          <w:rFonts w:ascii="Times New Roman" w:hAnsi="Times New Roman" w:cs="Times New Roman"/>
+        </w:rPr>
+        <w:t xml:space="preserve"> naming format differences.</w:t>
+      </w:r>
+      <w:r>
+        <w:rPr>
+          <w:rFonts w:ascii="Times New Roman" w:hAnsi="Times New Roman" w:cs="Times New Roman"/>
+        </w:rPr>
+        <w:t xml:space="preserve"> This is solved by</w:t>
+      </w:r>
+      <w:r>
+        <w:rPr>
+          <w:rFonts w:ascii="Times New Roman" w:hAnsi="Times New Roman" w:cs="Times New Roman"/>
+        </w:rPr>
+        <w:t xml:space="preserve"> inspecting </w:t>
+      </w:r>
+      <w:r>
+        <w:rPr>
+          <w:rFonts w:ascii="Times New Roman" w:hAnsi="Times New Roman" w:cs="Times New Roman"/>
+        </w:rPr>
+        <w:t xml:space="preserve">the </w:t>
+      </w:r>
+      <w:r>
+        <w:rPr>
+          <w:rFonts w:ascii="Times New Roman" w:hAnsi="Times New Roman" w:cs="Times New Roman"/>
+        </w:rPr>
+        <w:t xml:space="preserve">generated column names </w:t>
+      </w:r>
+      <w:r>
+        <w:rPr>
+          <w:rFonts w:ascii="Times New Roman" w:hAnsi="Times New Roman" w:cs="Times New Roman"/>
+        </w:rPr>
+        <w:t xml:space="preserve">first and then only </w:t>
+      </w:r>
+      <w:r>
+        <w:rPr>
+          <w:rFonts w:ascii="Times New Roman" w:hAnsi="Times New Roman" w:cs="Times New Roman"/>
+        </w:rPr>
+        <w:t>adjusting</w:t>
+      </w:r>
+      <w:r>
+        <w:rPr>
+          <w:rFonts w:ascii="Times New Roman" w:hAnsi="Times New Roman" w:cs="Times New Roman"/>
+        </w:rPr>
+        <w:t xml:space="preserve"> </w:t>
+      </w:r>
+      <w:r>
+        <w:rPr>
+          <w:rFonts w:ascii="Times New Roman" w:hAnsi="Times New Roman" w:cs="Times New Roman"/>
+        </w:rPr>
+        <w:t xml:space="preserve">the </w:t>
+      </w:r>
+      <w:r>
+        <w:rPr>
+          <w:rFonts w:ascii="Times New Roman" w:hAnsi="Times New Roman" w:cs="Times New Roman"/>
+        </w:rPr>
+        <w:t>indexing accordingly.</w:t>
+      </w:r>
+    </w:p>
+    <w:p>
+      <w:pPr>
+        <w:pStyle w:val="ListParagraph"/>
+        <w:numPr>
+          <w:ilvl w:val="0"/>
+          <w:numId w:val="11"/>
+        </w:numPr>
+        <w:rPr>
+          <w:rFonts w:ascii="Times New Roman" w:hAnsi="Times New Roman" w:cs="Times New Roman"/>
+        </w:rPr>
+      </w:pPr>
+      <w:r>
+        <w:rPr>
+          <w:rFonts w:ascii="Times New Roman" w:hAnsi="Times New Roman" w:cs="Times New Roman"/>
+        </w:rPr>
+        <w:t xml:space="preserve">Some intermediate </w:t>
+      </w:r>
+      <w:proofErr w:type="spellStart"/>
+      <w:r>
+        <w:rPr>
+          <w:rFonts w:ascii="Times New Roman" w:hAnsi="Times New Roman" w:cs="Times New Roman"/>
+        </w:rPr>
+        <w:t>NaN</w:t>
+      </w:r>
+      <w:proofErr w:type="spellEnd"/>
+      <w:r>
+        <w:rPr>
+          <w:rFonts w:ascii="Times New Roman" w:hAnsi="Times New Roman" w:cs="Times New Roman"/>
+        </w:rPr>
+        <w:t xml:space="preserve"> values were produced </w:t>
+      </w:r>
+      <w:r>
+        <w:rPr>
+          <w:rFonts w:ascii="Times New Roman" w:hAnsi="Times New Roman" w:cs="Times New Roman"/>
+        </w:rPr>
+        <w:t>because of the</w:t>
+      </w:r>
+      <w:r>
+        <w:rPr>
+          <w:rFonts w:ascii="Times New Roman" w:hAnsi="Times New Roman" w:cs="Times New Roman"/>
+        </w:rPr>
+        <w:t xml:space="preserve"> rolling window calculations.</w:t>
+      </w:r>
+      <w:r>
+        <w:rPr>
+          <w:rFonts w:ascii="Times New Roman" w:hAnsi="Times New Roman" w:cs="Times New Roman"/>
+        </w:rPr>
+        <w:t xml:space="preserve"> </w:t>
+      </w:r>
+      <w:r>
+        <w:rPr>
+          <w:rFonts w:ascii="Times New Roman" w:hAnsi="Times New Roman" w:cs="Times New Roman"/>
+        </w:rPr>
+        <w:t>This is</w:t>
+      </w:r>
+      <w:r>
+        <w:rPr>
+          <w:rFonts w:ascii="Times New Roman" w:hAnsi="Times New Roman" w:cs="Times New Roman"/>
+        </w:rPr>
+        <w:t xml:space="preserve"> actually</w:t>
+      </w:r>
+      <w:r>
+        <w:rPr>
+          <w:rFonts w:ascii="Times New Roman" w:hAnsi="Times New Roman" w:cs="Times New Roman"/>
+        </w:rPr>
+        <w:t xml:space="preserve"> expected and </w:t>
+      </w:r>
+      <w:r>
+        <w:rPr>
+          <w:rFonts w:ascii="Times New Roman" w:hAnsi="Times New Roman" w:cs="Times New Roman"/>
+        </w:rPr>
+        <w:t xml:space="preserve">being </w:t>
+      </w:r>
+      <w:r>
+        <w:rPr>
+          <w:rFonts w:ascii="Times New Roman" w:hAnsi="Times New Roman" w:cs="Times New Roman"/>
+        </w:rPr>
+        <w:t xml:space="preserve">handled </w:t>
+      </w:r>
+      <w:r>
+        <w:rPr>
+          <w:rFonts w:ascii="Times New Roman" w:hAnsi="Times New Roman" w:cs="Times New Roman"/>
+        </w:rPr>
+        <w:t xml:space="preserve">by </w:t>
+      </w:r>
+      <w:r>
+        <w:rPr>
+          <w:rFonts w:ascii="Times New Roman" w:hAnsi="Times New Roman" w:cs="Times New Roman"/>
+        </w:rPr>
+        <w:t>using .</w:t>
+      </w:r>
+      <w:proofErr w:type="spellStart"/>
+      <w:r>
+        <w:rPr>
+          <w:rFonts w:ascii="Times New Roman" w:hAnsi="Times New Roman" w:cs="Times New Roman"/>
+        </w:rPr>
+        <w:t>dropna</w:t>
+      </w:r>
+      <w:proofErr w:type="spellEnd"/>
+      <w:r>
+        <w:rPr>
+          <w:rFonts w:ascii="Times New Roman" w:hAnsi="Times New Roman" w:cs="Times New Roman"/>
+        </w:rPr>
+        <w:t>() in the final dataset preparation stage</w:t>
+      </w:r>
+      <w:r>
+        <w:rPr>
+          <w:rFonts w:ascii="Times New Roman" w:hAnsi="Times New Roman" w:cs="Times New Roman"/>
+        </w:rPr>
+        <w:t xml:space="preserve"> to get rid of them</w:t>
+      </w:r>
+      <w:r>
+        <w:rPr>
+          <w:rFonts w:ascii="Times New Roman" w:hAnsi="Times New Roman" w:cs="Times New Roman"/>
+        </w:rPr>
+        <w:t>.</w:t>
+      </w:r>
+    </w:p>
+    <w:p>
+      <w:pPr>
+        <w:rPr>
+          <w:rFonts w:ascii="Times New Roman" w:hAnsi="Times New Roman" w:cs="Times New Roman"/>
+        </w:rPr>
+      </w:pPr>
+    </w:p>
+    <w:p>
+      <w:pPr>
+        <w:rPr>
+          <w:rFonts w:ascii="Times New Roman" w:hAnsi="Times New Roman" w:cs="Times New Roman"/>
+          <w:b/>
+          <w:bCs/>
+        </w:rPr>
+      </w:pPr>
+      <w:r>
+        <w:rPr>
+          <w:rFonts w:ascii="Times New Roman" w:hAnsi="Times New Roman" w:cs="Times New Roman"/>
+          <w:b/>
+          <w:bCs/>
+        </w:rPr>
+        <w:t>Key Learning:</w:t>
+      </w:r>
+    </w:p>
+    <w:p>
+      <w:pPr>
+        <w:pStyle w:val="ListParagraph"/>
+        <w:numPr>
+          <w:ilvl w:val="0"/>
+          <w:numId w:val="12"/>
+        </w:numPr>
+        <w:rPr>
+          <w:rFonts w:ascii="Times New Roman" w:hAnsi="Times New Roman" w:cs="Times New Roman"/>
+        </w:rPr>
+      </w:pPr>
+      <w:r>
+        <w:rPr>
+          <w:rFonts w:ascii="Times New Roman" w:hAnsi="Times New Roman" w:cs="Times New Roman"/>
+        </w:rPr>
+        <w:t xml:space="preserve">Technical indicators require careful handling of rolling-window-based </w:t>
+      </w:r>
+      <w:proofErr w:type="spellStart"/>
+      <w:r>
+        <w:rPr>
+          <w:rFonts w:ascii="Times New Roman" w:hAnsi="Times New Roman" w:cs="Times New Roman"/>
+        </w:rPr>
+        <w:t>NaN</w:t>
+      </w:r>
+      <w:proofErr w:type="spellEnd"/>
+      <w:r>
+        <w:rPr>
+          <w:rFonts w:ascii="Times New Roman" w:hAnsi="Times New Roman" w:cs="Times New Roman"/>
+        </w:rPr>
+        <w:t xml:space="preserve"> values.</w:t>
+      </w:r>
+    </w:p>
+    <w:p>
+      <w:pPr>
+        <w:pStyle w:val="ListParagraph"/>
+        <w:numPr>
+          <w:ilvl w:val="0"/>
+          <w:numId w:val="12"/>
+        </w:numPr>
+        <w:rPr>
+          <w:rFonts w:ascii="Times New Roman" w:hAnsi="Times New Roman" w:cs="Times New Roman"/>
+        </w:rPr>
+      </w:pPr>
+      <w:r>
+        <w:rPr>
+          <w:rFonts w:ascii="Times New Roman" w:hAnsi="Times New Roman" w:cs="Times New Roman"/>
+        </w:rPr>
+        <w:t>Different libraries may generate varying column naming conventions</w:t>
+      </w:r>
+      <w:r>
+        <w:rPr>
+          <w:rFonts w:ascii="Times New Roman" w:hAnsi="Times New Roman" w:cs="Times New Roman"/>
+        </w:rPr>
+        <w:t xml:space="preserve"> </w:t>
+      </w:r>
+      <w:r>
+        <w:rPr>
+          <w:rFonts w:ascii="Times New Roman" w:hAnsi="Times New Roman" w:cs="Times New Roman"/>
+        </w:rPr>
+        <w:t xml:space="preserve">(e.g., </w:t>
+      </w:r>
+      <w:proofErr w:type="spellStart"/>
+      <w:r>
+        <w:rPr>
+          <w:rFonts w:ascii="Times New Roman" w:hAnsi="Times New Roman" w:cs="Times New Roman"/>
+        </w:rPr>
+        <w:t>pandas_ta</w:t>
+      </w:r>
+      <w:proofErr w:type="spellEnd"/>
+      <w:r>
+        <w:rPr>
+          <w:rFonts w:ascii="Times New Roman" w:hAnsi="Times New Roman" w:cs="Times New Roman"/>
+        </w:rPr>
+        <w:t>)</w:t>
+      </w:r>
+      <w:r>
+        <w:rPr>
+          <w:rFonts w:ascii="Times New Roman" w:hAnsi="Times New Roman" w:cs="Times New Roman"/>
+        </w:rPr>
+        <w:t>.</w:t>
+      </w:r>
+    </w:p>
+    <w:p>
+      <w:pPr>
+        <w:ind w:left="360"/>
+        <w:rPr>
+          <w:rFonts w:ascii="Times New Roman" w:hAnsi="Times New Roman" w:cs="Times New Roman"/>
+        </w:rPr>
+      </w:pPr>
+    </w:p>
+    <w:p>
+      <w:pPr>
+        <w:rPr>
+          <w:rFonts w:ascii="Times New Roman" w:hAnsi="Times New Roman" w:cs="Times New Roman"/>
+          <w:b/>
+          <w:bCs/>
+        </w:rPr>
+      </w:pPr>
+      <w:r>
+        <w:rPr>
+          <w:rFonts w:ascii="Times New Roman" w:hAnsi="Times New Roman" w:cs="Times New Roman"/>
+          <w:b/>
+          <w:bCs/>
+        </w:rPr>
+        <w:t>Next Tasks:</w:t>
+      </w:r>
+    </w:p>
+    <w:p>
+      <w:pPr>
+        <w:pStyle w:val="ListParagraph"/>
+        <w:numPr>
+          <w:ilvl w:val="0"/>
+          <w:numId w:val="13"/>
+        </w:numPr>
+        <w:rPr>
+          <w:rFonts w:ascii="Times New Roman" w:hAnsi="Times New Roman" w:cs="Times New Roman"/>
+        </w:rPr>
+      </w:pPr>
+      <w:r>
+        <w:rPr>
+          <w:rFonts w:ascii="Times New Roman" w:hAnsi="Times New Roman" w:cs="Times New Roman"/>
+        </w:rPr>
+        <w:t>Train test</w:t>
+      </w:r>
+      <w:r>
+        <w:rPr>
+          <w:rFonts w:ascii="Times New Roman" w:hAnsi="Times New Roman" w:cs="Times New Roman"/>
+        </w:rPr>
+        <w:t xml:space="preserve"> </w:t>
+      </w:r>
+      <w:r>
+        <w:rPr>
+          <w:rFonts w:ascii="Times New Roman" w:hAnsi="Times New Roman" w:cs="Times New Roman"/>
+        </w:rPr>
+        <w:t>s</w:t>
+      </w:r>
+      <w:r>
+        <w:rPr>
+          <w:rFonts w:ascii="Times New Roman" w:hAnsi="Times New Roman" w:cs="Times New Roman"/>
+        </w:rPr>
+        <w:t>plit</w:t>
       </w:r>
     </w:p>
     <w:sectPr>
@@ -1942,9 +3156,9 @@
     </w:lvl>
   </w:abstractNum>
   <w:abstractNum w:abstractNumId="1" w15:restartNumberingAfterBreak="0">
-    <w:nsid w:val="2CC66FF8"/>
+    <w:nsid w:val="160B6283"/>
     <w:multiLevelType w:val="hybridMultilevel"/>
-    <w:tmpl w:val="A03A568C"/>
+    <w:tmpl w:val="CD888AD6"/>
     <w:lvl w:ilvl="0" w:tplc="0409000F">
       <w:start w:val="1"/>
       <w:numFmt w:val="decimal"/>
@@ -2028,6 +3242,92 @@
     </w:lvl>
   </w:abstractNum>
   <w:abstractNum w:abstractNumId="2" w15:restartNumberingAfterBreak="0">
+    <w:nsid w:val="2CC66FF8"/>
+    <w:multiLevelType w:val="hybridMultilevel"/>
+    <w:tmpl w:val="8AE28230"/>
+    <w:lvl w:ilvl="0" w:tplc="0409000F">
+      <w:start w:val="1"/>
+      <w:numFmt w:val="decimal"/>
+      <w:lvlText w:val="%1."/>
+      <w:lvlJc w:val="left"/>
+      <w:pPr>
+        <w:ind w:left="720" w:hanging="360"/>
+      </w:pPr>
+    </w:lvl>
+    <w:lvl w:ilvl="1" w:tplc="04090019" w:tentative="1">
+      <w:start w:val="1"/>
+      <w:numFmt w:val="lowerLetter"/>
+      <w:lvlText w:val="%2."/>
+      <w:lvlJc w:val="left"/>
+      <w:pPr>
+        <w:ind w:left="1440" w:hanging="360"/>
+      </w:pPr>
+    </w:lvl>
+    <w:lvl w:ilvl="2" w:tplc="0409001B" w:tentative="1">
+      <w:start w:val="1"/>
+      <w:numFmt w:val="lowerRoman"/>
+      <w:lvlText w:val="%3."/>
+      <w:lvlJc w:val="right"/>
+      <w:pPr>
+        <w:ind w:left="2160" w:hanging="180"/>
+      </w:pPr>
+    </w:lvl>
+    <w:lvl w:ilvl="3" w:tplc="0409000F" w:tentative="1">
+      <w:start w:val="1"/>
+      <w:numFmt w:val="decimal"/>
+      <w:lvlText w:val="%4."/>
+      <w:lvlJc w:val="left"/>
+      <w:pPr>
+        <w:ind w:left="2880" w:hanging="360"/>
+      </w:pPr>
+    </w:lvl>
+    <w:lvl w:ilvl="4" w:tplc="04090019" w:tentative="1">
+      <w:start w:val="1"/>
+      <w:numFmt w:val="lowerLetter"/>
+      <w:lvlText w:val="%5."/>
+      <w:lvlJc w:val="left"/>
+      <w:pPr>
+        <w:ind w:left="3600" w:hanging="360"/>
+      </w:pPr>
+    </w:lvl>
+    <w:lvl w:ilvl="5" w:tplc="0409001B" w:tentative="1">
+      <w:start w:val="1"/>
+      <w:numFmt w:val="lowerRoman"/>
+      <w:lvlText w:val="%6."/>
+      <w:lvlJc w:val="right"/>
+      <w:pPr>
+        <w:ind w:left="4320" w:hanging="180"/>
+      </w:pPr>
+    </w:lvl>
+    <w:lvl w:ilvl="6" w:tplc="0409000F" w:tentative="1">
+      <w:start w:val="1"/>
+      <w:numFmt w:val="decimal"/>
+      <w:lvlText w:val="%7."/>
+      <w:lvlJc w:val="left"/>
+      <w:pPr>
+        <w:ind w:left="5040" w:hanging="360"/>
+      </w:pPr>
+    </w:lvl>
+    <w:lvl w:ilvl="7" w:tplc="04090019" w:tentative="1">
+      <w:start w:val="1"/>
+      <w:numFmt w:val="lowerLetter"/>
+      <w:lvlText w:val="%8."/>
+      <w:lvlJc w:val="left"/>
+      <w:pPr>
+        <w:ind w:left="5760" w:hanging="360"/>
+      </w:pPr>
+    </w:lvl>
+    <w:lvl w:ilvl="8" w:tplc="0409001B" w:tentative="1">
+      <w:start w:val="1"/>
+      <w:numFmt w:val="lowerRoman"/>
+      <w:lvlText w:val="%9."/>
+      <w:lvlJc w:val="right"/>
+      <w:pPr>
+        <w:ind w:left="6480" w:hanging="180"/>
+      </w:pPr>
+    </w:lvl>
+  </w:abstractNum>
+  <w:abstractNum w:abstractNumId="3" w15:restartNumberingAfterBreak="0">
     <w:nsid w:val="2DFD78D1"/>
     <w:multiLevelType w:val="hybridMultilevel"/>
     <w:tmpl w:val="97A2A16E"/>
@@ -2140,7 +3440,179 @@
       </w:rPr>
     </w:lvl>
   </w:abstractNum>
-  <w:abstractNum w:abstractNumId="3" w15:restartNumberingAfterBreak="0">
+  <w:abstractNum w:abstractNumId="4" w15:restartNumberingAfterBreak="0">
+    <w:nsid w:val="35455D58"/>
+    <w:multiLevelType w:val="hybridMultilevel"/>
+    <w:tmpl w:val="DEA26D1E"/>
+    <w:lvl w:ilvl="0" w:tplc="FFFFFFFF">
+      <w:start w:val="1"/>
+      <w:numFmt w:val="decimal"/>
+      <w:lvlText w:val="%1."/>
+      <w:lvlJc w:val="left"/>
+      <w:pPr>
+        <w:ind w:left="720" w:hanging="360"/>
+      </w:pPr>
+    </w:lvl>
+    <w:lvl w:ilvl="1" w:tplc="FFFFFFFF">
+      <w:start w:val="1"/>
+      <w:numFmt w:val="lowerLetter"/>
+      <w:lvlText w:val="%2."/>
+      <w:lvlJc w:val="left"/>
+      <w:pPr>
+        <w:ind w:left="1440" w:hanging="360"/>
+      </w:pPr>
+    </w:lvl>
+    <w:lvl w:ilvl="2" w:tplc="FFFFFFFF" w:tentative="1">
+      <w:start w:val="1"/>
+      <w:numFmt w:val="lowerRoman"/>
+      <w:lvlText w:val="%3."/>
+      <w:lvlJc w:val="right"/>
+      <w:pPr>
+        <w:ind w:left="2160" w:hanging="180"/>
+      </w:pPr>
+    </w:lvl>
+    <w:lvl w:ilvl="3" w:tplc="FFFFFFFF" w:tentative="1">
+      <w:start w:val="1"/>
+      <w:numFmt w:val="decimal"/>
+      <w:lvlText w:val="%4."/>
+      <w:lvlJc w:val="left"/>
+      <w:pPr>
+        <w:ind w:left="2880" w:hanging="360"/>
+      </w:pPr>
+    </w:lvl>
+    <w:lvl w:ilvl="4" w:tplc="FFFFFFFF" w:tentative="1">
+      <w:start w:val="1"/>
+      <w:numFmt w:val="lowerLetter"/>
+      <w:lvlText w:val="%5."/>
+      <w:lvlJc w:val="left"/>
+      <w:pPr>
+        <w:ind w:left="3600" w:hanging="360"/>
+      </w:pPr>
+    </w:lvl>
+    <w:lvl w:ilvl="5" w:tplc="FFFFFFFF" w:tentative="1">
+      <w:start w:val="1"/>
+      <w:numFmt w:val="lowerRoman"/>
+      <w:lvlText w:val="%6."/>
+      <w:lvlJc w:val="right"/>
+      <w:pPr>
+        <w:ind w:left="4320" w:hanging="180"/>
+      </w:pPr>
+    </w:lvl>
+    <w:lvl w:ilvl="6" w:tplc="FFFFFFFF" w:tentative="1">
+      <w:start w:val="1"/>
+      <w:numFmt w:val="decimal"/>
+      <w:lvlText w:val="%7."/>
+      <w:lvlJc w:val="left"/>
+      <w:pPr>
+        <w:ind w:left="5040" w:hanging="360"/>
+      </w:pPr>
+    </w:lvl>
+    <w:lvl w:ilvl="7" w:tplc="FFFFFFFF" w:tentative="1">
+      <w:start w:val="1"/>
+      <w:numFmt w:val="lowerLetter"/>
+      <w:lvlText w:val="%8."/>
+      <w:lvlJc w:val="left"/>
+      <w:pPr>
+        <w:ind w:left="5760" w:hanging="360"/>
+      </w:pPr>
+    </w:lvl>
+    <w:lvl w:ilvl="8" w:tplc="FFFFFFFF" w:tentative="1">
+      <w:start w:val="1"/>
+      <w:numFmt w:val="lowerRoman"/>
+      <w:lvlText w:val="%9."/>
+      <w:lvlJc w:val="right"/>
+      <w:pPr>
+        <w:ind w:left="6480" w:hanging="180"/>
+      </w:pPr>
+    </w:lvl>
+  </w:abstractNum>
+  <w:abstractNum w:abstractNumId="5" w15:restartNumberingAfterBreak="0">
+    <w:nsid w:val="38031984"/>
+    <w:multiLevelType w:val="hybridMultilevel"/>
+    <w:tmpl w:val="71E00564"/>
+    <w:lvl w:ilvl="0" w:tplc="FFFFFFFF">
+      <w:start w:val="1"/>
+      <w:numFmt w:val="decimal"/>
+      <w:lvlText w:val="%1."/>
+      <w:lvlJc w:val="left"/>
+      <w:pPr>
+        <w:ind w:left="720" w:hanging="360"/>
+      </w:pPr>
+    </w:lvl>
+    <w:lvl w:ilvl="1" w:tplc="FFFFFFFF">
+      <w:start w:val="1"/>
+      <w:numFmt w:val="lowerLetter"/>
+      <w:lvlText w:val="%2."/>
+      <w:lvlJc w:val="left"/>
+      <w:pPr>
+        <w:ind w:left="1440" w:hanging="360"/>
+      </w:pPr>
+    </w:lvl>
+    <w:lvl w:ilvl="2" w:tplc="FFFFFFFF" w:tentative="1">
+      <w:start w:val="1"/>
+      <w:numFmt w:val="lowerRoman"/>
+      <w:lvlText w:val="%3."/>
+      <w:lvlJc w:val="right"/>
+      <w:pPr>
+        <w:ind w:left="2160" w:hanging="180"/>
+      </w:pPr>
+    </w:lvl>
+    <w:lvl w:ilvl="3" w:tplc="FFFFFFFF" w:tentative="1">
+      <w:start w:val="1"/>
+      <w:numFmt w:val="decimal"/>
+      <w:lvlText w:val="%4."/>
+      <w:lvlJc w:val="left"/>
+      <w:pPr>
+        <w:ind w:left="2880" w:hanging="360"/>
+      </w:pPr>
+    </w:lvl>
+    <w:lvl w:ilvl="4" w:tplc="FFFFFFFF" w:tentative="1">
+      <w:start w:val="1"/>
+      <w:numFmt w:val="lowerLetter"/>
+      <w:lvlText w:val="%5."/>
+      <w:lvlJc w:val="left"/>
+      <w:pPr>
+        <w:ind w:left="3600" w:hanging="360"/>
+      </w:pPr>
+    </w:lvl>
+    <w:lvl w:ilvl="5" w:tplc="FFFFFFFF" w:tentative="1">
+      <w:start w:val="1"/>
+      <w:numFmt w:val="lowerRoman"/>
+      <w:lvlText w:val="%6."/>
+      <w:lvlJc w:val="right"/>
+      <w:pPr>
+        <w:ind w:left="4320" w:hanging="180"/>
+      </w:pPr>
+    </w:lvl>
+    <w:lvl w:ilvl="6" w:tplc="FFFFFFFF" w:tentative="1">
+      <w:start w:val="1"/>
+      <w:numFmt w:val="decimal"/>
+      <w:lvlText w:val="%7."/>
+      <w:lvlJc w:val="left"/>
+      <w:pPr>
+        <w:ind w:left="5040" w:hanging="360"/>
+      </w:pPr>
+    </w:lvl>
+    <w:lvl w:ilvl="7" w:tplc="FFFFFFFF" w:tentative="1">
+      <w:start w:val="1"/>
+      <w:numFmt w:val="lowerLetter"/>
+      <w:lvlText w:val="%8."/>
+      <w:lvlJc w:val="left"/>
+      <w:pPr>
+        <w:ind w:left="5760" w:hanging="360"/>
+      </w:pPr>
+    </w:lvl>
+    <w:lvl w:ilvl="8" w:tplc="FFFFFFFF" w:tentative="1">
+      <w:start w:val="1"/>
+      <w:numFmt w:val="lowerRoman"/>
+      <w:lvlText w:val="%9."/>
+      <w:lvlJc w:val="right"/>
+      <w:pPr>
+        <w:ind w:left="6480" w:hanging="180"/>
+      </w:pPr>
+    </w:lvl>
+  </w:abstractNum>
+  <w:abstractNum w:abstractNumId="6" w15:restartNumberingAfterBreak="0">
     <w:nsid w:val="3D593B69"/>
     <w:multiLevelType w:val="multilevel"/>
     <w:tmpl w:val="FAD0CA48"/>
@@ -2289,7 +3761,7 @@
       </w:rPr>
     </w:lvl>
   </w:abstractNum>
-  <w:abstractNum w:abstractNumId="4" w15:restartNumberingAfterBreak="0">
+  <w:abstractNum w:abstractNumId="7" w15:restartNumberingAfterBreak="0">
     <w:nsid w:val="3F932A79"/>
     <w:multiLevelType w:val="hybridMultilevel"/>
     <w:tmpl w:val="7FD0B296"/>
@@ -2378,7 +3850,93 @@
       </w:pPr>
     </w:lvl>
   </w:abstractNum>
-  <w:abstractNum w:abstractNumId="5" w15:restartNumberingAfterBreak="0">
+  <w:abstractNum w:abstractNumId="8" w15:restartNumberingAfterBreak="0">
+    <w:nsid w:val="3FD34ADE"/>
+    <w:multiLevelType w:val="hybridMultilevel"/>
+    <w:tmpl w:val="F690A1F6"/>
+    <w:lvl w:ilvl="0" w:tplc="0409000F">
+      <w:start w:val="1"/>
+      <w:numFmt w:val="decimal"/>
+      <w:lvlText w:val="%1."/>
+      <w:lvlJc w:val="left"/>
+      <w:pPr>
+        <w:ind w:left="720" w:hanging="360"/>
+      </w:pPr>
+    </w:lvl>
+    <w:lvl w:ilvl="1" w:tplc="04090019" w:tentative="1">
+      <w:start w:val="1"/>
+      <w:numFmt w:val="lowerLetter"/>
+      <w:lvlText w:val="%2."/>
+      <w:lvlJc w:val="left"/>
+      <w:pPr>
+        <w:ind w:left="1440" w:hanging="360"/>
+      </w:pPr>
+    </w:lvl>
+    <w:lvl w:ilvl="2" w:tplc="0409001B" w:tentative="1">
+      <w:start w:val="1"/>
+      <w:numFmt w:val="lowerRoman"/>
+      <w:lvlText w:val="%3."/>
+      <w:lvlJc w:val="right"/>
+      <w:pPr>
+        <w:ind w:left="2160" w:hanging="180"/>
+      </w:pPr>
+    </w:lvl>
+    <w:lvl w:ilvl="3" w:tplc="0409000F" w:tentative="1">
+      <w:start w:val="1"/>
+      <w:numFmt w:val="decimal"/>
+      <w:lvlText w:val="%4."/>
+      <w:lvlJc w:val="left"/>
+      <w:pPr>
+        <w:ind w:left="2880" w:hanging="360"/>
+      </w:pPr>
+    </w:lvl>
+    <w:lvl w:ilvl="4" w:tplc="04090019" w:tentative="1">
+      <w:start w:val="1"/>
+      <w:numFmt w:val="lowerLetter"/>
+      <w:lvlText w:val="%5."/>
+      <w:lvlJc w:val="left"/>
+      <w:pPr>
+        <w:ind w:left="3600" w:hanging="360"/>
+      </w:pPr>
+    </w:lvl>
+    <w:lvl w:ilvl="5" w:tplc="0409001B" w:tentative="1">
+      <w:start w:val="1"/>
+      <w:numFmt w:val="lowerRoman"/>
+      <w:lvlText w:val="%6."/>
+      <w:lvlJc w:val="right"/>
+      <w:pPr>
+        <w:ind w:left="4320" w:hanging="180"/>
+      </w:pPr>
+    </w:lvl>
+    <w:lvl w:ilvl="6" w:tplc="0409000F" w:tentative="1">
+      <w:start w:val="1"/>
+      <w:numFmt w:val="decimal"/>
+      <w:lvlText w:val="%7."/>
+      <w:lvlJc w:val="left"/>
+      <w:pPr>
+        <w:ind w:left="5040" w:hanging="360"/>
+      </w:pPr>
+    </w:lvl>
+    <w:lvl w:ilvl="7" w:tplc="04090019" w:tentative="1">
+      <w:start w:val="1"/>
+      <w:numFmt w:val="lowerLetter"/>
+      <w:lvlText w:val="%8."/>
+      <w:lvlJc w:val="left"/>
+      <w:pPr>
+        <w:ind w:left="5760" w:hanging="360"/>
+      </w:pPr>
+    </w:lvl>
+    <w:lvl w:ilvl="8" w:tplc="0409001B" w:tentative="1">
+      <w:start w:val="1"/>
+      <w:numFmt w:val="lowerRoman"/>
+      <w:lvlText w:val="%9."/>
+      <w:lvlJc w:val="right"/>
+      <w:pPr>
+        <w:ind w:left="6480" w:hanging="180"/>
+      </w:pPr>
+    </w:lvl>
+  </w:abstractNum>
+  <w:abstractNum w:abstractNumId="9" w15:restartNumberingAfterBreak="0">
     <w:nsid w:val="41FB04F2"/>
     <w:multiLevelType w:val="hybridMultilevel"/>
     <w:tmpl w:val="C032D17C"/>
@@ -2464,7 +4022,93 @@
       </w:pPr>
     </w:lvl>
   </w:abstractNum>
-  <w:abstractNum w:abstractNumId="6" w15:restartNumberingAfterBreak="0">
+  <w:abstractNum w:abstractNumId="10" w15:restartNumberingAfterBreak="0">
+    <w:nsid w:val="42FA42C4"/>
+    <w:multiLevelType w:val="hybridMultilevel"/>
+    <w:tmpl w:val="4E521BBA"/>
+    <w:lvl w:ilvl="0" w:tplc="0409000F">
+      <w:start w:val="1"/>
+      <w:numFmt w:val="decimal"/>
+      <w:lvlText w:val="%1."/>
+      <w:lvlJc w:val="left"/>
+      <w:pPr>
+        <w:ind w:left="720" w:hanging="360"/>
+      </w:pPr>
+    </w:lvl>
+    <w:lvl w:ilvl="1" w:tplc="04090019" w:tentative="1">
+      <w:start w:val="1"/>
+      <w:numFmt w:val="lowerLetter"/>
+      <w:lvlText w:val="%2."/>
+      <w:lvlJc w:val="left"/>
+      <w:pPr>
+        <w:ind w:left="1440" w:hanging="360"/>
+      </w:pPr>
+    </w:lvl>
+    <w:lvl w:ilvl="2" w:tplc="0409001B" w:tentative="1">
+      <w:start w:val="1"/>
+      <w:numFmt w:val="lowerRoman"/>
+      <w:lvlText w:val="%3."/>
+      <w:lvlJc w:val="right"/>
+      <w:pPr>
+        <w:ind w:left="2160" w:hanging="180"/>
+      </w:pPr>
+    </w:lvl>
+    <w:lvl w:ilvl="3" w:tplc="0409000F" w:tentative="1">
+      <w:start w:val="1"/>
+      <w:numFmt w:val="decimal"/>
+      <w:lvlText w:val="%4."/>
+      <w:lvlJc w:val="left"/>
+      <w:pPr>
+        <w:ind w:left="2880" w:hanging="360"/>
+      </w:pPr>
+    </w:lvl>
+    <w:lvl w:ilvl="4" w:tplc="04090019" w:tentative="1">
+      <w:start w:val="1"/>
+      <w:numFmt w:val="lowerLetter"/>
+      <w:lvlText w:val="%5."/>
+      <w:lvlJc w:val="left"/>
+      <w:pPr>
+        <w:ind w:left="3600" w:hanging="360"/>
+      </w:pPr>
+    </w:lvl>
+    <w:lvl w:ilvl="5" w:tplc="0409001B" w:tentative="1">
+      <w:start w:val="1"/>
+      <w:numFmt w:val="lowerRoman"/>
+      <w:lvlText w:val="%6."/>
+      <w:lvlJc w:val="right"/>
+      <w:pPr>
+        <w:ind w:left="4320" w:hanging="180"/>
+      </w:pPr>
+    </w:lvl>
+    <w:lvl w:ilvl="6" w:tplc="0409000F" w:tentative="1">
+      <w:start w:val="1"/>
+      <w:numFmt w:val="decimal"/>
+      <w:lvlText w:val="%7."/>
+      <w:lvlJc w:val="left"/>
+      <w:pPr>
+        <w:ind w:left="5040" w:hanging="360"/>
+      </w:pPr>
+    </w:lvl>
+    <w:lvl w:ilvl="7" w:tplc="04090019" w:tentative="1">
+      <w:start w:val="1"/>
+      <w:numFmt w:val="lowerLetter"/>
+      <w:lvlText w:val="%8."/>
+      <w:lvlJc w:val="left"/>
+      <w:pPr>
+        <w:ind w:left="5760" w:hanging="360"/>
+      </w:pPr>
+    </w:lvl>
+    <w:lvl w:ilvl="8" w:tplc="0409001B" w:tentative="1">
+      <w:start w:val="1"/>
+      <w:numFmt w:val="lowerRoman"/>
+      <w:lvlText w:val="%9."/>
+      <w:lvlJc w:val="right"/>
+      <w:pPr>
+        <w:ind w:left="6480" w:hanging="180"/>
+      </w:pPr>
+    </w:lvl>
+  </w:abstractNum>
+  <w:abstractNum w:abstractNumId="11" w15:restartNumberingAfterBreak="0">
     <w:nsid w:val="4E334EBF"/>
     <w:multiLevelType w:val="hybridMultilevel"/>
     <w:tmpl w:val="A03A568C"/>
@@ -2550,7 +4194,93 @@
       </w:pPr>
     </w:lvl>
   </w:abstractNum>
-  <w:abstractNum w:abstractNumId="7" w15:restartNumberingAfterBreak="0">
+  <w:abstractNum w:abstractNumId="12" w15:restartNumberingAfterBreak="0">
+    <w:nsid w:val="59597296"/>
+    <w:multiLevelType w:val="hybridMultilevel"/>
+    <w:tmpl w:val="DEB0C918"/>
+    <w:lvl w:ilvl="0" w:tplc="FFFFFFFF">
+      <w:start w:val="1"/>
+      <w:numFmt w:val="decimal"/>
+      <w:lvlText w:val="%1."/>
+      <w:lvlJc w:val="left"/>
+      <w:pPr>
+        <w:ind w:left="720" w:hanging="360"/>
+      </w:pPr>
+    </w:lvl>
+    <w:lvl w:ilvl="1" w:tplc="FFFFFFFF" w:tentative="1">
+      <w:start w:val="1"/>
+      <w:numFmt w:val="lowerLetter"/>
+      <w:lvlText w:val="%2."/>
+      <w:lvlJc w:val="left"/>
+      <w:pPr>
+        <w:ind w:left="1440" w:hanging="360"/>
+      </w:pPr>
+    </w:lvl>
+    <w:lvl w:ilvl="2" w:tplc="FFFFFFFF" w:tentative="1">
+      <w:start w:val="1"/>
+      <w:numFmt w:val="lowerRoman"/>
+      <w:lvlText w:val="%3."/>
+      <w:lvlJc w:val="right"/>
+      <w:pPr>
+        <w:ind w:left="2160" w:hanging="180"/>
+      </w:pPr>
+    </w:lvl>
+    <w:lvl w:ilvl="3" w:tplc="FFFFFFFF" w:tentative="1">
+      <w:start w:val="1"/>
+      <w:numFmt w:val="decimal"/>
+      <w:lvlText w:val="%4."/>
+      <w:lvlJc w:val="left"/>
+      <w:pPr>
+        <w:ind w:left="2880" w:hanging="360"/>
+      </w:pPr>
+    </w:lvl>
+    <w:lvl w:ilvl="4" w:tplc="FFFFFFFF" w:tentative="1">
+      <w:start w:val="1"/>
+      <w:numFmt w:val="lowerLetter"/>
+      <w:lvlText w:val="%5."/>
+      <w:lvlJc w:val="left"/>
+      <w:pPr>
+        <w:ind w:left="3600" w:hanging="360"/>
+      </w:pPr>
+    </w:lvl>
+    <w:lvl w:ilvl="5" w:tplc="FFFFFFFF" w:tentative="1">
+      <w:start w:val="1"/>
+      <w:numFmt w:val="lowerRoman"/>
+      <w:lvlText w:val="%6."/>
+      <w:lvlJc w:val="right"/>
+      <w:pPr>
+        <w:ind w:left="4320" w:hanging="180"/>
+      </w:pPr>
+    </w:lvl>
+    <w:lvl w:ilvl="6" w:tplc="FFFFFFFF" w:tentative="1">
+      <w:start w:val="1"/>
+      <w:numFmt w:val="decimal"/>
+      <w:lvlText w:val="%7."/>
+      <w:lvlJc w:val="left"/>
+      <w:pPr>
+        <w:ind w:left="5040" w:hanging="360"/>
+      </w:pPr>
+    </w:lvl>
+    <w:lvl w:ilvl="7" w:tplc="FFFFFFFF" w:tentative="1">
+      <w:start w:val="1"/>
+      <w:numFmt w:val="lowerLetter"/>
+      <w:lvlText w:val="%8."/>
+      <w:lvlJc w:val="left"/>
+      <w:pPr>
+        <w:ind w:left="5760" w:hanging="360"/>
+      </w:pPr>
+    </w:lvl>
+    <w:lvl w:ilvl="8" w:tplc="FFFFFFFF" w:tentative="1">
+      <w:start w:val="1"/>
+      <w:numFmt w:val="lowerRoman"/>
+      <w:lvlText w:val="%9."/>
+      <w:lvlJc w:val="right"/>
+      <w:pPr>
+        <w:ind w:left="6480" w:hanging="180"/>
+      </w:pPr>
+    </w:lvl>
+  </w:abstractNum>
+  <w:abstractNum w:abstractNumId="13" w15:restartNumberingAfterBreak="0">
     <w:nsid w:val="66260607"/>
     <w:multiLevelType w:val="hybridMultilevel"/>
     <w:tmpl w:val="A03A568C"/>
@@ -2636,7 +4366,93 @@
       </w:pPr>
     </w:lvl>
   </w:abstractNum>
-  <w:abstractNum w:abstractNumId="8" w15:restartNumberingAfterBreak="0">
+  <w:abstractNum w:abstractNumId="14" w15:restartNumberingAfterBreak="0">
+    <w:nsid w:val="6FFB4B05"/>
+    <w:multiLevelType w:val="hybridMultilevel"/>
+    <w:tmpl w:val="0EF42C6A"/>
+    <w:lvl w:ilvl="0" w:tplc="0409000F">
+      <w:start w:val="1"/>
+      <w:numFmt w:val="decimal"/>
+      <w:lvlText w:val="%1."/>
+      <w:lvlJc w:val="left"/>
+      <w:pPr>
+        <w:ind w:left="720" w:hanging="360"/>
+      </w:pPr>
+    </w:lvl>
+    <w:lvl w:ilvl="1" w:tplc="04090019" w:tentative="1">
+      <w:start w:val="1"/>
+      <w:numFmt w:val="lowerLetter"/>
+      <w:lvlText w:val="%2."/>
+      <w:lvlJc w:val="left"/>
+      <w:pPr>
+        <w:ind w:left="1440" w:hanging="360"/>
+      </w:pPr>
+    </w:lvl>
+    <w:lvl w:ilvl="2" w:tplc="0409001B" w:tentative="1">
+      <w:start w:val="1"/>
+      <w:numFmt w:val="lowerRoman"/>
+      <w:lvlText w:val="%3."/>
+      <w:lvlJc w:val="right"/>
+      <w:pPr>
+        <w:ind w:left="2160" w:hanging="180"/>
+      </w:pPr>
+    </w:lvl>
+    <w:lvl w:ilvl="3" w:tplc="0409000F" w:tentative="1">
+      <w:start w:val="1"/>
+      <w:numFmt w:val="decimal"/>
+      <w:lvlText w:val="%4."/>
+      <w:lvlJc w:val="left"/>
+      <w:pPr>
+        <w:ind w:left="2880" w:hanging="360"/>
+      </w:pPr>
+    </w:lvl>
+    <w:lvl w:ilvl="4" w:tplc="04090019" w:tentative="1">
+      <w:start w:val="1"/>
+      <w:numFmt w:val="lowerLetter"/>
+      <w:lvlText w:val="%5."/>
+      <w:lvlJc w:val="left"/>
+      <w:pPr>
+        <w:ind w:left="3600" w:hanging="360"/>
+      </w:pPr>
+    </w:lvl>
+    <w:lvl w:ilvl="5" w:tplc="0409001B" w:tentative="1">
+      <w:start w:val="1"/>
+      <w:numFmt w:val="lowerRoman"/>
+      <w:lvlText w:val="%6."/>
+      <w:lvlJc w:val="right"/>
+      <w:pPr>
+        <w:ind w:left="4320" w:hanging="180"/>
+      </w:pPr>
+    </w:lvl>
+    <w:lvl w:ilvl="6" w:tplc="0409000F" w:tentative="1">
+      <w:start w:val="1"/>
+      <w:numFmt w:val="decimal"/>
+      <w:lvlText w:val="%7."/>
+      <w:lvlJc w:val="left"/>
+      <w:pPr>
+        <w:ind w:left="5040" w:hanging="360"/>
+      </w:pPr>
+    </w:lvl>
+    <w:lvl w:ilvl="7" w:tplc="04090019" w:tentative="1">
+      <w:start w:val="1"/>
+      <w:numFmt w:val="lowerLetter"/>
+      <w:lvlText w:val="%8."/>
+      <w:lvlJc w:val="left"/>
+      <w:pPr>
+        <w:ind w:left="5760" w:hanging="360"/>
+      </w:pPr>
+    </w:lvl>
+    <w:lvl w:ilvl="8" w:tplc="0409001B" w:tentative="1">
+      <w:start w:val="1"/>
+      <w:numFmt w:val="lowerRoman"/>
+      <w:lvlText w:val="%9."/>
+      <w:lvlJc w:val="right"/>
+      <w:pPr>
+        <w:ind w:left="6480" w:hanging="180"/>
+      </w:pPr>
+    </w:lvl>
+  </w:abstractNum>
+  <w:abstractNum w:abstractNumId="15" w15:restartNumberingAfterBreak="0">
     <w:nsid w:val="71C56A82"/>
     <w:multiLevelType w:val="hybridMultilevel"/>
     <w:tmpl w:val="9C04B582"/>
@@ -2722,32 +4538,142 @@
       </w:pPr>
     </w:lvl>
   </w:abstractNum>
+  <w:abstractNum w:abstractNumId="16" w15:restartNumberingAfterBreak="0">
+    <w:nsid w:val="725168E3"/>
+    <w:multiLevelType w:val="hybridMultilevel"/>
+    <w:tmpl w:val="3E9066DE"/>
+    <w:lvl w:ilvl="0" w:tplc="0409000F">
+      <w:start w:val="1"/>
+      <w:numFmt w:val="decimal"/>
+      <w:lvlText w:val="%1."/>
+      <w:lvlJc w:val="left"/>
+      <w:pPr>
+        <w:ind w:left="720" w:hanging="360"/>
+      </w:pPr>
+    </w:lvl>
+    <w:lvl w:ilvl="1" w:tplc="04090019" w:tentative="1">
+      <w:start w:val="1"/>
+      <w:numFmt w:val="lowerLetter"/>
+      <w:lvlText w:val="%2."/>
+      <w:lvlJc w:val="left"/>
+      <w:pPr>
+        <w:ind w:left="1440" w:hanging="360"/>
+      </w:pPr>
+    </w:lvl>
+    <w:lvl w:ilvl="2" w:tplc="0409001B" w:tentative="1">
+      <w:start w:val="1"/>
+      <w:numFmt w:val="lowerRoman"/>
+      <w:lvlText w:val="%3."/>
+      <w:lvlJc w:val="right"/>
+      <w:pPr>
+        <w:ind w:left="2160" w:hanging="180"/>
+      </w:pPr>
+    </w:lvl>
+    <w:lvl w:ilvl="3" w:tplc="0409000F" w:tentative="1">
+      <w:start w:val="1"/>
+      <w:numFmt w:val="decimal"/>
+      <w:lvlText w:val="%4."/>
+      <w:lvlJc w:val="left"/>
+      <w:pPr>
+        <w:ind w:left="2880" w:hanging="360"/>
+      </w:pPr>
+    </w:lvl>
+    <w:lvl w:ilvl="4" w:tplc="04090019" w:tentative="1">
+      <w:start w:val="1"/>
+      <w:numFmt w:val="lowerLetter"/>
+      <w:lvlText w:val="%5."/>
+      <w:lvlJc w:val="left"/>
+      <w:pPr>
+        <w:ind w:left="3600" w:hanging="360"/>
+      </w:pPr>
+    </w:lvl>
+    <w:lvl w:ilvl="5" w:tplc="0409001B" w:tentative="1">
+      <w:start w:val="1"/>
+      <w:numFmt w:val="lowerRoman"/>
+      <w:lvlText w:val="%6."/>
+      <w:lvlJc w:val="right"/>
+      <w:pPr>
+        <w:ind w:left="4320" w:hanging="180"/>
+      </w:pPr>
+    </w:lvl>
+    <w:lvl w:ilvl="6" w:tplc="0409000F" w:tentative="1">
+      <w:start w:val="1"/>
+      <w:numFmt w:val="decimal"/>
+      <w:lvlText w:val="%7."/>
+      <w:lvlJc w:val="left"/>
+      <w:pPr>
+        <w:ind w:left="5040" w:hanging="360"/>
+      </w:pPr>
+    </w:lvl>
+    <w:lvl w:ilvl="7" w:tplc="04090019" w:tentative="1">
+      <w:start w:val="1"/>
+      <w:numFmt w:val="lowerLetter"/>
+      <w:lvlText w:val="%8."/>
+      <w:lvlJc w:val="left"/>
+      <w:pPr>
+        <w:ind w:left="5760" w:hanging="360"/>
+      </w:pPr>
+    </w:lvl>
+    <w:lvl w:ilvl="8" w:tplc="0409001B" w:tentative="1">
+      <w:start w:val="1"/>
+      <w:numFmt w:val="lowerRoman"/>
+      <w:lvlText w:val="%9."/>
+      <w:lvlJc w:val="right"/>
+      <w:pPr>
+        <w:ind w:left="6480" w:hanging="180"/>
+      </w:pPr>
+    </w:lvl>
+  </w:abstractNum>
   <w:num w:numId="1" w16cid:durableId="1249924779">
-    <w:abstractNumId w:val="2"/>
+    <w:abstractNumId w:val="3"/>
   </w:num>
   <w:num w:numId="2" w16cid:durableId="347680460">
-    <w:abstractNumId w:val="8"/>
+    <w:abstractNumId w:val="15"/>
   </w:num>
   <w:num w:numId="3" w16cid:durableId="507598300">
     <w:abstractNumId w:val="0"/>
   </w:num>
   <w:num w:numId="4" w16cid:durableId="1633049624">
-    <w:abstractNumId w:val="3"/>
+    <w:abstractNumId w:val="6"/>
   </w:num>
   <w:num w:numId="5" w16cid:durableId="1845702038">
+    <w:abstractNumId w:val="7"/>
+  </w:num>
+  <w:num w:numId="6" w16cid:durableId="905607304">
+    <w:abstractNumId w:val="9"/>
+  </w:num>
+  <w:num w:numId="7" w16cid:durableId="1386949422">
+    <w:abstractNumId w:val="2"/>
+  </w:num>
+  <w:num w:numId="8" w16cid:durableId="1246379243">
+    <w:abstractNumId w:val="11"/>
+  </w:num>
+  <w:num w:numId="9" w16cid:durableId="1881238912">
+    <w:abstractNumId w:val="13"/>
+  </w:num>
+  <w:num w:numId="10" w16cid:durableId="1404839777">
     <w:abstractNumId w:val="4"/>
   </w:num>
-  <w:num w:numId="6" w16cid:durableId="905607304">
+  <w:num w:numId="11" w16cid:durableId="1208909111">
+    <w:abstractNumId w:val="12"/>
+  </w:num>
+  <w:num w:numId="12" w16cid:durableId="381368874">
+    <w:abstractNumId w:val="1"/>
+  </w:num>
+  <w:num w:numId="13" w16cid:durableId="1092168944">
+    <w:abstractNumId w:val="8"/>
+  </w:num>
+  <w:num w:numId="14" w16cid:durableId="154033827">
     <w:abstractNumId w:val="5"/>
   </w:num>
-  <w:num w:numId="7" w16cid:durableId="1386949422">
-    <w:abstractNumId w:val="1"/>
+  <w:num w:numId="15" w16cid:durableId="2118324961">
+    <w:abstractNumId w:val="14"/>
   </w:num>
-  <w:num w:numId="8" w16cid:durableId="1246379243">
-    <w:abstractNumId w:val="6"/>
+  <w:num w:numId="16" w16cid:durableId="356275777">
+    <w:abstractNumId w:val="10"/>
   </w:num>
-  <w:num w:numId="9" w16cid:durableId="1881238912">
-    <w:abstractNumId w:val="7"/>
+  <w:num w:numId="17" w16cid:durableId="1281760173">
+    <w:abstractNumId w:val="16"/>
   </w:num>
 </w:numbering>
 </file>
@@ -3355,6 +5281,7 @@
   <w:style w:type="character" w:default="1" w:styleId="DefaultParagraphFont">
     <w:name w:val="Default Paragraph Font"/>
     <w:uiPriority w:val="1"/>
+    <w:semiHidden/>
     <w:unhideWhenUsed/>
   </w:style>
   <w:style w:type="table" w:default="1" w:styleId="TableNormal">

</xml_diff>